<commit_message>
Update to scientific palette, Qingqi rickshaw graphics, Superior Gold Campus & realistic PKR fares
</commit_message>
<xml_diff>
--- a/RahiScan_Proposal.docx
+++ b/RahiScan_Proposal.docx
@@ -24,7 +24,7 @@
         <w:tc>
           <w:tcPr>
             <w:tcW w:type="dxa" w:w="6480"/>
-            <w:shd w:fill="14325F"/>
+            <w:shd w:fill="1B365D"/>
             <w:tcMar>
               <w:top w:w="100" w:type="dxa"/>
               <w:bottom w:w="100" w:type="dxa"/>
@@ -55,7 +55,7 @@
                 <w:color w:val="FFFFFF"/>
                 <w:sz w:val="26"/>
               </w:rPr>
-              <w:t>Automated Rickshaw Fare &amp; Pace Telemetry</w:t>
+              <w:t>Automated Qingqi Rickshaw Fare &amp; Pace Telemetry</w:t>
               <w:br/>
             </w:r>
             <w:r>
@@ -64,16 +64,16 @@
                 <w:b w:val="0"/>
                 <w:i/>
                 <w:color w:val="D6E6F9"/>
-                <w:sz w:val="22"/>
+                <w:sz w:val="21"/>
               </w:rPr>
-              <w:t>A Data Science Lifecycle Case-Study Proposal</w:t>
+              <w:t>A Data Science Lifecycle Proposal · Superior University Gold Campus</w:t>
             </w:r>
           </w:p>
         </w:tc>
         <w:tc>
           <w:tcPr>
             <w:tcW w:type="dxa" w:w="3456"/>
-            <w:shd w:fill="14325F"/>
+            <w:shd w:fill="1B365D"/>
             <w:tcMar>
               <w:top w:w="100" w:type="dxa"/>
               <w:bottom w:w="100" w:type="dxa"/>
@@ -121,7 +121,7 @@
         <w:keepNext/>
         <w:spacing w:before="160" w:after="80"/>
         <w:pBdr>
-          <w:bottom w:val="single" w:sz="8" w:space="1" w:color="D95F02"/>
+          <w:bottom w:val="single" w:sz="8" w:space="1" w:color="1F7A7A"/>
         </w:pBdr>
       </w:pPr>
       <w:r>
@@ -129,7 +129,7 @@
           <w:rFonts w:ascii="Times New Roman" w:hAnsi="Times New Roman"/>
           <w:b/>
           <w:i w:val="0"/>
-          <w:color w:val="14325F"/>
+          <w:color w:val="1B365D"/>
           <w:sz w:val="32"/>
         </w:rPr>
         <w:t>Group Contributions Form</w:t>
@@ -174,7 +174,7 @@
         <w:tc>
           <w:tcPr>
             <w:tcW w:type="dxa" w:w="1224"/>
-            <w:shd w:fill="14325F"/>
+            <w:shd w:fill="1B365D"/>
             <w:tcMar>
               <w:top w:w="20" w:type="dxa"/>
               <w:bottom w:w="20" w:type="dxa"/>
@@ -203,7 +203,7 @@
         <w:tc>
           <w:tcPr>
             <w:tcW w:type="dxa" w:w="2088"/>
-            <w:shd w:fill="14325F"/>
+            <w:shd w:fill="1B365D"/>
             <w:tcMar>
               <w:top w:w="20" w:type="dxa"/>
               <w:bottom w:w="20" w:type="dxa"/>
@@ -232,7 +232,7 @@
         <w:tc>
           <w:tcPr>
             <w:tcW w:type="dxa" w:w="2088"/>
-            <w:shd w:fill="14325F"/>
+            <w:shd w:fill="1B365D"/>
             <w:tcMar>
               <w:top w:w="20" w:type="dxa"/>
               <w:bottom w:w="20" w:type="dxa"/>
@@ -261,7 +261,7 @@
         <w:tc>
           <w:tcPr>
             <w:tcW w:type="dxa" w:w="4536"/>
-            <w:shd w:fill="14325F"/>
+            <w:shd w:fill="1B365D"/>
             <w:tcMar>
               <w:top w:w="20" w:type="dxa"/>
               <w:bottom w:w="20" w:type="dxa"/>
@@ -292,7 +292,7 @@
         <w:tc>
           <w:tcPr>
             <w:tcW w:type="dxa" w:w="1224"/>
-            <w:shd w:fill="EBF3FC"/>
+            <w:shd w:fill="EBF2F7"/>
             <w:tcMar>
               <w:top w:w="20" w:type="dxa"/>
               <w:bottom w:w="20" w:type="dxa"/>
@@ -311,7 +311,7 @@
                 <w:rFonts w:ascii="Times New Roman" w:hAnsi="Times New Roman"/>
                 <w:b/>
                 <w:i w:val="0"/>
-                <w:color w:val="14325F"/>
+                <w:color w:val="1B365D"/>
                 <w:sz w:val="20"/>
               </w:rPr>
               <w:t>Member 1</w:t>
@@ -440,7 +440,7 @@
         <w:tc>
           <w:tcPr>
             <w:tcW w:type="dxa" w:w="1224"/>
-            <w:shd w:fill="EBF3FC"/>
+            <w:shd w:fill="EBF2F7"/>
             <w:tcMar>
               <w:top w:w="20" w:type="dxa"/>
               <w:bottom w:w="20" w:type="dxa"/>
@@ -459,7 +459,7 @@
                 <w:rFonts w:ascii="Times New Roman" w:hAnsi="Times New Roman"/>
                 <w:b/>
                 <w:i w:val="0"/>
-                <w:color w:val="14325F"/>
+                <w:color w:val="1B365D"/>
                 <w:sz w:val="20"/>
               </w:rPr>
               <w:t>Member 2</w:t>
@@ -543,7 +543,7 @@
                 <w:i w:val="0"/>
                 <w:sz w:val="20"/>
               </w:rPr>
-              <w:t xml:space="preserve">Built the mock Lahore dataset and Python cleaning pipeline, wrote the OCR-face fusion and walking-tail trimming rules, and conducted the exploratory traffic-baseline and fare-ratio analysis. Led the </w:t>
+              <w:t xml:space="preserve">Built the mock Lahore Qingqi dataset and Python cleaning pipeline, wrote the OCR-face fusion and walking-tail trimming rules, and conducted the exploratory traffic-baseline and fare-ratio analysis. Led the </w:t>
             </w:r>
             <w:r>
               <w:rPr>
@@ -588,7 +588,7 @@
         <w:tc>
           <w:tcPr>
             <w:tcW w:type="dxa" w:w="1224"/>
-            <w:shd w:fill="EBF3FC"/>
+            <w:shd w:fill="EBF2F7"/>
             <w:tcMar>
               <w:top w:w="20" w:type="dxa"/>
               <w:bottom w:w="20" w:type="dxa"/>
@@ -607,7 +607,7 @@
                 <w:rFonts w:ascii="Times New Roman" w:hAnsi="Times New Roman"/>
                 <w:b/>
                 <w:i w:val="0"/>
-                <w:color w:val="14325F"/>
+                <w:color w:val="1B365D"/>
                 <w:sz w:val="20"/>
               </w:rPr>
               <w:t>Member 3</w:t>
@@ -743,7 +743,7 @@
           <w:rFonts w:ascii="Times New Roman" w:hAnsi="Times New Roman"/>
           <w:b/>
           <w:i w:val="0"/>
-          <w:color w:val="14325F"/>
+          <w:color w:val="1B365D"/>
           <w:sz w:val="24"/>
         </w:rPr>
         <w:t>Lifecycle Ownership Matrix</w:t>
@@ -777,7 +777,7 @@
         <w:tc>
           <w:tcPr>
             <w:tcW w:type="dxa" w:w="1247"/>
-            <w:shd w:fill="14325F"/>
+            <w:shd w:fill="1B365D"/>
             <w:tcMar>
               <w:top w:w="20" w:type="dxa"/>
               <w:bottom w:w="20" w:type="dxa"/>
@@ -806,7 +806,7 @@
         <w:tc>
           <w:tcPr>
             <w:tcW w:type="dxa" w:w="1247"/>
-            <w:shd w:fill="14325F"/>
+            <w:shd w:fill="1B365D"/>
             <w:tcMar>
               <w:top w:w="20" w:type="dxa"/>
               <w:bottom w:w="20" w:type="dxa"/>
@@ -835,7 +835,7 @@
         <w:tc>
           <w:tcPr>
             <w:tcW w:type="dxa" w:w="1247"/>
-            <w:shd w:fill="14325F"/>
+            <w:shd w:fill="1B365D"/>
             <w:tcMar>
               <w:top w:w="20" w:type="dxa"/>
               <w:bottom w:w="20" w:type="dxa"/>
@@ -864,7 +864,7 @@
         <w:tc>
           <w:tcPr>
             <w:tcW w:type="dxa" w:w="1247"/>
-            <w:shd w:fill="14325F"/>
+            <w:shd w:fill="1B365D"/>
             <w:tcMar>
               <w:top w:w="20" w:type="dxa"/>
               <w:bottom w:w="20" w:type="dxa"/>
@@ -893,7 +893,7 @@
         <w:tc>
           <w:tcPr>
             <w:tcW w:type="dxa" w:w="1247"/>
-            <w:shd w:fill="14325F"/>
+            <w:shd w:fill="1B365D"/>
             <w:tcMar>
               <w:top w:w="20" w:type="dxa"/>
               <w:bottom w:w="20" w:type="dxa"/>
@@ -922,7 +922,7 @@
         <w:tc>
           <w:tcPr>
             <w:tcW w:type="dxa" w:w="1247"/>
-            <w:shd w:fill="14325F"/>
+            <w:shd w:fill="1B365D"/>
             <w:tcMar>
               <w:top w:w="20" w:type="dxa"/>
               <w:bottom w:w="20" w:type="dxa"/>
@@ -951,7 +951,7 @@
         <w:tc>
           <w:tcPr>
             <w:tcW w:type="dxa" w:w="1247"/>
-            <w:shd w:fill="14325F"/>
+            <w:shd w:fill="1B365D"/>
             <w:tcMar>
               <w:top w:w="20" w:type="dxa"/>
               <w:bottom w:w="20" w:type="dxa"/>
@@ -980,7 +980,7 @@
         <w:tc>
           <w:tcPr>
             <w:tcW w:type="dxa" w:w="1247"/>
-            <w:shd w:fill="14325F"/>
+            <w:shd w:fill="1B365D"/>
             <w:tcMar>
               <w:top w:w="20" w:type="dxa"/>
               <w:bottom w:w="20" w:type="dxa"/>
@@ -1029,7 +1029,7 @@
                 <w:rFonts w:ascii="Times New Roman" w:hAnsi="Times New Roman"/>
                 <w:b/>
                 <w:i w:val="0"/>
-                <w:color w:val="14325F"/>
+                <w:color w:val="1B365D"/>
                 <w:sz w:val="19"/>
               </w:rPr>
               <w:t>M. Saad Hussain</w:t>
@@ -1039,7 +1039,7 @@
         <w:tc>
           <w:tcPr>
             <w:tcW w:type="dxa" w:w="1247"/>
-            <w:shd w:fill="228B57"/>
+            <w:shd w:fill="1F7A7A"/>
             <w:tcMar>
               <w:top w:w="20" w:type="dxa"/>
               <w:bottom w:w="20" w:type="dxa"/>
@@ -1068,7 +1068,7 @@
         <w:tc>
           <w:tcPr>
             <w:tcW w:type="dxa" w:w="1247"/>
-            <w:shd w:fill="228B57"/>
+            <w:shd w:fill="1F7A7A"/>
             <w:tcMar>
               <w:top w:w="20" w:type="dxa"/>
               <w:bottom w:w="20" w:type="dxa"/>
@@ -1097,7 +1097,7 @@
         <w:tc>
           <w:tcPr>
             <w:tcW w:type="dxa" w:w="1247"/>
-            <w:shd w:fill="F5F7FA"/>
+            <w:shd w:fill="F8FAFC"/>
             <w:tcMar>
               <w:top w:w="20" w:type="dxa"/>
               <w:bottom w:w="20" w:type="dxa"/>
@@ -1116,7 +1116,7 @@
                 <w:rFonts w:ascii="Times New Roman" w:hAnsi="Times New Roman"/>
                 <w:b w:val="0"/>
                 <w:i w:val="0"/>
-                <w:color w:val="37474F"/>
+                <w:color w:val="334155"/>
                 <w:sz w:val="19"/>
               </w:rPr>
               <w:t>Review</w:t>
@@ -1126,7 +1126,7 @@
         <w:tc>
           <w:tcPr>
             <w:tcW w:type="dxa" w:w="1247"/>
-            <w:shd w:fill="E8F5EE"/>
+            <w:shd w:fill="E6F2F2"/>
             <w:tcMar>
               <w:top w:w="20" w:type="dxa"/>
               <w:bottom w:w="20" w:type="dxa"/>
@@ -1145,7 +1145,7 @@
                 <w:rFonts w:ascii="Times New Roman" w:hAnsi="Times New Roman"/>
                 <w:b w:val="0"/>
                 <w:i w:val="0"/>
-                <w:color w:val="228B57"/>
+                <w:color w:val="1F7A7A"/>
                 <w:sz w:val="19"/>
               </w:rPr>
               <w:t>Support</w:t>
@@ -1155,7 +1155,7 @@
         <w:tc>
           <w:tcPr>
             <w:tcW w:type="dxa" w:w="1247"/>
-            <w:shd w:fill="F5F7FA"/>
+            <w:shd w:fill="F8FAFC"/>
             <w:tcMar>
               <w:top w:w="20" w:type="dxa"/>
               <w:bottom w:w="20" w:type="dxa"/>
@@ -1174,7 +1174,7 @@
                 <w:rFonts w:ascii="Times New Roman" w:hAnsi="Times New Roman"/>
                 <w:b w:val="0"/>
                 <w:i w:val="0"/>
-                <w:color w:val="37474F"/>
+                <w:color w:val="334155"/>
                 <w:sz w:val="19"/>
               </w:rPr>
               <w:t>Review</w:t>
@@ -1184,7 +1184,7 @@
         <w:tc>
           <w:tcPr>
             <w:tcW w:type="dxa" w:w="1247"/>
-            <w:shd w:fill="E8F5EE"/>
+            <w:shd w:fill="E6F2F2"/>
             <w:tcMar>
               <w:top w:w="20" w:type="dxa"/>
               <w:bottom w:w="20" w:type="dxa"/>
@@ -1203,7 +1203,7 @@
                 <w:rFonts w:ascii="Times New Roman" w:hAnsi="Times New Roman"/>
                 <w:b w:val="0"/>
                 <w:i w:val="0"/>
-                <w:color w:val="228B57"/>
+                <w:color w:val="1F7A7A"/>
                 <w:sz w:val="19"/>
               </w:rPr>
               <w:t>Support</w:t>
@@ -1213,7 +1213,7 @@
         <w:tc>
           <w:tcPr>
             <w:tcW w:type="dxa" w:w="1247"/>
-            <w:shd w:fill="228B57"/>
+            <w:shd w:fill="1F7A7A"/>
             <w:tcMar>
               <w:top w:w="20" w:type="dxa"/>
               <w:bottom w:w="20" w:type="dxa"/>
@@ -1262,7 +1262,7 @@
                 <w:rFonts w:ascii="Times New Roman" w:hAnsi="Times New Roman"/>
                 <w:b/>
                 <w:i w:val="0"/>
-                <w:color w:val="14325F"/>
+                <w:color w:val="1B365D"/>
                 <w:sz w:val="19"/>
               </w:rPr>
               <w:t>M. Khubaib</w:t>
@@ -1272,7 +1272,7 @@
         <w:tc>
           <w:tcPr>
             <w:tcW w:type="dxa" w:w="1247"/>
-            <w:shd w:fill="E8F5EE"/>
+            <w:shd w:fill="E6F2F2"/>
             <w:tcMar>
               <w:top w:w="20" w:type="dxa"/>
               <w:bottom w:w="20" w:type="dxa"/>
@@ -1291,7 +1291,7 @@
                 <w:rFonts w:ascii="Times New Roman" w:hAnsi="Times New Roman"/>
                 <w:b w:val="0"/>
                 <w:i w:val="0"/>
-                <w:color w:val="228B57"/>
+                <w:color w:val="1F7A7A"/>
                 <w:sz w:val="19"/>
               </w:rPr>
               <w:t>Support</w:t>
@@ -1301,7 +1301,7 @@
         <w:tc>
           <w:tcPr>
             <w:tcW w:type="dxa" w:w="1247"/>
-            <w:shd w:fill="E8F5EE"/>
+            <w:shd w:fill="E6F2F2"/>
             <w:tcMar>
               <w:top w:w="20" w:type="dxa"/>
               <w:bottom w:w="20" w:type="dxa"/>
@@ -1320,7 +1320,7 @@
                 <w:rFonts w:ascii="Times New Roman" w:hAnsi="Times New Roman"/>
                 <w:b w:val="0"/>
                 <w:i w:val="0"/>
-                <w:color w:val="228B57"/>
+                <w:color w:val="1F7A7A"/>
                 <w:sz w:val="19"/>
               </w:rPr>
               <w:t>Support</w:t>
@@ -1330,7 +1330,7 @@
         <w:tc>
           <w:tcPr>
             <w:tcW w:type="dxa" w:w="1247"/>
-            <w:shd w:fill="228B57"/>
+            <w:shd w:fill="1F7A7A"/>
             <w:tcMar>
               <w:top w:w="20" w:type="dxa"/>
               <w:bottom w:w="20" w:type="dxa"/>
@@ -1359,7 +1359,7 @@
         <w:tc>
           <w:tcPr>
             <w:tcW w:type="dxa" w:w="1247"/>
-            <w:shd w:fill="228B57"/>
+            <w:shd w:fill="1F7A7A"/>
             <w:tcMar>
               <w:top w:w="20" w:type="dxa"/>
               <w:bottom w:w="20" w:type="dxa"/>
@@ -1388,7 +1388,7 @@
         <w:tc>
           <w:tcPr>
             <w:tcW w:type="dxa" w:w="1247"/>
-            <w:shd w:fill="E8F5EE"/>
+            <w:shd w:fill="E6F2F2"/>
             <w:tcMar>
               <w:top w:w="20" w:type="dxa"/>
               <w:bottom w:w="20" w:type="dxa"/>
@@ -1407,7 +1407,7 @@
                 <w:rFonts w:ascii="Times New Roman" w:hAnsi="Times New Roman"/>
                 <w:b w:val="0"/>
                 <w:i w:val="0"/>
-                <w:color w:val="228B57"/>
+                <w:color w:val="1F7A7A"/>
                 <w:sz w:val="19"/>
               </w:rPr>
               <w:t>Support</w:t>
@@ -1417,7 +1417,7 @@
         <w:tc>
           <w:tcPr>
             <w:tcW w:type="dxa" w:w="1247"/>
-            <w:shd w:fill="F5F7FA"/>
+            <w:shd w:fill="F8FAFC"/>
             <w:tcMar>
               <w:top w:w="20" w:type="dxa"/>
               <w:bottom w:w="20" w:type="dxa"/>
@@ -1436,7 +1436,7 @@
                 <w:rFonts w:ascii="Times New Roman" w:hAnsi="Times New Roman"/>
                 <w:b w:val="0"/>
                 <w:i w:val="0"/>
-                <w:color w:val="37474F"/>
+                <w:color w:val="334155"/>
                 <w:sz w:val="19"/>
               </w:rPr>
               <w:t>Review</w:t>
@@ -1446,7 +1446,7 @@
         <w:tc>
           <w:tcPr>
             <w:tcW w:type="dxa" w:w="1247"/>
-            <w:shd w:fill="F5F7FA"/>
+            <w:shd w:fill="F8FAFC"/>
             <w:tcMar>
               <w:top w:w="20" w:type="dxa"/>
               <w:bottom w:w="20" w:type="dxa"/>
@@ -1465,7 +1465,7 @@
                 <w:rFonts w:ascii="Times New Roman" w:hAnsi="Times New Roman"/>
                 <w:b w:val="0"/>
                 <w:i w:val="0"/>
-                <w:color w:val="37474F"/>
+                <w:color w:val="334155"/>
                 <w:sz w:val="19"/>
               </w:rPr>
               <w:t>Review</w:t>
@@ -1495,7 +1495,7 @@
                 <w:rFonts w:ascii="Times New Roman" w:hAnsi="Times New Roman"/>
                 <w:b/>
                 <w:i w:val="0"/>
-                <w:color w:val="14325F"/>
+                <w:color w:val="1B365D"/>
                 <w:sz w:val="19"/>
               </w:rPr>
               <w:t>Huzaifa</w:t>
@@ -1505,7 +1505,7 @@
         <w:tc>
           <w:tcPr>
             <w:tcW w:type="dxa" w:w="1247"/>
-            <w:shd w:fill="F5F7FA"/>
+            <w:shd w:fill="F8FAFC"/>
             <w:tcMar>
               <w:top w:w="20" w:type="dxa"/>
               <w:bottom w:w="20" w:type="dxa"/>
@@ -1524,7 +1524,7 @@
                 <w:rFonts w:ascii="Times New Roman" w:hAnsi="Times New Roman"/>
                 <w:b w:val="0"/>
                 <w:i w:val="0"/>
-                <w:color w:val="37474F"/>
+                <w:color w:val="334155"/>
                 <w:sz w:val="19"/>
               </w:rPr>
               <w:t>Review</w:t>
@@ -1534,7 +1534,7 @@
         <w:tc>
           <w:tcPr>
             <w:tcW w:type="dxa" w:w="1247"/>
-            <w:shd w:fill="F5F7FA"/>
+            <w:shd w:fill="F8FAFC"/>
             <w:tcMar>
               <w:top w:w="20" w:type="dxa"/>
               <w:bottom w:w="20" w:type="dxa"/>
@@ -1553,7 +1553,7 @@
                 <w:rFonts w:ascii="Times New Roman" w:hAnsi="Times New Roman"/>
                 <w:b w:val="0"/>
                 <w:i w:val="0"/>
-                <w:color w:val="37474F"/>
+                <w:color w:val="334155"/>
                 <w:sz w:val="19"/>
               </w:rPr>
               <w:t>Review</w:t>
@@ -1563,7 +1563,7 @@
         <w:tc>
           <w:tcPr>
             <w:tcW w:type="dxa" w:w="1247"/>
-            <w:shd w:fill="E8F5EE"/>
+            <w:shd w:fill="E6F2F2"/>
             <w:tcMar>
               <w:top w:w="20" w:type="dxa"/>
               <w:bottom w:w="20" w:type="dxa"/>
@@ -1582,7 +1582,7 @@
                 <w:rFonts w:ascii="Times New Roman" w:hAnsi="Times New Roman"/>
                 <w:b w:val="0"/>
                 <w:i w:val="0"/>
-                <w:color w:val="228B57"/>
+                <w:color w:val="1F7A7A"/>
                 <w:sz w:val="19"/>
               </w:rPr>
               <w:t>Support</w:t>
@@ -1592,7 +1592,7 @@
         <w:tc>
           <w:tcPr>
             <w:tcW w:type="dxa" w:w="1247"/>
-            <w:shd w:fill="F5F7FA"/>
+            <w:shd w:fill="F8FAFC"/>
             <w:tcMar>
               <w:top w:w="20" w:type="dxa"/>
               <w:bottom w:w="20" w:type="dxa"/>
@@ -1611,7 +1611,7 @@
                 <w:rFonts w:ascii="Times New Roman" w:hAnsi="Times New Roman"/>
                 <w:b w:val="0"/>
                 <w:i w:val="0"/>
-                <w:color w:val="37474F"/>
+                <w:color w:val="334155"/>
                 <w:sz w:val="19"/>
               </w:rPr>
               <w:t>Review</w:t>
@@ -1621,7 +1621,7 @@
         <w:tc>
           <w:tcPr>
             <w:tcW w:type="dxa" w:w="1247"/>
-            <w:shd w:fill="228B57"/>
+            <w:shd w:fill="1F7A7A"/>
             <w:tcMar>
               <w:top w:w="20" w:type="dxa"/>
               <w:bottom w:w="20" w:type="dxa"/>
@@ -1650,7 +1650,7 @@
         <w:tc>
           <w:tcPr>
             <w:tcW w:type="dxa" w:w="1247"/>
-            <w:shd w:fill="228B57"/>
+            <w:shd w:fill="1F7A7A"/>
             <w:tcMar>
               <w:top w:w="20" w:type="dxa"/>
               <w:bottom w:w="20" w:type="dxa"/>
@@ -1679,7 +1679,7 @@
         <w:tc>
           <w:tcPr>
             <w:tcW w:type="dxa" w:w="1247"/>
-            <w:shd w:fill="E8F5EE"/>
+            <w:shd w:fill="E6F2F2"/>
             <w:tcMar>
               <w:top w:w="20" w:type="dxa"/>
               <w:bottom w:w="20" w:type="dxa"/>
@@ -1698,7 +1698,7 @@
                 <w:rFonts w:ascii="Times New Roman" w:hAnsi="Times New Roman"/>
                 <w:b w:val="0"/>
                 <w:i w:val="0"/>
-                <w:color w:val="228B57"/>
+                <w:color w:val="1F7A7A"/>
                 <w:sz w:val="19"/>
               </w:rPr>
               <w:t>Support</w:t>
@@ -1717,7 +1717,7 @@
           <w:rFonts w:ascii="Times New Roman" w:hAnsi="Times New Roman"/>
           <w:b/>
           <w:i w:val="0"/>
-          <w:color w:val="14325F"/>
+          <w:color w:val="1B365D"/>
           <w:sz w:val="24"/>
         </w:rPr>
         <w:t>Deliverables Submitted</w:t>
@@ -1745,7 +1745,7 @@
         <w:tc>
           <w:tcPr>
             <w:tcW w:type="dxa" w:w="3168"/>
-            <w:shd w:fill="F5F7FA"/>
+            <w:shd w:fill="F8FAFC"/>
             <w:tcMar>
               <w:top w:w="20" w:type="dxa"/>
               <w:bottom w:w="20" w:type="dxa"/>
@@ -1802,7 +1802,7 @@
         <w:tc>
           <w:tcPr>
             <w:tcW w:type="dxa" w:w="3168"/>
-            <w:shd w:fill="F5F7FA"/>
+            <w:shd w:fill="F8FAFC"/>
             <w:tcMar>
               <w:top w:w="20" w:type="dxa"/>
               <w:bottom w:w="20" w:type="dxa"/>
@@ -1850,7 +1850,7 @@
                 <w:i w:val="0"/>
                 <w:sz w:val="19"/>
               </w:rPr>
-              <w:t>1,224 ride submissions, 1,200 scans and 364,488 GPS pings from 40 simulated drivers (data/).</w:t>
+              <w:t>1,224 Qingqi ride submissions, 1,200 scans and 411,829 GPS pings from 40 simulated drivers (data/).</w:t>
             </w:r>
           </w:p>
         </w:tc>
@@ -1859,7 +1859,7 @@
         <w:tc>
           <w:tcPr>
             <w:tcW w:type="dxa" w:w="3168"/>
-            <w:shd w:fill="F5F7FA"/>
+            <w:shd w:fill="F8FAFC"/>
             <w:tcMar>
               <w:top w:w="20" w:type="dxa"/>
               <w:bottom w:w="20" w:type="dxa"/>
@@ -1916,7 +1916,7 @@
         <w:tc>
           <w:tcPr>
             <w:tcW w:type="dxa" w:w="3168"/>
-            <w:shd w:fill="F5F7FA"/>
+            <w:shd w:fill="F8FAFC"/>
             <w:tcMar>
               <w:top w:w="20" w:type="dxa"/>
               <w:bottom w:w="20" w:type="dxa"/>
@@ -1980,7 +1980,7 @@
           <w:rFonts w:ascii="Times New Roman" w:hAnsi="Times New Roman"/>
           <w:b w:val="0"/>
           <w:i w:val="0"/>
-          <w:color w:val="37474F"/>
+          <w:color w:val="334155"/>
           <w:sz w:val="20"/>
         </w:rPr>
         <w:br/>
@@ -1992,7 +1992,7 @@
           <w:rFonts w:ascii="Times New Roman" w:hAnsi="Times New Roman"/>
           <w:b w:val="0"/>
           <w:i w:val="0"/>
-          <w:color w:val="37474F"/>
+          <w:color w:val="334155"/>
           <w:sz w:val="20"/>
         </w:rPr>
         <w:t>M. Saad Hussain                                        M. Khubaib                                                Huzaifa</w:t>
@@ -2004,7 +2004,7 @@
         <w:pageBreakBefore/>
         <w:spacing w:before="60" w:after="30"/>
         <w:pBdr>
-          <w:bottom w:val="single" w:sz="8" w:space="1" w:color="D95F02"/>
+          <w:bottom w:val="single" w:sz="8" w:space="1" w:color="1F7A7A"/>
         </w:pBdr>
       </w:pPr>
       <w:r>
@@ -2012,7 +2012,7 @@
           <w:rFonts w:ascii="Times New Roman" w:hAnsi="Times New Roman"/>
           <w:b/>
           <w:i w:val="0"/>
-          <w:color w:val="14325F"/>
+          <w:color w:val="1B365D"/>
           <w:sz w:val="32"/>
         </w:rPr>
         <w:t>1. The Case Study: A Morning on Raiwind Road</w:t>
@@ -2049,7 +2049,7 @@
           </w:tcPr>
           <w:p>
             <w:pPr>
-              <w:spacing w:after="60" w:line="240" w:lineRule="auto"/>
+              <w:spacing w:after="40" w:line="235" w:lineRule="auto"/>
               <w:jc w:val="both"/>
             </w:pPr>
             <w:r>
@@ -2059,9 +2059,99 @@
                 <w:i w:val="0"/>
                 <w:sz w:val="24"/>
               </w:rPr>
-              <w:t>It is 7:40 on a Monday in Johar Town and we have an 8:30 lab on campus. The first auto-rickshaw quotes 600 rupees; we bargain down to 520 and board. The driver then crawls along the left lane, stops for tea at a roadside dhaba “for one minute”, and delivers us twelve minutes late. The next morning a different driver covers the same route for 440 rupees in twenty minutes despite heavier traffic.</w:t>
+              <w:t xml:space="preserve">It is 7:40 on a Monday in Johar Town and we have an 8:30 lab at </w:t>
+            </w:r>
+            <w:r>
+              <w:rPr>
+                <w:rFonts w:ascii="Times New Roman" w:hAnsi="Times New Roman"/>
+                <w:b/>
+                <w:i w:val="0"/>
+                <w:sz w:val="24"/>
+              </w:rPr>
+              <w:t>Superior University Gold Campus</w:t>
+            </w:r>
+            <w:r>
+              <w:rPr>
+                <w:rFonts w:ascii="Times New Roman" w:hAnsi="Times New Roman"/>
+                <w:b w:val="0"/>
+                <w:i w:val="0"/>
+                <w:sz w:val="24"/>
+              </w:rPr>
+              <w:t xml:space="preserve"> on Raiwind Road (9.6 km). The first </w:t>
+            </w:r>
+            <w:r>
+              <w:rPr>
+                <w:rFonts w:ascii="Times New Roman" w:hAnsi="Times New Roman"/>
+                <w:b/>
+                <w:i w:val="0"/>
+                <w:sz w:val="24"/>
+              </w:rPr>
+              <w:t>Qingqi rickshaw</w:t>
+            </w:r>
+            <w:r>
+              <w:rPr>
+                <w:rFonts w:ascii="Times New Roman" w:hAnsi="Times New Roman"/>
+                <w:b w:val="0"/>
+                <w:i w:val="0"/>
+                <w:sz w:val="24"/>
+              </w:rPr>
+              <w:t xml:space="preserve"> quotes 140 rupees; we bargain down to 110 and board. The driver then crawls along the left lane, stops for tea at a roadside dhaba “for one minute”, and delivers us twelve minutes late. The next morning a different Qingqi driver covers the same 9.6 km route to Superior University Gold Campus for the standard </w:t>
+            </w:r>
+            <w:r>
+              <w:rPr>
+                <w:rFonts w:ascii="Times New Roman" w:hAnsi="Times New Roman"/>
+                <w:b/>
+                <w:i w:val="0"/>
+                <w:sz w:val="24"/>
+              </w:rPr>
+              <w:t>80 rupees</w:t>
+            </w:r>
+            <w:r>
+              <w:rPr>
+                <w:rFonts w:ascii="Times New Roman" w:hAnsi="Times New Roman"/>
+                <w:b w:val="0"/>
+                <w:i w:val="0"/>
+                <w:sz w:val="24"/>
+              </w:rPr>
+              <w:t xml:space="preserve"> in twenty minutes despite heavier traffic (similarly, the 16.1 km ride from </w:t>
+            </w:r>
+            <w:r>
+              <w:rPr>
+                <w:rFonts w:ascii="Times New Roman" w:hAnsi="Times New Roman"/>
+                <w:b/>
+                <w:i w:val="0"/>
+                <w:sz w:val="24"/>
+              </w:rPr>
+              <w:t>Raiwind</w:t>
+            </w:r>
+            <w:r>
+              <w:rPr>
+                <w:rFonts w:ascii="Times New Roman" w:hAnsi="Times New Roman"/>
+                <w:b w:val="0"/>
+                <w:i w:val="0"/>
+                <w:sz w:val="24"/>
+              </w:rPr>
+              <w:t xml:space="preserve"> to Gold Campus costs about </w:t>
+            </w:r>
+            <w:r>
+              <w:rPr>
+                <w:rFonts w:ascii="Times New Roman" w:hAnsi="Times New Roman"/>
+                <w:b/>
+                <w:i w:val="0"/>
+                <w:sz w:val="24"/>
+              </w:rPr>
+              <w:t>120 rupees</w:t>
+            </w:r>
+            <w:r>
+              <w:rPr>
+                <w:rFonts w:ascii="Times New Roman" w:hAnsi="Times New Roman"/>
+                <w:b w:val="0"/>
+                <w:i w:val="0"/>
+                <w:sz w:val="24"/>
+              </w:rPr>
+              <w:t>, and inner-city Lahore routes average 40–85 rupees).</w:t>
               <w:br/>
-              <w:t xml:space="preserve">Lahore's rickshaws lack meters, leaving commuters unable to tell at the curb whether a quote is inflated or whether a driver is habitually slow. We propose </w:t>
+              <w:t xml:space="preserve">Lahore's Qingqi motorcycle-rickshaws lack meters, leaving commuters unable to tell at the curb whether a quote is inflated or whether a driver is habitually slow. We propose </w:t>
             </w:r>
             <w:r>
               <w:rPr>
@@ -2079,7 +2169,7 @@
                 <w:i w:val="0"/>
                 <w:sz w:val="24"/>
               </w:rPr>
-              <w:t>, a crowd-sourced mobile app where passengers photograph a rickshaw before boarding (Figure 1), fusing number-plate OCR with driver facial recognition (as vehicles are shared across shifts), enter the quoted fare, and log 5-second GPS pings until arrival.</w:t>
+              <w:t>, a crowd-sourced mobile app where passengers photograph a Qingqi rickshaw before boarding (Figure 1), fusing number-plate OCR with driver facial recognition, enter the quoted fare, and log 5-second GPS pings until arrival.</w:t>
             </w:r>
           </w:p>
         </w:tc>
@@ -2142,7 +2232,7 @@
                 <w:rFonts w:ascii="Times New Roman" w:hAnsi="Times New Roman"/>
                 <w:b/>
                 <w:i w:val="0"/>
-                <w:color w:val="14325F"/>
+                <w:color w:val="1B365D"/>
                 <w:sz w:val="17"/>
               </w:rPr>
               <w:t xml:space="preserve">Figure 1: </w:t>
@@ -2152,10 +2242,10 @@
                 <w:rFonts w:ascii="Times New Roman" w:hAnsi="Times New Roman"/>
                 <w:b w:val="0"/>
                 <w:i w:val="0"/>
-                <w:color w:val="37474F"/>
+                <w:color w:val="334155"/>
                 <w:sz w:val="17"/>
               </w:rPr>
-              <w:t>Curbside AR scan reading the plate (orange) and driver face (blue).</w:t>
+              <w:t>Curbside AR scan of a Pakistani Qingqi rickshaw reading the plate (teal) and driver face (steel-blue).</w:t>
             </w:r>
           </w:p>
         </w:tc>
@@ -2166,7 +2256,7 @@
         <w:keepNext/>
         <w:spacing w:before="60" w:after="30"/>
         <w:pBdr>
-          <w:bottom w:val="single" w:sz="8" w:space="1" w:color="D95F02"/>
+          <w:bottom w:val="single" w:sz="8" w:space="1" w:color="1F7A7A"/>
         </w:pBdr>
       </w:pPr>
       <w:r>
@@ -2174,7 +2264,7 @@
           <w:rFonts w:ascii="Times New Roman" w:hAnsi="Times New Roman"/>
           <w:b/>
           <w:i w:val="0"/>
-          <w:color w:val="14325F"/>
+          <w:color w:val="1B365D"/>
           <w:sz w:val="32"/>
         </w:rPr>
         <w:t>2. Extracting the Data Science Lifecycle from the Story</w:t>
@@ -2188,7 +2278,7 @@
       <w:r>
         <w:drawing>
           <wp:inline xmlns:a="http://schemas.openxmlformats.org/drawingml/2006/main" xmlns:pic="http://schemas.openxmlformats.org/drawingml/2006/picture">
-            <wp:extent cx="6126480" cy="901158"/>
+            <wp:extent cx="6126480" cy="887187"/>
             <wp:docPr id="2" name="Picture 2"/>
             <wp:cNvGraphicFramePr>
               <a:graphicFrameLocks noChangeAspect="1"/>
@@ -2209,7 +2299,7 @@
                   <pic:spPr>
                     <a:xfrm>
                       <a:off x="0" y="0"/>
-                      <a:ext cx="6126480" cy="901158"/>
+                      <a:ext cx="6126480" cy="887187"/>
                     </a:xfrm>
                     <a:prstGeom prst="rect"/>
                   </pic:spPr>
@@ -2230,7 +2320,7 @@
           <w:rFonts w:ascii="Times New Roman" w:hAnsi="Times New Roman"/>
           <w:b/>
           <w:i w:val="0"/>
-          <w:color w:val="14325F"/>
+          <w:color w:val="1B365D"/>
           <w:sz w:val="18"/>
         </w:rPr>
         <w:t xml:space="preserve">Figure 2: </w:t>
@@ -2240,7 +2330,7 @@
           <w:rFonts w:ascii="Times New Roman" w:hAnsi="Times New Roman"/>
           <w:b w:val="0"/>
           <w:i w:val="0"/>
-          <w:color w:val="37474F"/>
+          <w:color w:val="334155"/>
           <w:sz w:val="18"/>
         </w:rPr>
         <w:t>The seven-stage Data Science Lifecycle mapped to RahiScan's guiding questions and planned actions.</w:t>
@@ -2256,7 +2346,7 @@
           <w:rFonts w:ascii="Times New Roman" w:hAnsi="Times New Roman"/>
           <w:b/>
           <w:i w:val="0"/>
-          <w:color w:val="14325F"/>
+          <w:color w:val="1B365D"/>
           <w:sz w:val="18"/>
         </w:rPr>
         <w:t xml:space="preserve">Table 1: </w:t>
@@ -2266,7 +2356,7 @@
           <w:rFonts w:ascii="Times New Roman" w:hAnsi="Times New Roman"/>
           <w:b w:val="0"/>
           <w:i w:val="0"/>
-          <w:color w:val="37474F"/>
+          <w:color w:val="334155"/>
           <w:sz w:val="18"/>
         </w:rPr>
         <w:t>Data science problems extracted directly from the morning commute story.</w:t>
@@ -2295,7 +2385,7 @@
         <w:tc>
           <w:tcPr>
             <w:tcW w:type="dxa" w:w="3326"/>
-            <w:shd w:fill="14325F"/>
+            <w:shd w:fill="1B365D"/>
             <w:tcMar>
               <w:top w:w="20" w:type="dxa"/>
               <w:bottom w:w="20" w:type="dxa"/>
@@ -2324,7 +2414,7 @@
         <w:tc>
           <w:tcPr>
             <w:tcW w:type="dxa" w:w="3326"/>
-            <w:shd w:fill="14325F"/>
+            <w:shd w:fill="1B365D"/>
             <w:tcMar>
               <w:top w:w="20" w:type="dxa"/>
               <w:bottom w:w="20" w:type="dxa"/>
@@ -2353,7 +2443,7 @@
         <w:tc>
           <w:tcPr>
             <w:tcW w:type="dxa" w:w="3326"/>
-            <w:shd w:fill="14325F"/>
+            <w:shd w:fill="1B365D"/>
             <w:tcMar>
               <w:top w:w="20" w:type="dxa"/>
               <w:bottom w:w="20" w:type="dxa"/>
@@ -2384,7 +2474,7 @@
         <w:tc>
           <w:tcPr>
             <w:tcW w:type="dxa" w:w="1152"/>
-            <w:shd w:fill="EBF3FC"/>
+            <w:shd w:fill="EBF2F7"/>
             <w:tcMar>
               <w:top w:w="20" w:type="dxa"/>
               <w:bottom w:w="20" w:type="dxa"/>
@@ -2403,7 +2493,7 @@
                 <w:rFonts w:ascii="Times New Roman" w:hAnsi="Times New Roman"/>
                 <w:b/>
                 <w:i w:val="0"/>
-                <w:color w:val="14325F"/>
+                <w:color w:val="1B365D"/>
                 <w:sz w:val="17"/>
               </w:rPr>
               <w:t>Define</w:t>
@@ -2469,7 +2559,7 @@
         <w:tc>
           <w:tcPr>
             <w:tcW w:type="dxa" w:w="1152"/>
-            <w:shd w:fill="EBF3FC"/>
+            <w:shd w:fill="EBF2F7"/>
             <w:tcMar>
               <w:top w:w="20" w:type="dxa"/>
               <w:bottom w:w="20" w:type="dxa"/>
@@ -2488,7 +2578,7 @@
                 <w:rFonts w:ascii="Times New Roman" w:hAnsi="Times New Roman"/>
                 <w:b/>
                 <w:i w:val="0"/>
-                <w:color w:val="14325F"/>
+                <w:color w:val="1B365D"/>
                 <w:sz w:val="17"/>
               </w:rPr>
               <w:t>Collect</w:t>
@@ -2545,7 +2635,7 @@
                 <w:i w:val="0"/>
                 <w:sz w:val="17"/>
               </w:rPr>
-              <w:t>Capture plate+face scans, quoted fares, 5-s GPS/accelerometer traces, and ride-hailing fare benchmarks.</w:t>
+              <w:t>Capture Qingqi plate+face scans, quoted fares, 5-s GPS/accelerometer traces, and corridor fare benchmarks.</w:t>
             </w:r>
           </w:p>
         </w:tc>
@@ -2554,7 +2644,7 @@
         <w:tc>
           <w:tcPr>
             <w:tcW w:type="dxa" w:w="1152"/>
-            <w:shd w:fill="EBF3FC"/>
+            <w:shd w:fill="EBF2F7"/>
             <w:tcMar>
               <w:top w:w="20" w:type="dxa"/>
               <w:bottom w:w="20" w:type="dxa"/>
@@ -2573,7 +2663,7 @@
                 <w:rFonts w:ascii="Times New Roman" w:hAnsi="Times New Roman"/>
                 <w:b/>
                 <w:i w:val="0"/>
-                <w:color w:val="14325F"/>
+                <w:color w:val="1B365D"/>
                 <w:sz w:val="17"/>
               </w:rPr>
               <w:t>Clean</w:t>
@@ -2639,7 +2729,7 @@
         <w:tc>
           <w:tcPr>
             <w:tcW w:type="dxa" w:w="1152"/>
-            <w:shd w:fill="EBF3FC"/>
+            <w:shd w:fill="EBF2F7"/>
             <w:tcMar>
               <w:top w:w="20" w:type="dxa"/>
               <w:bottom w:w="20" w:type="dxa"/>
@@ -2658,7 +2748,7 @@
                 <w:rFonts w:ascii="Times New Roman" w:hAnsi="Times New Roman"/>
                 <w:b/>
                 <w:i w:val="0"/>
-                <w:color w:val="14325F"/>
+                <w:color w:val="1B365D"/>
                 <w:sz w:val="17"/>
               </w:rPr>
               <w:t>Explore</w:t>
@@ -2724,7 +2814,7 @@
         <w:tc>
           <w:tcPr>
             <w:tcW w:type="dxa" w:w="1152"/>
-            <w:shd w:fill="EBF3FC"/>
+            <w:shd w:fill="EBF2F7"/>
             <w:tcMar>
               <w:top w:w="20" w:type="dxa"/>
               <w:bottom w:w="20" w:type="dxa"/>
@@ -2743,7 +2833,7 @@
                 <w:rFonts w:ascii="Times New Roman" w:hAnsi="Times New Roman"/>
                 <w:b/>
                 <w:i w:val="0"/>
-                <w:color w:val="14325F"/>
+                <w:color w:val="1B365D"/>
                 <w:sz w:val="17"/>
               </w:rPr>
               <w:t>Model</w:t>
@@ -2800,7 +2890,7 @@
                 <w:i w:val="0"/>
                 <w:sz w:val="17"/>
               </w:rPr>
-              <w:t>Resolve shared-rickshaw drivers via biometric fusion and predict fair fares and pace classes with gradient boosting.</w:t>
+              <w:t>Resolve shared-Qingqi drivers via biometric fusion and predict fair fares and pace classes with gradient boosting.</w:t>
             </w:r>
           </w:p>
         </w:tc>
@@ -2809,7 +2899,7 @@
         <w:tc>
           <w:tcPr>
             <w:tcW w:type="dxa" w:w="1152"/>
-            <w:shd w:fill="EBF3FC"/>
+            <w:shd w:fill="EBF2F7"/>
             <w:tcMar>
               <w:top w:w="20" w:type="dxa"/>
               <w:bottom w:w="20" w:type="dxa"/>
@@ -2828,7 +2918,7 @@
                 <w:rFonts w:ascii="Times New Roman" w:hAnsi="Times New Roman"/>
                 <w:b/>
                 <w:i w:val="0"/>
-                <w:color w:val="14325F"/>
+                <w:color w:val="1B365D"/>
                 <w:sz w:val="17"/>
               </w:rPr>
               <w:t>Evaluate</w:t>
@@ -2894,7 +2984,7 @@
         <w:tc>
           <w:tcPr>
             <w:tcW w:type="dxa" w:w="1152"/>
-            <w:shd w:fill="EBF3FC"/>
+            <w:shd w:fill="EBF2F7"/>
             <w:tcMar>
               <w:top w:w="20" w:type="dxa"/>
               <w:bottom w:w="20" w:type="dxa"/>
@@ -2913,7 +3003,7 @@
                 <w:rFonts w:ascii="Times New Roman" w:hAnsi="Times New Roman"/>
                 <w:b/>
                 <w:i w:val="0"/>
-                <w:color w:val="14325F"/>
+                <w:color w:val="1B365D"/>
                 <w:sz w:val="17"/>
               </w:rPr>
               <w:t>Deploy</w:t>
@@ -2984,7 +3074,7 @@
       <w:r>
         <w:drawing>
           <wp:inline xmlns:a="http://schemas.openxmlformats.org/drawingml/2006/main" xmlns:pic="http://schemas.openxmlformats.org/drawingml/2006/picture">
-            <wp:extent cx="5669280" cy="964760"/>
+            <wp:extent cx="5669280" cy="954235"/>
             <wp:docPr id="3" name="Picture 3"/>
             <wp:cNvGraphicFramePr>
               <a:graphicFrameLocks noChangeAspect="1"/>
@@ -3005,7 +3095,7 @@
                   <pic:spPr>
                     <a:xfrm>
                       <a:off x="0" y="0"/>
-                      <a:ext cx="5669280" cy="964760"/>
+                      <a:ext cx="5669280" cy="954235"/>
                     </a:xfrm>
                     <a:prstGeom prst="rect"/>
                   </pic:spPr>
@@ -3026,7 +3116,7 @@
           <w:rFonts w:ascii="Times New Roman" w:hAnsi="Times New Roman"/>
           <w:b/>
           <w:i w:val="0"/>
-          <w:color w:val="14325F"/>
+          <w:color w:val="1B365D"/>
           <w:sz w:val="18"/>
         </w:rPr>
         <w:t xml:space="preserve">Figure 3: </w:t>
@@ -3036,10 +3126,10 @@
           <w:rFonts w:ascii="Times New Roman" w:hAnsi="Times New Roman"/>
           <w:b w:val="0"/>
           <w:i w:val="0"/>
-          <w:color w:val="37474F"/>
+          <w:color w:val="334155"/>
           <w:sz w:val="18"/>
         </w:rPr>
-        <w:t>End-to-end RahiScan architecture illustrated with simulated driver D27 from our pilot dataset.</w:t>
+        <w:t>End-to-end RahiScan architecture illustrated with simulated Qingqi driver D27 on the 9.6 km Superior Gold Campus route.</w:t>
       </w:r>
     </w:p>
     <w:p>
@@ -3048,7 +3138,7 @@
         <w:pageBreakBefore/>
         <w:spacing w:before="60" w:after="30"/>
         <w:pBdr>
-          <w:bottom w:val="single" w:sz="8" w:space="1" w:color="D95F02"/>
+          <w:bottom w:val="single" w:sz="8" w:space="1" w:color="1F7A7A"/>
         </w:pBdr>
       </w:pPr>
       <w:r>
@@ -3056,7 +3146,7 @@
           <w:rFonts w:ascii="Times New Roman" w:hAnsi="Times New Roman"/>
           <w:b/>
           <w:i w:val="0"/>
-          <w:color w:val="14325F"/>
+          <w:color w:val="1B365D"/>
           <w:sz w:val="32"/>
         </w:rPr>
         <w:t>3. Define: Turning Frustration into Measurable Targets</w:t>
@@ -3084,7 +3174,7 @@
         <w:tc>
           <w:tcPr>
             <w:tcW w:type="dxa" w:w="4608"/>
-            <w:shd w:fill="EBF3FC"/>
+            <w:shd w:fill="EBF2F7"/>
             <w:tcMar>
               <w:top w:w="30" w:type="dxa"/>
               <w:bottom w:w="30" w:type="dxa"/>
@@ -3101,7 +3191,7 @@
                 <w:rFonts w:ascii="Times New Roman" w:hAnsi="Times New Roman"/>
                 <w:b/>
                 <w:i w:val="0"/>
-                <w:color w:val="14325F"/>
+                <w:color w:val="1B365D"/>
                 <w:sz w:val="28"/>
               </w:rPr>
               <w:t>Stage 1 · DEFINE</w:t>
@@ -3111,7 +3201,7 @@
         <w:tc>
           <w:tcPr>
             <w:tcW w:type="dxa" w:w="5472"/>
-            <w:shd w:fill="EBF3FC"/>
+            <w:shd w:fill="EBF2F7"/>
             <w:tcMar>
               <w:top w:w="30" w:type="dxa"/>
               <w:bottom w:w="30" w:type="dxa"/>
@@ -3129,7 +3219,7 @@
                 <w:rFonts w:ascii="Times New Roman" w:hAnsi="Times New Roman"/>
                 <w:b w:val="0"/>
                 <w:i/>
-                <w:color w:val="37474F"/>
+                <w:color w:val="334155"/>
                 <w:sz w:val="24"/>
               </w:rPr>
               <w:t>What problem should be solved?</w:t>
@@ -3150,7 +3240,7 @@
           <w:i w:val="0"/>
           <w:sz w:val="24"/>
         </w:rPr>
-        <w:t>To replace subjective complaints with testable metrics, we define two dimensionless ratios for every ride i, where 1.0 represents typical behaviour on that corridor and hour, and fix badge thresholds prior to data collection (Table 2):</w:t>
+        <w:t>To replace subjective complaints with testable metrics, we define two dimensionless ratios for every Qingqi ride i, where 1.0 represents typical behaviour on that corridor and hour, and fix badge thresholds prior to data collection (Table 2):</w:t>
       </w:r>
     </w:p>
     <w:tbl>
@@ -3159,12 +3249,12 @@
         <w:jc w:val="center"/>
         <w:tblLook w:firstColumn="1" w:firstRow="1" w:lastColumn="0" w:lastRow="0" w:noHBand="0" w:noVBand="1" w:val="04A0"/>
         <w:tblBorders>
-          <w:top w:val="single" w:sz="6" w:space="0" w:color="14325F"/>
-          <w:bottom w:val="single" w:sz="6" w:space="0" w:color="14325F"/>
-          <w:left w:val="single" w:sz="6" w:space="0" w:color="14325F"/>
-          <w:right w:val="single" w:sz="6" w:space="0" w:color="14325F"/>
-          <w:insideH w:val="single" w:sz="6" w:space="0" w:color="14325F"/>
-          <w:insideV w:val="single" w:sz="6" w:space="0" w:color="14325F"/>
+          <w:top w:val="single" w:sz="6" w:space="0" w:color="1B365D"/>
+          <w:bottom w:val="single" w:sz="6" w:space="0" w:color="1B365D"/>
+          <w:left w:val="single" w:sz="6" w:space="0" w:color="1B365D"/>
+          <w:right w:val="single" w:sz="6" w:space="0" w:color="1B365D"/>
+          <w:insideH w:val="single" w:sz="6" w:space="0" w:color="1B365D"/>
+          <w:insideV w:val="single" w:sz="6" w:space="0" w:color="1B365D"/>
         </w:tblBorders>
       </w:tblPr>
       <w:tblGrid>
@@ -3175,7 +3265,7 @@
         <w:tc>
           <w:tcPr>
             <w:tcW w:type="dxa" w:w="4989"/>
-            <w:shd w:fill="F5F7FA"/>
+            <w:shd w:fill="F8FAFC"/>
             <w:tcMar>
               <w:top w:w="14" w:type="dxa"/>
               <w:bottom w:w="14" w:type="dxa"/>
@@ -3194,7 +3284,7 @@
                 <w:rFonts w:ascii="Times New Roman" w:hAnsi="Times New Roman"/>
                 <w:b/>
                 <w:i w:val="0"/>
-                <w:color w:val="14325F"/>
+                <w:color w:val="1B365D"/>
                 <w:sz w:val="20"/>
               </w:rPr>
               <w:t>Driving Pace Index (Π_i)</w:t>
@@ -3205,7 +3295,7 @@
                 <w:rFonts w:ascii="Times New Roman" w:hAnsi="Times New Roman"/>
                 <w:b/>
                 <w:i w:val="0"/>
-                <w:color w:val="37474F"/>
+                <w:color w:val="334155"/>
                 <w:sz w:val="18"/>
               </w:rPr>
               <w:t>Π_i = v_obs,i / v_base,i = (d_i / t_i) / median(v_obs on corridor, hour)</w:t>
@@ -3216,17 +3306,17 @@
                 <w:rFonts w:ascii="Times New Roman" w:hAnsi="Times New Roman"/>
                 <w:b w:val="0"/>
                 <w:i w:val="0"/>
-                <w:color w:val="37474F"/>
+                <w:color w:val="334155"/>
                 <w:sz w:val="17"/>
               </w:rPr>
-              <w:t>Π = 0.60 means moving 40% slower than peer rickshaws on the same road and hour.</w:t>
+              <w:t>Π = 0.60 means moving 40% slower than peer Qingqi rickshaws on the same road and hour.</w:t>
             </w:r>
           </w:p>
         </w:tc>
         <w:tc>
           <w:tcPr>
             <w:tcW w:type="dxa" w:w="4989"/>
-            <w:shd w:fill="F5F7FA"/>
+            <w:shd w:fill="F8FAFC"/>
             <w:tcMar>
               <w:top w:w="14" w:type="dxa"/>
               <w:bottom w:w="14" w:type="dxa"/>
@@ -3245,7 +3335,7 @@
                 <w:rFonts w:ascii="Times New Roman" w:hAnsi="Times New Roman"/>
                 <w:b/>
                 <w:i w:val="0"/>
-                <w:color w:val="D95F02"/>
+                <w:color w:val="1F7A7A"/>
                 <w:sz w:val="20"/>
               </w:rPr>
               <w:t>Fare Fairness Ratio (Φ_i)</w:t>
@@ -3256,7 +3346,7 @@
                 <w:rFonts w:ascii="Times New Roman" w:hAnsi="Times New Roman"/>
                 <w:b/>
                 <w:i w:val="0"/>
-                <w:color w:val="37474F"/>
+                <w:color w:val="334155"/>
                 <w:sz w:val="18"/>
               </w:rPr>
               <w:t>Φ_i = Fare_quoted,i / Fare_fair,i</w:t>
@@ -3267,10 +3357,10 @@
                 <w:rFonts w:ascii="Times New Roman" w:hAnsi="Times New Roman"/>
                 <w:b w:val="0"/>
                 <w:i w:val="0"/>
-                <w:color w:val="37474F"/>
+                <w:color w:val="334155"/>
                 <w:sz w:val="17"/>
               </w:rPr>
-              <w:t>Fare_fair is predicted from distance, corridor, and congestion using ride-hailing benchmarks.</w:t>
+              <w:t>Fare_fair is predicted from distance, corridor, and congestion (≈ 80 PKR for 9.6 km; ≈ 120 PKR Raiwind to Gold Campus).</w:t>
             </w:r>
           </w:p>
         </w:tc>
@@ -3286,7 +3376,7 @@
           <w:rFonts w:ascii="Times New Roman" w:hAnsi="Times New Roman"/>
           <w:b/>
           <w:i w:val="0"/>
-          <w:color w:val="14325F"/>
+          <w:color w:val="1B365D"/>
           <w:sz w:val="18"/>
         </w:rPr>
         <w:t xml:space="preserve">Table 2: </w:t>
@@ -3296,7 +3386,7 @@
           <w:rFonts w:ascii="Times New Roman" w:hAnsi="Times New Roman"/>
           <w:b w:val="0"/>
           <w:i w:val="0"/>
-          <w:color w:val="37474F"/>
+          <w:color w:val="334155"/>
           <w:sz w:val="18"/>
         </w:rPr>
         <w:t>Pre-registered decision rules for driver badges (applied to a driver's median across ≥ 5 verified rides).</w:t>
@@ -3325,7 +3415,7 @@
         <w:tc>
           <w:tcPr>
             <w:tcW w:type="dxa" w:w="3326"/>
-            <w:shd w:fill="14325F"/>
+            <w:shd w:fill="1B365D"/>
             <w:tcMar>
               <w:top w:w="14" w:type="dxa"/>
               <w:bottom w:w="14" w:type="dxa"/>
@@ -3354,7 +3444,7 @@
         <w:tc>
           <w:tcPr>
             <w:tcW w:type="dxa" w:w="3326"/>
-            <w:shd w:fill="14325F"/>
+            <w:shd w:fill="1B365D"/>
             <w:tcMar>
               <w:top w:w="14" w:type="dxa"/>
               <w:bottom w:w="14" w:type="dxa"/>
@@ -3383,7 +3473,7 @@
         <w:tc>
           <w:tcPr>
             <w:tcW w:type="dxa" w:w="3326"/>
-            <w:shd w:fill="14325F"/>
+            <w:shd w:fill="1B365D"/>
             <w:tcMar>
               <w:top w:w="14" w:type="dxa"/>
               <w:bottom w:w="14" w:type="dxa"/>
@@ -3414,7 +3504,7 @@
         <w:tc>
           <w:tcPr>
             <w:tcW w:type="dxa" w:w="3326"/>
-            <w:shd w:fill="FBE9E9"/>
+            <w:shd w:fill="F9EBEB"/>
             <w:tcMar>
               <w:top w:w="14" w:type="dxa"/>
               <w:bottom w:w="14" w:type="dxa"/>
@@ -3433,7 +3523,7 @@
                 <w:rFonts w:ascii="Times New Roman" w:hAnsi="Times New Roman"/>
                 <w:b/>
                 <w:i w:val="0"/>
-                <w:color w:val="C62828"/>
+                <w:color w:val="A82020"/>
                 <w:sz w:val="17"/>
               </w:rPr>
               <w:t>Habitually Slow</w:t>
@@ -3499,7 +3589,7 @@
         <w:tc>
           <w:tcPr>
             <w:tcW w:type="dxa" w:w="3326"/>
-            <w:shd w:fill="E8F5EE"/>
+            <w:shd w:fill="E6F2F2"/>
             <w:tcMar>
               <w:top w:w="14" w:type="dxa"/>
               <w:bottom w:w="14" w:type="dxa"/>
@@ -3518,7 +3608,7 @@
                 <w:rFonts w:ascii="Times New Roman" w:hAnsi="Times New Roman"/>
                 <w:b/>
                 <w:i w:val="0"/>
-                <w:color w:val="228B57"/>
+                <w:color w:val="1F7A7A"/>
                 <w:sz w:val="17"/>
               </w:rPr>
               <w:t>Normal / Fast Pace</w:t>
@@ -3584,7 +3674,7 @@
         <w:tc>
           <w:tcPr>
             <w:tcW w:type="dxa" w:w="3326"/>
-            <w:shd w:fill="FEF2E8"/>
+            <w:shd w:fill="E6F2F2"/>
             <w:tcMar>
               <w:top w:w="14" w:type="dxa"/>
               <w:bottom w:w="14" w:type="dxa"/>
@@ -3603,7 +3693,7 @@
                 <w:rFonts w:ascii="Times New Roman" w:hAnsi="Times New Roman"/>
                 <w:b/>
                 <w:i w:val="0"/>
-                <w:color w:val="D95F02"/>
+                <w:color w:val="1F7A7A"/>
                 <w:sz w:val="17"/>
               </w:rPr>
               <w:t>Overpriced</w:t>
@@ -3660,7 +3750,7 @@
                 <w:i w:val="0"/>
                 <w:sz w:val="17"/>
               </w:rPr>
-              <w:t>Quotes more than 25% above fair benchmark; passenger should negotiate or skip.</w:t>
+              <w:t>Quotes more than 25% above fair benchmark (e.g. &gt; 100 PKR on an 80 PKR route); negotiate or skip.</w:t>
             </w:r>
           </w:p>
         </w:tc>
@@ -3671,7 +3761,7 @@
         <w:keepNext/>
         <w:spacing w:before="60" w:after="30"/>
         <w:pBdr>
-          <w:bottom w:val="single" w:sz="8" w:space="1" w:color="D95F02"/>
+          <w:bottom w:val="single" w:sz="8" w:space="1" w:color="1F7A7A"/>
         </w:pBdr>
       </w:pPr>
       <w:r>
@@ -3679,7 +3769,7 @@
           <w:rFonts w:ascii="Times New Roman" w:hAnsi="Times New Roman"/>
           <w:b/>
           <w:i w:val="0"/>
-          <w:color w:val="14325F"/>
+          <w:color w:val="1B365D"/>
           <w:sz w:val="32"/>
         </w:rPr>
         <w:t>4. Collect: The Evidence We Need</w:t>
@@ -3707,7 +3797,7 @@
         <w:tc>
           <w:tcPr>
             <w:tcW w:type="dxa" w:w="4608"/>
-            <w:shd w:fill="EBF3FC"/>
+            <w:shd w:fill="EBF2F7"/>
             <w:tcMar>
               <w:top w:w="30" w:type="dxa"/>
               <w:bottom w:w="30" w:type="dxa"/>
@@ -3724,7 +3814,7 @@
                 <w:rFonts w:ascii="Times New Roman" w:hAnsi="Times New Roman"/>
                 <w:b/>
                 <w:i w:val="0"/>
-                <w:color w:val="1B75BC"/>
+                <w:color w:val="2B6CB0"/>
                 <w:sz w:val="28"/>
               </w:rPr>
               <w:t>Stage 2 · COLLECT</w:t>
@@ -3734,7 +3824,7 @@
         <w:tc>
           <w:tcPr>
             <w:tcW w:type="dxa" w:w="5472"/>
-            <w:shd w:fill="EBF3FC"/>
+            <w:shd w:fill="EBF2F7"/>
             <w:tcMar>
               <w:top w:w="30" w:type="dxa"/>
               <w:bottom w:w="30" w:type="dxa"/>
@@ -3752,7 +3842,7 @@
                 <w:rFonts w:ascii="Times New Roman" w:hAnsi="Times New Roman"/>
                 <w:b w:val="0"/>
                 <w:i/>
-                <w:color w:val="37474F"/>
+                <w:color w:val="334155"/>
                 <w:sz w:val="24"/>
               </w:rPr>
               <w:t>What evidence is needed?</w:t>
@@ -3773,7 +3863,25 @@
           <w:i w:val="0"/>
           <w:sz w:val="24"/>
         </w:rPr>
-        <w:t>Since no public dataset links Lahore rickshaw drivers to speed and pricing, we designed a four-week pilot with 85 student volunteers across eight campus corridors. To validate our pipeline beforehand, we generated a synthetic pilot dataset (SEED = 2026) spanning 40 drivers across 34 rickshaws (six shift-shared), 1,200 scans, 1,224 trip logs, and 364,488 5-second GPS pings (Table 3, Figure 4). For privacy, only 128-D face embeddings are stored and raw photos are discarded immediately.</w:t>
+        <w:t xml:space="preserve">Since no public dataset links Lahore Qingqi rickshaw drivers to speed and pricing, we designed a four-week pilot with 85 student volunteers commuting to </w:t>
+      </w:r>
+      <w:r>
+        <w:rPr>
+          <w:rFonts w:ascii="Times New Roman" w:hAnsi="Times New Roman"/>
+          <w:b/>
+          <w:i w:val="0"/>
+          <w:sz w:val="24"/>
+        </w:rPr>
+        <w:t>Superior University Gold Campus</w:t>
+      </w:r>
+      <w:r>
+        <w:rPr>
+          <w:rFonts w:ascii="Times New Roman" w:hAnsi="Times New Roman"/>
+          <w:b w:val="0"/>
+          <w:i w:val="0"/>
+          <w:sz w:val="24"/>
+        </w:rPr>
+        <w:t xml:space="preserve"> (from Raiwind, Johar Town, Thokar Niaz Baig, and Township) and across inner-city Lahore corridors. To validate our pipeline beforehand, we generated a synthetic pilot dataset (SEED = 2026) spanning 40 drivers across 34 Qingqi rickshaws (six shift-shared), 1,200 scans, 1,224 trip logs, and 411,829 5-second GPS pings (Table 3, Figure 4). For privacy, only 128-D face embeddings are stored and raw photos are discarded immediately.</w:t>
       </w:r>
     </w:p>
     <w:p>
@@ -3786,7 +3894,7 @@
           <w:rFonts w:ascii="Times New Roman" w:hAnsi="Times New Roman"/>
           <w:b/>
           <w:i w:val="0"/>
-          <w:color w:val="14325F"/>
+          <w:color w:val="1B365D"/>
           <w:sz w:val="18"/>
         </w:rPr>
         <w:t xml:space="preserve">Table 3: </w:t>
@@ -3796,7 +3904,7 @@
           <w:rFonts w:ascii="Times New Roman" w:hAnsi="Times New Roman"/>
           <w:b w:val="0"/>
           <w:i w:val="0"/>
-          <w:color w:val="37474F"/>
+          <w:color w:val="334155"/>
           <w:sz w:val="18"/>
         </w:rPr>
         <w:t>Planned data streams and volume produced by our four-week simulated Lahore pilot (data/raw/).</w:t>
@@ -3826,7 +3934,7 @@
         <w:tc>
           <w:tcPr>
             <w:tcW w:type="dxa" w:w="2494"/>
-            <w:shd w:fill="14325F"/>
+            <w:shd w:fill="1B365D"/>
             <w:tcMar>
               <w:top w:w="14" w:type="dxa"/>
               <w:bottom w:w="14" w:type="dxa"/>
@@ -3855,7 +3963,7 @@
         <w:tc>
           <w:tcPr>
             <w:tcW w:type="dxa" w:w="2494"/>
-            <w:shd w:fill="14325F"/>
+            <w:shd w:fill="1B365D"/>
             <w:tcMar>
               <w:top w:w="14" w:type="dxa"/>
               <w:bottom w:w="14" w:type="dxa"/>
@@ -3884,7 +3992,7 @@
         <w:tc>
           <w:tcPr>
             <w:tcW w:type="dxa" w:w="2494"/>
-            <w:shd w:fill="14325F"/>
+            <w:shd w:fill="1B365D"/>
             <w:tcMar>
               <w:top w:w="14" w:type="dxa"/>
               <w:bottom w:w="14" w:type="dxa"/>
@@ -3913,7 +4021,7 @@
         <w:tc>
           <w:tcPr>
             <w:tcW w:type="dxa" w:w="2494"/>
-            <w:shd w:fill="14325F"/>
+            <w:shd w:fill="1B365D"/>
             <w:tcMar>
               <w:top w:w="14" w:type="dxa"/>
               <w:bottom w:w="14" w:type="dxa"/>
@@ -3944,7 +4052,7 @@
         <w:tc>
           <w:tcPr>
             <w:tcW w:type="dxa" w:w="2494"/>
-            <w:shd w:fill="EBF3FC"/>
+            <w:shd w:fill="EBF2F7"/>
             <w:tcMar>
               <w:top w:w="14" w:type="dxa"/>
               <w:bottom w:w="14" w:type="dxa"/>
@@ -3963,7 +4071,7 @@
                 <w:rFonts w:ascii="Times New Roman" w:hAnsi="Times New Roman"/>
                 <w:b/>
                 <w:i w:val="0"/>
-                <w:color w:val="14325F"/>
+                <w:color w:val="1B365D"/>
                 <w:sz w:val="17"/>
               </w:rPr>
               <w:t>Curb scan</w:t>
@@ -4056,7 +4164,7 @@
         <w:tc>
           <w:tcPr>
             <w:tcW w:type="dxa" w:w="2494"/>
-            <w:shd w:fill="EBF3FC"/>
+            <w:shd w:fill="EBF2F7"/>
             <w:tcMar>
               <w:top w:w="14" w:type="dxa"/>
               <w:bottom w:w="14" w:type="dxa"/>
@@ -4075,7 +4183,7 @@
                 <w:rFonts w:ascii="Times New Roman" w:hAnsi="Times New Roman"/>
                 <w:b/>
                 <w:i w:val="0"/>
-                <w:color w:val="14325F"/>
+                <w:color w:val="1B365D"/>
                 <w:sz w:val="17"/>
               </w:rPr>
               <w:t>Ride record</w:t>
@@ -4168,7 +4276,7 @@
         <w:tc>
           <w:tcPr>
             <w:tcW w:type="dxa" w:w="2494"/>
-            <w:shd w:fill="EBF3FC"/>
+            <w:shd w:fill="EBF2F7"/>
             <w:tcMar>
               <w:top w:w="14" w:type="dxa"/>
               <w:bottom w:w="14" w:type="dxa"/>
@@ -4187,7 +4295,7 @@
                 <w:rFonts w:ascii="Times New Roman" w:hAnsi="Times New Roman"/>
                 <w:b/>
                 <w:i w:val="0"/>
-                <w:color w:val="14325F"/>
+                <w:color w:val="1B365D"/>
                 <w:sz w:val="17"/>
               </w:rPr>
               <w:t>GPS pings</w:t>
@@ -4271,7 +4379,7 @@
                 <w:i w:val="0"/>
                 <w:sz w:val="17"/>
               </w:rPr>
-              <w:t>364,488</w:t>
+              <w:t>411,829</w:t>
             </w:r>
           </w:p>
         </w:tc>
@@ -4280,7 +4388,7 @@
         <w:tc>
           <w:tcPr>
             <w:tcW w:type="dxa" w:w="2494"/>
-            <w:shd w:fill="EBF3FC"/>
+            <w:shd w:fill="EBF2F7"/>
             <w:tcMar>
               <w:top w:w="14" w:type="dxa"/>
               <w:bottom w:w="14" w:type="dxa"/>
@@ -4299,7 +4407,7 @@
                 <w:rFonts w:ascii="Times New Roman" w:hAnsi="Times New Roman"/>
                 <w:b/>
                 <w:i w:val="0"/>
-                <w:color w:val="14325F"/>
+                <w:color w:val="1B365D"/>
                 <w:sz w:val="17"/>
               </w:rPr>
               <w:t>Fare benchmark</w:t>
@@ -4329,7 +4437,7 @@
                 <w:i w:val="0"/>
                 <w:sz w:val="17"/>
               </w:rPr>
-              <w:t>Contemporaneous inDrive/Careem/Bykea rickshaw quote (PKR)</w:t>
+              <w:t>Reference Qingqi corridor fare (PKR; ≈ 80 PKR for 9.6 km)</w:t>
             </w:r>
           </w:p>
         </w:tc>
@@ -4392,7 +4500,7 @@
         <w:tc>
           <w:tcPr>
             <w:tcW w:type="dxa" w:w="2494"/>
-            <w:shd w:fill="EBF3FC"/>
+            <w:shd w:fill="EBF2F7"/>
             <w:tcMar>
               <w:top w:w="14" w:type="dxa"/>
               <w:bottom w:w="14" w:type="dxa"/>
@@ -4411,7 +4519,7 @@
                 <w:rFonts w:ascii="Times New Roman" w:hAnsi="Times New Roman"/>
                 <w:b/>
                 <w:i w:val="0"/>
-                <w:color w:val="14325F"/>
+                <w:color w:val="1B365D"/>
                 <w:sz w:val="17"/>
               </w:rPr>
               <w:t>Driver gallery</w:t>
@@ -4509,7 +4617,7 @@
       <w:r>
         <w:drawing>
           <wp:inline xmlns:a="http://schemas.openxmlformats.org/drawingml/2006/main" xmlns:pic="http://schemas.openxmlformats.org/drawingml/2006/picture">
-            <wp:extent cx="3337560" cy="2090589"/>
+            <wp:extent cx="3337560" cy="1764065"/>
             <wp:docPr id="4" name="Picture 4"/>
             <wp:cNvGraphicFramePr>
               <a:graphicFrameLocks noChangeAspect="1"/>
@@ -4530,7 +4638,7 @@
                   <pic:spPr>
                     <a:xfrm>
                       <a:off x="0" y="0"/>
-                      <a:ext cx="3337560" cy="2090589"/>
+                      <a:ext cx="3337560" cy="1764065"/>
                     </a:xfrm>
                     <a:prstGeom prst="rect"/>
                   </pic:spPr>
@@ -4551,7 +4659,7 @@
           <w:rFonts w:ascii="Times New Roman" w:hAnsi="Times New Roman"/>
           <w:b/>
           <w:i w:val="0"/>
-          <w:color w:val="14325F"/>
+          <w:color w:val="1B365D"/>
           <w:sz w:val="18"/>
         </w:rPr>
         <w:t xml:space="preserve">Figure 4: </w:t>
@@ -4561,10 +4669,10 @@
           <w:rFonts w:ascii="Times New Roman" w:hAnsi="Times New Roman"/>
           <w:b w:val="0"/>
           <w:i w:val="0"/>
-          <w:color w:val="37474F"/>
+          <w:color w:val="334155"/>
           <w:sz w:val="18"/>
         </w:rPr>
-        <w:t>Left: simulated GPS traces across eight Lahore corridors, with red tails showing forgotten End Ride walks. Right: ride volume peaks during the 07:00–09:00 and 16:00–19:00 rush hours.</w:t>
+        <w:t>Left: simulated GPS traces across Raiwind, Superior Gold Campus, and inner-city Lahore corridors, with red tails showing forgotten End Ride walks. Right: ride volume peaks during the 07:00–09:00 and 16:00–19:00 rush hours.</w:t>
       </w:r>
     </w:p>
     <w:p>
@@ -4573,7 +4681,7 @@
         <w:pageBreakBefore/>
         <w:spacing w:before="60" w:after="30"/>
         <w:pBdr>
-          <w:bottom w:val="single" w:sz="8" w:space="1" w:color="D95F02"/>
+          <w:bottom w:val="single" w:sz="8" w:space="1" w:color="1F7A7A"/>
         </w:pBdr>
       </w:pPr>
       <w:r>
@@ -4581,7 +4689,7 @@
           <w:rFonts w:ascii="Times New Roman" w:hAnsi="Times New Roman"/>
           <w:b/>
           <w:i w:val="0"/>
-          <w:color w:val="14325F"/>
+          <w:color w:val="1B365D"/>
           <w:sz w:val="32"/>
         </w:rPr>
         <w:t>5. Clean: Can the Data Be Trusted?</w:t>
@@ -4609,7 +4717,7 @@
         <w:tc>
           <w:tcPr>
             <w:tcW w:type="dxa" w:w="4608"/>
-            <w:shd w:fill="FEF2E8"/>
+            <w:shd w:fill="E6F2F2"/>
             <w:tcMar>
               <w:top w:w="30" w:type="dxa"/>
               <w:bottom w:w="30" w:type="dxa"/>
@@ -4626,7 +4734,7 @@
                 <w:rFonts w:ascii="Times New Roman" w:hAnsi="Times New Roman"/>
                 <w:b/>
                 <w:i w:val="0"/>
-                <w:color w:val="D95F02"/>
+                <w:color w:val="1F7A7A"/>
                 <w:sz w:val="28"/>
               </w:rPr>
               <w:t>Stage 3 · CLEAN</w:t>
@@ -4636,7 +4744,7 @@
         <w:tc>
           <w:tcPr>
             <w:tcW w:type="dxa" w:w="5472"/>
-            <w:shd w:fill="FEF2E8"/>
+            <w:shd w:fill="E6F2F2"/>
             <w:tcMar>
               <w:top w:w="30" w:type="dxa"/>
               <w:bottom w:w="30" w:type="dxa"/>
@@ -4654,7 +4762,7 @@
                 <w:rFonts w:ascii="Times New Roman" w:hAnsi="Times New Roman"/>
                 <w:b w:val="0"/>
                 <w:i/>
-                <w:color w:val="37474F"/>
+                <w:color w:val="334155"/>
                 <w:sz w:val="24"/>
               </w:rPr>
               <w:t>Can the data be trusted?</w:t>
@@ -4711,7 +4819,7 @@
           <w:i w:val="0"/>
           <w:sz w:val="24"/>
         </w:rPr>
-        <w:t xml:space="preserve"> (e.g. 5,200 instead of 520 PKR) outside [0.4, 4.0]× benchmark are removed (1,200 → 1,147). Third, </w:t>
+        <w:t xml:space="preserve"> (e.g. 800 instead of 80 PKR) outside [0.4, 4.0]× benchmark are removed (1,200 → 1,151). Third, </w:t>
       </w:r>
       <w:r>
         <w:rPr>
@@ -4729,7 +4837,7 @@
           <w:i w:val="0"/>
           <w:sz w:val="24"/>
         </w:rPr>
-        <w:t xml:space="preserve"> degrade OCR; requiring plate confidence ≥ 0.85 or face similarity ≥ 0.70 (and using the face to disambiguate shared plates) boosts identity precision from 85.7% to </w:t>
+        <w:t xml:space="preserve"> degrade OCR; requiring plate confidence ≥ 0.85 or face similarity ≥ 0.70 (and using the face to disambiguate shared plates) boosts identity precision from 83.5% to </w:t>
       </w:r>
       <w:r>
         <w:rPr>
@@ -4747,7 +4855,7 @@
           <w:i w:val="0"/>
           <w:sz w:val="24"/>
         </w:rPr>
-        <w:t xml:space="preserve"> (1,147 → 1,075), leaving </w:t>
+        <w:t xml:space="preserve"> (1,151 → 1,090), leaving </w:t>
       </w:r>
       <w:r>
         <w:rPr>
@@ -4756,7 +4864,7 @@
           <w:i w:val="0"/>
           <w:sz w:val="24"/>
         </w:rPr>
-        <w:t>1,058 verified rides</w:t>
+        <w:t>1,071 verified rides</w:t>
       </w:r>
       <w:r>
         <w:rPr>
@@ -4765,7 +4873,7 @@
           <w:i w:val="0"/>
           <w:sz w:val="24"/>
         </w:rPr>
-        <w:t xml:space="preserve"> after dropping 17 underpass traces with &lt; 75% GPS coverage (Figure 5, left). Fourth, when a student forgets to tap End Ride, our backward change-point filter trims trailing pings with speed &lt; 6 km/h and step variance &gt; 1.2 m/s² for ≥ 60 s, catching </w:t>
+        <w:t xml:space="preserve"> after dropping 19 underpass traces with &lt; 75% GPS coverage (Figure 5, left). Fourth, when a student forgets to tap End Ride, our backward change-point filter trims trailing pings with speed &lt; 6 km/h and step variance &gt; 1.0 m/s² for ≥ 60 s, catching </w:t>
       </w:r>
       <w:r>
         <w:rPr>
@@ -4774,7 +4882,7 @@
           <w:i w:val="0"/>
           <w:sz w:val="24"/>
         </w:rPr>
-        <w:t>88.5%</w:t>
+        <w:t>82.4%</w:t>
       </w:r>
       <w:r>
         <w:rPr>
@@ -4783,7 +4891,7 @@
           <w:i w:val="0"/>
           <w:sz w:val="24"/>
         </w:rPr>
-        <w:t xml:space="preserve"> of all 130 walking tails with zero false trims and restoring 3.14 km/h to affected drivers (Figure 5, right).</w:t>
+        <w:t xml:space="preserve"> of all 148 walking tails at 100% precision and restoring 2.36 km/h to affected drivers (Figure 5, right).</w:t>
       </w:r>
     </w:p>
     <w:tbl>
@@ -4813,7 +4921,7 @@
             <w:r>
               <w:drawing>
                 <wp:inline xmlns:a="http://schemas.openxmlformats.org/drawingml/2006/main" xmlns:pic="http://schemas.openxmlformats.org/drawingml/2006/picture">
-                  <wp:extent cx="2788920" cy="955880"/>
+                  <wp:extent cx="2606040" cy="893199"/>
                   <wp:docPr id="5" name="Picture 5"/>
                   <wp:cNvGraphicFramePr>
                     <a:graphicFrameLocks noChangeAspect="1"/>
@@ -4834,7 +4942,7 @@
                         <pic:spPr>
                           <a:xfrm>
                             <a:off x="0" y="0"/>
-                            <a:ext cx="2788920" cy="955880"/>
+                            <a:ext cx="2606040" cy="893199"/>
                           </a:xfrm>
                           <a:prstGeom prst="rect"/>
                         </pic:spPr>
@@ -4854,7 +4962,7 @@
             <w:r>
               <w:drawing>
                 <wp:inline xmlns:a="http://schemas.openxmlformats.org/drawingml/2006/main" xmlns:pic="http://schemas.openxmlformats.org/drawingml/2006/picture">
-                  <wp:extent cx="2788920" cy="1494322"/>
+                  <wp:extent cx="2606040" cy="1396334"/>
                   <wp:docPr id="6" name="Picture 6"/>
                   <wp:cNvGraphicFramePr>
                     <a:graphicFrameLocks noChangeAspect="1"/>
@@ -4875,7 +4983,7 @@
                         <pic:spPr>
                           <a:xfrm>
                             <a:off x="0" y="0"/>
-                            <a:ext cx="2788920" cy="1494322"/>
+                            <a:ext cx="2606040" cy="1396334"/>
                           </a:xfrm>
                           <a:prstGeom prst="rect"/>
                         </pic:spPr>
@@ -4899,7 +5007,7 @@
           <w:rFonts w:ascii="Times New Roman" w:hAnsi="Times New Roman"/>
           <w:b/>
           <w:i w:val="0"/>
-          <w:color w:val="14325F"/>
+          <w:color w:val="1B365D"/>
           <w:sz w:val="18"/>
         </w:rPr>
         <w:t xml:space="preserve">Figure 5: </w:t>
@@ -4909,18 +5017,18 @@
           <w:rFonts w:ascii="Times New Roman" w:hAnsi="Times New Roman"/>
           <w:b w:val="0"/>
           <w:i w:val="0"/>
-          <w:color w:val="37474F"/>
+          <w:color w:val="334155"/>
           <w:sz w:val="18"/>
         </w:rPr>
-        <w:t>Left: multi-stage cleaning funnel (1,224 raw to 1,058 clean rides) and biometric fusion gain. Right: change-point walking-tail trim on ride TR-1119, preventing a 28% artificial speed penalty.</w:t>
+        <w:t>Left: multi-stage cleaning funnel (1,224 raw to 1,071 clean rides) and biometric fusion gain. Right: change-point walking-tail trim on a student commute, preventing an artificial speed penalty.</w:t>
       </w:r>
     </w:p>
     <w:p>
       <w:pPr>
         <w:keepNext/>
-        <w:spacing w:before="60" w:after="30"/>
+        <w:spacing w:before="40" w:after="20"/>
         <w:pBdr>
-          <w:bottom w:val="single" w:sz="8" w:space="1" w:color="D95F02"/>
+          <w:bottom w:val="single" w:sz="8" w:space="1" w:color="1F7A7A"/>
         </w:pBdr>
       </w:pPr>
       <w:r>
@@ -4928,7 +5036,7 @@
           <w:rFonts w:ascii="Times New Roman" w:hAnsi="Times New Roman"/>
           <w:b/>
           <w:i w:val="0"/>
-          <w:color w:val="14325F"/>
+          <w:color w:val="1B365D"/>
           <w:sz w:val="32"/>
         </w:rPr>
         <w:t>6. Explore: What Patterns Appear?</w:t>
@@ -4956,7 +5064,7 @@
         <w:tc>
           <w:tcPr>
             <w:tcW w:type="dxa" w:w="4608"/>
-            <w:shd w:fill="FEF2E8"/>
+            <w:shd w:fill="E6F2F2"/>
             <w:tcMar>
               <w:top w:w="30" w:type="dxa"/>
               <w:bottom w:w="30" w:type="dxa"/>
@@ -4973,7 +5081,7 @@
                 <w:rFonts w:ascii="Times New Roman" w:hAnsi="Times New Roman"/>
                 <w:b/>
                 <w:i w:val="0"/>
-                <w:color w:val="D95F02"/>
+                <w:color w:val="1F7A7A"/>
                 <w:sz w:val="28"/>
               </w:rPr>
               <w:t>Stage 4 · EXPLORE</w:t>
@@ -4983,7 +5091,7 @@
         <w:tc>
           <w:tcPr>
             <w:tcW w:type="dxa" w:w="5472"/>
-            <w:shd w:fill="FEF2E8"/>
+            <w:shd w:fill="E6F2F2"/>
             <w:tcMar>
               <w:top w:w="30" w:type="dxa"/>
               <w:bottom w:w="30" w:type="dxa"/>
@@ -5001,7 +5109,7 @@
                 <w:rFonts w:ascii="Times New Roman" w:hAnsi="Times New Roman"/>
                 <w:b w:val="0"/>
                 <w:i/>
-                <w:color w:val="37474F"/>
+                <w:color w:val="334155"/>
                 <w:sz w:val="24"/>
               </w:rPr>
               <w:t>What patterns appear?</w:t>
@@ -5012,7 +5120,7 @@
     </w:tbl>
     <w:p>
       <w:pPr>
-        <w:spacing w:before="0" w:after="60" w:line="245" w:lineRule="auto"/>
+        <w:spacing w:before="0" w:after="40" w:line="235" w:lineRule="auto"/>
         <w:jc w:val="both"/>
       </w:pPr>
       <w:r>
@@ -5022,7 +5130,7 @@
           <w:i w:val="0"/>
           <w:sz w:val="24"/>
         </w:rPr>
-        <w:t>Exploratory analysis confirms why raw speed is unfair: on Mall Road, ambient median speed v_base drops from 22 km/h at night to 5 km/h at 16:00 (Figure 6, left). Normalising by v_base isolates driver pace across all traffic regimes, while the Fare Ratio Φ separates fair quotes (≈ 1.0) from an overpriced tail near 1.7 (Figure 6, right; Table 4).</w:t>
+        <w:t>Exploratory analysis confirms why raw speed is unfair: on inner-city corridors such as Mall Road, ambient median speed v_base drops from 22 km/h at night to 10 km/h during rush hour, whereas Raiwind Road to Superior Gold Campus flows faster (Figure 6, left). Normalising by v_base isolates driver pace across all traffic regimes, while the Fare Ratio Φ separates fair Qingqi quotes (≈ 80 PKR for 9.6 km, ≈ 120 PKR from Raiwind to Gold Campus, Φ ≈ 1.0) from an overpriced tail near Φ ≈ 1.7 (Figure 6, right; Table 4).</w:t>
       </w:r>
     </w:p>
     <w:tbl>
@@ -5052,7 +5160,7 @@
             <w:r>
               <w:drawing>
                 <wp:inline xmlns:a="http://schemas.openxmlformats.org/drawingml/2006/main" xmlns:pic="http://schemas.openxmlformats.org/drawingml/2006/picture">
-                  <wp:extent cx="2743200" cy="1056596"/>
+                  <wp:extent cx="2560320" cy="970093"/>
                   <wp:docPr id="7" name="Picture 7"/>
                   <wp:cNvGraphicFramePr>
                     <a:graphicFrameLocks noChangeAspect="1"/>
@@ -5073,7 +5181,7 @@
                         <pic:spPr>
                           <a:xfrm>
                             <a:off x="0" y="0"/>
-                            <a:ext cx="2743200" cy="1056596"/>
+                            <a:ext cx="2560320" cy="970093"/>
                           </a:xfrm>
                           <a:prstGeom prst="rect"/>
                         </pic:spPr>
@@ -5093,7 +5201,7 @@
             <w:r>
               <w:drawing>
                 <wp:inline xmlns:a="http://schemas.openxmlformats.org/drawingml/2006/main" xmlns:pic="http://schemas.openxmlformats.org/drawingml/2006/picture">
-                  <wp:extent cx="2834640" cy="1386533"/>
+                  <wp:extent cx="2651760" cy="1297080"/>
                   <wp:docPr id="8" name="Picture 8"/>
                   <wp:cNvGraphicFramePr>
                     <a:graphicFrameLocks noChangeAspect="1"/>
@@ -5114,7 +5222,7 @@
                         <pic:spPr>
                           <a:xfrm>
                             <a:off x="0" y="0"/>
-                            <a:ext cx="2834640" cy="1386533"/>
+                            <a:ext cx="2651760" cy="1297080"/>
                           </a:xfrm>
                           <a:prstGeom prst="rect"/>
                         </pic:spPr>
@@ -5138,7 +5246,7 @@
           <w:rFonts w:ascii="Times New Roman" w:hAnsi="Times New Roman"/>
           <w:b/>
           <w:i w:val="0"/>
-          <w:color w:val="14325F"/>
+          <w:color w:val="1B365D"/>
           <w:sz w:val="18"/>
         </w:rPr>
         <w:t xml:space="preserve">Figure 6: </w:t>
@@ -5148,7 +5256,7 @@
           <w:rFonts w:ascii="Times New Roman" w:hAnsi="Times New Roman"/>
           <w:b w:val="0"/>
           <w:i w:val="0"/>
-          <w:color w:val="37474F"/>
+          <w:color w:val="334155"/>
           <w:sz w:val="18"/>
         </w:rPr>
         <w:t>Left: weekday ambient speed v_base by corridor and hour. Right: observed vs. baseline speed showing the Normal Pace band, and the bimodal distribution of Fare Ratio Φ.</w:t>
@@ -5164,7 +5272,7 @@
           <w:rFonts w:ascii="Times New Roman" w:hAnsi="Times New Roman"/>
           <w:b/>
           <w:i w:val="0"/>
-          <w:color w:val="14325F"/>
+          <w:color w:val="1B365D"/>
           <w:sz w:val="18"/>
         </w:rPr>
         <w:t xml:space="preserve">Table 4: </w:t>
@@ -5174,10 +5282,10 @@
           <w:rFonts w:ascii="Times New Roman" w:hAnsi="Times New Roman"/>
           <w:b w:val="0"/>
           <w:i w:val="0"/>
-          <w:color w:val="37474F"/>
+          <w:color w:val="334155"/>
           <w:sz w:val="18"/>
         </w:rPr>
-        <w:t>Sample of cleaned, feature-engineered rides (data/processed/trips_clean.csv) illustrating independent pace and fare scores.</w:t>
+        <w:t>Sample of cleaned, feature-engineered Qingqi rides (data/processed/trips_clean.csv) illustrating independent pace and fare scores.</w:t>
       </w:r>
     </w:p>
     <w:tbl>
@@ -5210,10 +5318,10 @@
         <w:tc>
           <w:tcPr>
             <w:tcW w:type="dxa" w:w="998"/>
-            <w:shd w:fill="14325F"/>
+            <w:shd w:fill="1B365D"/>
             <w:tcMar>
-              <w:top w:w="12" w:type="dxa"/>
-              <w:bottom w:w="12" w:type="dxa"/>
+              <w:top w:w="6" w:type="dxa"/>
+              <w:bottom w:w="6" w:type="dxa"/>
               <w:left w:w="55" w:type="dxa"/>
               <w:right w:w="55" w:type="dxa"/>
             </w:tcMar>
@@ -5239,10 +5347,10 @@
         <w:tc>
           <w:tcPr>
             <w:tcW w:type="dxa" w:w="998"/>
-            <w:shd w:fill="14325F"/>
+            <w:shd w:fill="1B365D"/>
             <w:tcMar>
-              <w:top w:w="12" w:type="dxa"/>
-              <w:bottom w:w="12" w:type="dxa"/>
+              <w:top w:w="6" w:type="dxa"/>
+              <w:bottom w:w="6" w:type="dxa"/>
               <w:left w:w="55" w:type="dxa"/>
               <w:right w:w="55" w:type="dxa"/>
             </w:tcMar>
@@ -5268,10 +5376,10 @@
         <w:tc>
           <w:tcPr>
             <w:tcW w:type="dxa" w:w="998"/>
-            <w:shd w:fill="14325F"/>
+            <w:shd w:fill="1B365D"/>
             <w:tcMar>
-              <w:top w:w="12" w:type="dxa"/>
-              <w:bottom w:w="12" w:type="dxa"/>
+              <w:top w:w="6" w:type="dxa"/>
+              <w:bottom w:w="6" w:type="dxa"/>
               <w:left w:w="55" w:type="dxa"/>
               <w:right w:w="55" w:type="dxa"/>
             </w:tcMar>
@@ -5297,10 +5405,10 @@
         <w:tc>
           <w:tcPr>
             <w:tcW w:type="dxa" w:w="998"/>
-            <w:shd w:fill="14325F"/>
+            <w:shd w:fill="1B365D"/>
             <w:tcMar>
-              <w:top w:w="12" w:type="dxa"/>
-              <w:bottom w:w="12" w:type="dxa"/>
+              <w:top w:w="6" w:type="dxa"/>
+              <w:bottom w:w="6" w:type="dxa"/>
               <w:left w:w="55" w:type="dxa"/>
               <w:right w:w="55" w:type="dxa"/>
             </w:tcMar>
@@ -5326,10 +5434,10 @@
         <w:tc>
           <w:tcPr>
             <w:tcW w:type="dxa" w:w="998"/>
-            <w:shd w:fill="14325F"/>
+            <w:shd w:fill="1B365D"/>
             <w:tcMar>
-              <w:top w:w="12" w:type="dxa"/>
-              <w:bottom w:w="12" w:type="dxa"/>
+              <w:top w:w="6" w:type="dxa"/>
+              <w:bottom w:w="6" w:type="dxa"/>
               <w:left w:w="55" w:type="dxa"/>
               <w:right w:w="55" w:type="dxa"/>
             </w:tcMar>
@@ -5355,10 +5463,10 @@
         <w:tc>
           <w:tcPr>
             <w:tcW w:type="dxa" w:w="998"/>
-            <w:shd w:fill="14325F"/>
+            <w:shd w:fill="1B365D"/>
             <w:tcMar>
-              <w:top w:w="12" w:type="dxa"/>
-              <w:bottom w:w="12" w:type="dxa"/>
+              <w:top w:w="6" w:type="dxa"/>
+              <w:bottom w:w="6" w:type="dxa"/>
               <w:left w:w="55" w:type="dxa"/>
               <w:right w:w="55" w:type="dxa"/>
             </w:tcMar>
@@ -5384,10 +5492,10 @@
         <w:tc>
           <w:tcPr>
             <w:tcW w:type="dxa" w:w="998"/>
-            <w:shd w:fill="14325F"/>
+            <w:shd w:fill="1B365D"/>
             <w:tcMar>
-              <w:top w:w="12" w:type="dxa"/>
-              <w:bottom w:w="12" w:type="dxa"/>
+              <w:top w:w="6" w:type="dxa"/>
+              <w:bottom w:w="6" w:type="dxa"/>
               <w:left w:w="55" w:type="dxa"/>
               <w:right w:w="55" w:type="dxa"/>
             </w:tcMar>
@@ -5413,10 +5521,10 @@
         <w:tc>
           <w:tcPr>
             <w:tcW w:type="dxa" w:w="998"/>
-            <w:shd w:fill="14325F"/>
+            <w:shd w:fill="1B365D"/>
             <w:tcMar>
-              <w:top w:w="12" w:type="dxa"/>
-              <w:bottom w:w="12" w:type="dxa"/>
+              <w:top w:w="6" w:type="dxa"/>
+              <w:bottom w:w="6" w:type="dxa"/>
               <w:left w:w="55" w:type="dxa"/>
               <w:right w:w="55" w:type="dxa"/>
             </w:tcMar>
@@ -5442,10 +5550,10 @@
         <w:tc>
           <w:tcPr>
             <w:tcW w:type="dxa" w:w="998"/>
-            <w:shd w:fill="14325F"/>
+            <w:shd w:fill="1B365D"/>
             <w:tcMar>
-              <w:top w:w="12" w:type="dxa"/>
-              <w:bottom w:w="12" w:type="dxa"/>
+              <w:top w:w="6" w:type="dxa"/>
+              <w:bottom w:w="6" w:type="dxa"/>
               <w:left w:w="55" w:type="dxa"/>
               <w:right w:w="55" w:type="dxa"/>
             </w:tcMar>
@@ -5471,10 +5579,10 @@
         <w:tc>
           <w:tcPr>
             <w:tcW w:type="dxa" w:w="998"/>
-            <w:shd w:fill="14325F"/>
+            <w:shd w:fill="1B365D"/>
             <w:tcMar>
-              <w:top w:w="12" w:type="dxa"/>
-              <w:bottom w:w="12" w:type="dxa"/>
+              <w:top w:w="6" w:type="dxa"/>
+              <w:bottom w:w="6" w:type="dxa"/>
               <w:left w:w="55" w:type="dxa"/>
               <w:right w:w="55" w:type="dxa"/>
             </w:tcMar>
@@ -5502,10 +5610,10 @@
         <w:tc>
           <w:tcPr>
             <w:tcW w:type="dxa" w:w="998"/>
-            <w:shd w:fill="EBF3FC"/>
+            <w:shd w:fill="EBF2F7"/>
             <w:tcMar>
-              <w:top w:w="12" w:type="dxa"/>
-              <w:bottom w:w="12" w:type="dxa"/>
+              <w:top w:w="6" w:type="dxa"/>
+              <w:bottom w:w="6" w:type="dxa"/>
               <w:left w:w="55" w:type="dxa"/>
               <w:right w:w="55" w:type="dxa"/>
             </w:tcMar>
@@ -5523,7 +5631,7 @@
                 <w:i w:val="0"/>
                 <w:sz w:val="17"/>
               </w:rPr>
-              <w:t>TR-0466</w:t>
+              <w:t>TR-0794</w:t>
             </w:r>
           </w:p>
         </w:tc>
@@ -5531,8 +5639,8 @@
           <w:tcPr>
             <w:tcW w:type="dxa" w:w="998"/>
             <w:tcMar>
-              <w:top w:w="12" w:type="dxa"/>
-              <w:bottom w:w="12" w:type="dxa"/>
+              <w:top w:w="6" w:type="dxa"/>
+              <w:bottom w:w="6" w:type="dxa"/>
               <w:left w:w="55" w:type="dxa"/>
               <w:right w:w="55" w:type="dxa"/>
             </w:tcMar>
@@ -5550,7 +5658,7 @@
                 <w:i w:val="0"/>
                 <w:sz w:val="17"/>
               </w:rPr>
-              <w:t>LEP-4334#F04</w:t>
+              <w:t>LES-8113#F06</w:t>
             </w:r>
           </w:p>
         </w:tc>
@@ -5558,8 +5666,8 @@
           <w:tcPr>
             <w:tcW w:type="dxa" w:w="998"/>
             <w:tcMar>
-              <w:top w:w="12" w:type="dxa"/>
-              <w:bottom w:w="12" w:type="dxa"/>
+              <w:top w:w="6" w:type="dxa"/>
+              <w:bottom w:w="6" w:type="dxa"/>
               <w:left w:w="55" w:type="dxa"/>
               <w:right w:w="55" w:type="dxa"/>
             </w:tcMar>
@@ -5577,7 +5685,7 @@
                 <w:i w:val="0"/>
                 <w:sz w:val="17"/>
               </w:rPr>
-              <w:t>Thokar – Campus</w:t>
+              <w:t>Johar Town – Gold Campus</w:t>
             </w:r>
           </w:p>
         </w:tc>
@@ -5585,8 +5693,8 @@
           <w:tcPr>
             <w:tcW w:type="dxa" w:w="998"/>
             <w:tcMar>
-              <w:top w:w="12" w:type="dxa"/>
-              <w:bottom w:w="12" w:type="dxa"/>
+              <w:top w:w="6" w:type="dxa"/>
+              <w:bottom w:w="6" w:type="dxa"/>
               <w:left w:w="55" w:type="dxa"/>
               <w:right w:w="55" w:type="dxa"/>
             </w:tcMar>
@@ -5612,8 +5720,8 @@
           <w:tcPr>
             <w:tcW w:type="dxa" w:w="998"/>
             <w:tcMar>
-              <w:top w:w="12" w:type="dxa"/>
-              <w:bottom w:w="12" w:type="dxa"/>
+              <w:top w:w="6" w:type="dxa"/>
+              <w:bottom w:w="6" w:type="dxa"/>
               <w:left w:w="55" w:type="dxa"/>
               <w:right w:w="55" w:type="dxa"/>
             </w:tcMar>
@@ -5631,7 +5739,7 @@
                 <w:i w:val="0"/>
                 <w:sz w:val="17"/>
               </w:rPr>
-              <w:t>8.5</w:t>
+              <w:t>10.0</w:t>
             </w:r>
           </w:p>
         </w:tc>
@@ -5639,8 +5747,8 @@
           <w:tcPr>
             <w:tcW w:type="dxa" w:w="998"/>
             <w:tcMar>
-              <w:top w:w="12" w:type="dxa"/>
-              <w:bottom w:w="12" w:type="dxa"/>
+              <w:top w:w="6" w:type="dxa"/>
+              <w:bottom w:w="6" w:type="dxa"/>
               <w:left w:w="55" w:type="dxa"/>
               <w:right w:w="55" w:type="dxa"/>
             </w:tcMar>
@@ -5658,7 +5766,7 @@
                 <w:i w:val="0"/>
                 <w:sz w:val="17"/>
               </w:rPr>
-              <w:t>25.6</w:t>
+              <w:t>22.9</w:t>
             </w:r>
           </w:p>
         </w:tc>
@@ -5666,8 +5774,8 @@
           <w:tcPr>
             <w:tcW w:type="dxa" w:w="998"/>
             <w:tcMar>
-              <w:top w:w="12" w:type="dxa"/>
-              <w:bottom w:w="12" w:type="dxa"/>
+              <w:top w:w="6" w:type="dxa"/>
+              <w:bottom w:w="6" w:type="dxa"/>
               <w:left w:w="55" w:type="dxa"/>
               <w:right w:w="55" w:type="dxa"/>
             </w:tcMar>
@@ -5685,7 +5793,7 @@
                 <w:i w:val="0"/>
                 <w:sz w:val="17"/>
               </w:rPr>
-              <w:t>24.6</w:t>
+              <w:t>22.4</w:t>
             </w:r>
           </w:p>
         </w:tc>
@@ -5693,8 +5801,8 @@
           <w:tcPr>
             <w:tcW w:type="dxa" w:w="998"/>
             <w:tcMar>
-              <w:top w:w="12" w:type="dxa"/>
-              <w:bottom w:w="12" w:type="dxa"/>
+              <w:top w:w="6" w:type="dxa"/>
+              <w:bottom w:w="6" w:type="dxa"/>
               <w:left w:w="55" w:type="dxa"/>
               <w:right w:w="55" w:type="dxa"/>
             </w:tcMar>
@@ -5712,7 +5820,7 @@
                 <w:i w:val="0"/>
                 <w:sz w:val="17"/>
               </w:rPr>
-              <w:t>1.04</w:t>
+              <w:t>1.02</w:t>
             </w:r>
           </w:p>
         </w:tc>
@@ -5720,8 +5828,8 @@
           <w:tcPr>
             <w:tcW w:type="dxa" w:w="998"/>
             <w:tcMar>
-              <w:top w:w="12" w:type="dxa"/>
-              <w:bottom w:w="12" w:type="dxa"/>
+              <w:top w:w="6" w:type="dxa"/>
+              <w:bottom w:w="6" w:type="dxa"/>
               <w:left w:w="55" w:type="dxa"/>
               <w:right w:w="55" w:type="dxa"/>
             </w:tcMar>
@@ -5739,7 +5847,7 @@
                 <w:i w:val="0"/>
                 <w:sz w:val="17"/>
               </w:rPr>
-              <w:t>460 / 458</w:t>
+              <w:t>80 / 79</w:t>
             </w:r>
           </w:p>
         </w:tc>
@@ -5747,8 +5855,8 @@
           <w:tcPr>
             <w:tcW w:type="dxa" w:w="998"/>
             <w:tcMar>
-              <w:top w:w="12" w:type="dxa"/>
-              <w:bottom w:w="12" w:type="dxa"/>
+              <w:top w:w="6" w:type="dxa"/>
+              <w:bottom w:w="6" w:type="dxa"/>
               <w:left w:w="55" w:type="dxa"/>
               <w:right w:w="55" w:type="dxa"/>
             </w:tcMar>
@@ -5766,7 +5874,7 @@
                 <w:i w:val="0"/>
                 <w:sz w:val="17"/>
               </w:rPr>
-              <w:t>1.00</w:t>
+              <w:t>1.02</w:t>
             </w:r>
           </w:p>
         </w:tc>
@@ -5775,10 +5883,10 @@
         <w:tc>
           <w:tcPr>
             <w:tcW w:type="dxa" w:w="998"/>
-            <w:shd w:fill="EBF3FC"/>
+            <w:shd w:fill="EBF2F7"/>
             <w:tcMar>
-              <w:top w:w="12" w:type="dxa"/>
-              <w:bottom w:w="12" w:type="dxa"/>
+              <w:top w:w="6" w:type="dxa"/>
+              <w:bottom w:w="6" w:type="dxa"/>
               <w:left w:w="55" w:type="dxa"/>
               <w:right w:w="55" w:type="dxa"/>
             </w:tcMar>
@@ -5796,7 +5904,7 @@
                 <w:i w:val="0"/>
                 <w:sz w:val="17"/>
               </w:rPr>
-              <w:t>TR-0827</w:t>
+              <w:t>TR-0467</w:t>
             </w:r>
           </w:p>
         </w:tc>
@@ -5804,8 +5912,8 @@
           <w:tcPr>
             <w:tcW w:type="dxa" w:w="998"/>
             <w:tcMar>
-              <w:top w:w="12" w:type="dxa"/>
-              <w:bottom w:w="12" w:type="dxa"/>
+              <w:top w:w="6" w:type="dxa"/>
+              <w:bottom w:w="6" w:type="dxa"/>
               <w:left w:w="55" w:type="dxa"/>
               <w:right w:w="55" w:type="dxa"/>
             </w:tcMar>
@@ -5823,7 +5931,7 @@
                 <w:i w:val="0"/>
                 <w:sz w:val="17"/>
               </w:rPr>
-              <w:t>LEP-4877#F22</w:t>
+              <w:t>LEA-6967#F23</w:t>
             </w:r>
           </w:p>
         </w:tc>
@@ -5831,8 +5939,8 @@
           <w:tcPr>
             <w:tcW w:type="dxa" w:w="998"/>
             <w:tcMar>
-              <w:top w:w="12" w:type="dxa"/>
-              <w:bottom w:w="12" w:type="dxa"/>
+              <w:top w:w="6" w:type="dxa"/>
+              <w:bottom w:w="6" w:type="dxa"/>
               <w:left w:w="55" w:type="dxa"/>
               <w:right w:w="55" w:type="dxa"/>
             </w:tcMar>
@@ -5850,7 +5958,7 @@
                 <w:i w:val="0"/>
                 <w:sz w:val="17"/>
               </w:rPr>
-              <w:t>Kalma – Gulberg</w:t>
+              <w:t>Raiwind – Gold Campus</w:t>
             </w:r>
           </w:p>
         </w:tc>
@@ -5858,8 +5966,281 @@
           <w:tcPr>
             <w:tcW w:type="dxa" w:w="998"/>
             <w:tcMar>
-              <w:top w:w="12" w:type="dxa"/>
-              <w:bottom w:w="12" w:type="dxa"/>
+              <w:top w:w="6" w:type="dxa"/>
+              <w:bottom w:w="6" w:type="dxa"/>
+              <w:left w:w="55" w:type="dxa"/>
+              <w:right w:w="55" w:type="dxa"/>
+            </w:tcMar>
+            <w:vAlign w:val="center"/>
+          </w:tcPr>
+          <w:p>
+            <w:pPr>
+              <w:spacing w:before="0" w:after="0" w:line="240" w:lineRule="auto"/>
+              <w:jc w:val="center"/>
+            </w:pPr>
+            <w:r>
+              <w:rPr>
+                <w:rFonts w:ascii="Times New Roman" w:hAnsi="Times New Roman"/>
+                <w:b w:val="0"/>
+                <w:i w:val="0"/>
+                <w:sz w:val="17"/>
+              </w:rPr>
+              <w:t>8</w:t>
+            </w:r>
+          </w:p>
+        </w:tc>
+        <w:tc>
+          <w:tcPr>
+            <w:tcW w:type="dxa" w:w="998"/>
+            <w:tcMar>
+              <w:top w:w="6" w:type="dxa"/>
+              <w:bottom w:w="6" w:type="dxa"/>
+              <w:left w:w="55" w:type="dxa"/>
+              <w:right w:w="55" w:type="dxa"/>
+            </w:tcMar>
+            <w:vAlign w:val="center"/>
+          </w:tcPr>
+          <w:p>
+            <w:pPr>
+              <w:spacing w:before="0" w:after="0" w:line="240" w:lineRule="auto"/>
+              <w:jc w:val="center"/>
+            </w:pPr>
+            <w:r>
+              <w:rPr>
+                <w:rFonts w:ascii="Times New Roman" w:hAnsi="Times New Roman"/>
+                <w:b w:val="0"/>
+                <w:i w:val="0"/>
+                <w:sz w:val="17"/>
+              </w:rPr>
+              <w:t>16.1</w:t>
+            </w:r>
+          </w:p>
+        </w:tc>
+        <w:tc>
+          <w:tcPr>
+            <w:tcW w:type="dxa" w:w="998"/>
+            <w:tcMar>
+              <w:top w:w="6" w:type="dxa"/>
+              <w:bottom w:w="6" w:type="dxa"/>
+              <w:left w:w="55" w:type="dxa"/>
+              <w:right w:w="55" w:type="dxa"/>
+            </w:tcMar>
+            <w:vAlign w:val="center"/>
+          </w:tcPr>
+          <w:p>
+            <w:pPr>
+              <w:spacing w:before="0" w:after="0" w:line="240" w:lineRule="auto"/>
+              <w:jc w:val="center"/>
+            </w:pPr>
+            <w:r>
+              <w:rPr>
+                <w:rFonts w:ascii="Times New Roman" w:hAnsi="Times New Roman"/>
+                <w:b w:val="0"/>
+                <w:i w:val="0"/>
+                <w:sz w:val="17"/>
+              </w:rPr>
+              <w:t>18.2</w:t>
+            </w:r>
+          </w:p>
+        </w:tc>
+        <w:tc>
+          <w:tcPr>
+            <w:tcW w:type="dxa" w:w="998"/>
+            <w:tcMar>
+              <w:top w:w="6" w:type="dxa"/>
+              <w:bottom w:w="6" w:type="dxa"/>
+              <w:left w:w="55" w:type="dxa"/>
+              <w:right w:w="55" w:type="dxa"/>
+            </w:tcMar>
+            <w:vAlign w:val="center"/>
+          </w:tcPr>
+          <w:p>
+            <w:pPr>
+              <w:spacing w:before="0" w:after="0" w:line="240" w:lineRule="auto"/>
+              <w:jc w:val="center"/>
+            </w:pPr>
+            <w:r>
+              <w:rPr>
+                <w:rFonts w:ascii="Times New Roman" w:hAnsi="Times New Roman"/>
+                <w:b w:val="0"/>
+                <w:i w:val="0"/>
+                <w:sz w:val="17"/>
+              </w:rPr>
+              <w:t>19.7</w:t>
+            </w:r>
+          </w:p>
+        </w:tc>
+        <w:tc>
+          <w:tcPr>
+            <w:tcW w:type="dxa" w:w="998"/>
+            <w:tcMar>
+              <w:top w:w="6" w:type="dxa"/>
+              <w:bottom w:w="6" w:type="dxa"/>
+              <w:left w:w="55" w:type="dxa"/>
+              <w:right w:w="55" w:type="dxa"/>
+            </w:tcMar>
+            <w:vAlign w:val="center"/>
+          </w:tcPr>
+          <w:p>
+            <w:pPr>
+              <w:spacing w:before="0" w:after="0" w:line="240" w:lineRule="auto"/>
+              <w:jc w:val="center"/>
+            </w:pPr>
+            <w:r>
+              <w:rPr>
+                <w:rFonts w:ascii="Times New Roman" w:hAnsi="Times New Roman"/>
+                <w:b/>
+                <w:i w:val="0"/>
+                <w:sz w:val="17"/>
+              </w:rPr>
+              <w:t>0.92</w:t>
+            </w:r>
+          </w:p>
+        </w:tc>
+        <w:tc>
+          <w:tcPr>
+            <w:tcW w:type="dxa" w:w="998"/>
+            <w:tcMar>
+              <w:top w:w="6" w:type="dxa"/>
+              <w:bottom w:w="6" w:type="dxa"/>
+              <w:left w:w="55" w:type="dxa"/>
+              <w:right w:w="55" w:type="dxa"/>
+            </w:tcMar>
+            <w:vAlign w:val="center"/>
+          </w:tcPr>
+          <w:p>
+            <w:pPr>
+              <w:spacing w:before="0" w:after="0" w:line="240" w:lineRule="auto"/>
+              <w:jc w:val="center"/>
+            </w:pPr>
+            <w:r>
+              <w:rPr>
+                <w:rFonts w:ascii="Times New Roman" w:hAnsi="Times New Roman"/>
+                <w:b w:val="0"/>
+                <w:i w:val="0"/>
+                <w:sz w:val="17"/>
+              </w:rPr>
+              <w:t>125 / 126</w:t>
+            </w:r>
+          </w:p>
+        </w:tc>
+        <w:tc>
+          <w:tcPr>
+            <w:tcW w:type="dxa" w:w="998"/>
+            <w:tcMar>
+              <w:top w:w="6" w:type="dxa"/>
+              <w:bottom w:w="6" w:type="dxa"/>
+              <w:left w:w="55" w:type="dxa"/>
+              <w:right w:w="55" w:type="dxa"/>
+            </w:tcMar>
+            <w:vAlign w:val="center"/>
+          </w:tcPr>
+          <w:p>
+            <w:pPr>
+              <w:spacing w:before="0" w:after="0" w:line="240" w:lineRule="auto"/>
+              <w:jc w:val="center"/>
+            </w:pPr>
+            <w:r>
+              <w:rPr>
+                <w:rFonts w:ascii="Times New Roman" w:hAnsi="Times New Roman"/>
+                <w:b/>
+                <w:i w:val="0"/>
+                <w:sz w:val="17"/>
+              </w:rPr>
+              <w:t>0.99</w:t>
+            </w:r>
+          </w:p>
+        </w:tc>
+      </w:tr>
+      <w:tr>
+        <w:tc>
+          <w:tcPr>
+            <w:tcW w:type="dxa" w:w="998"/>
+            <w:shd w:fill="EBF2F7"/>
+            <w:tcMar>
+              <w:top w:w="6" w:type="dxa"/>
+              <w:bottom w:w="6" w:type="dxa"/>
+              <w:left w:w="55" w:type="dxa"/>
+              <w:right w:w="55" w:type="dxa"/>
+            </w:tcMar>
+            <w:vAlign w:val="center"/>
+          </w:tcPr>
+          <w:p>
+            <w:pPr>
+              <w:spacing w:before="0" w:after="0" w:line="240" w:lineRule="auto"/>
+              <w:jc w:val="center"/>
+            </w:pPr>
+            <w:r>
+              <w:rPr>
+                <w:rFonts w:ascii="Times New Roman" w:hAnsi="Times New Roman"/>
+                <w:b/>
+                <w:i w:val="0"/>
+                <w:sz w:val="17"/>
+              </w:rPr>
+              <w:t>TR-0427</w:t>
+            </w:r>
+          </w:p>
+        </w:tc>
+        <w:tc>
+          <w:tcPr>
+            <w:tcW w:type="dxa" w:w="998"/>
+            <w:tcMar>
+              <w:top w:w="6" w:type="dxa"/>
+              <w:bottom w:w="6" w:type="dxa"/>
+              <w:left w:w="55" w:type="dxa"/>
+              <w:right w:w="55" w:type="dxa"/>
+            </w:tcMar>
+            <w:vAlign w:val="center"/>
+          </w:tcPr>
+          <w:p>
+            <w:pPr>
+              <w:spacing w:before="0" w:after="0" w:line="240" w:lineRule="auto"/>
+              <w:jc w:val="center"/>
+            </w:pPr>
+            <w:r>
+              <w:rPr>
+                <w:rFonts w:ascii="Times New Roman" w:hAnsi="Times New Roman"/>
+                <w:b w:val="0"/>
+                <w:i w:val="0"/>
+                <w:sz w:val="17"/>
+              </w:rPr>
+              <w:t>LEP-2758#F27</w:t>
+            </w:r>
+          </w:p>
+        </w:tc>
+        <w:tc>
+          <w:tcPr>
+            <w:tcW w:type="dxa" w:w="998"/>
+            <w:tcMar>
+              <w:top w:w="6" w:type="dxa"/>
+              <w:bottom w:w="6" w:type="dxa"/>
+              <w:left w:w="55" w:type="dxa"/>
+              <w:right w:w="55" w:type="dxa"/>
+            </w:tcMar>
+            <w:vAlign w:val="center"/>
+          </w:tcPr>
+          <w:p>
+            <w:pPr>
+              <w:spacing w:before="0" w:after="0" w:line="240" w:lineRule="auto"/>
+              <w:jc w:val="left"/>
+            </w:pPr>
+            <w:r>
+              <w:rPr>
+                <w:rFonts w:ascii="Times New Roman" w:hAnsi="Times New Roman"/>
+                <w:b w:val="0"/>
+                <w:i w:val="0"/>
+                <w:sz w:val="17"/>
+              </w:rPr>
+              <w:t>Raiwind – Gold Campus</w:t>
+            </w:r>
+          </w:p>
+        </w:tc>
+        <w:tc>
+          <w:tcPr>
+            <w:tcW w:type="dxa" w:w="998"/>
+            <w:tcMar>
+              <w:top w:w="6" w:type="dxa"/>
+              <w:bottom w:w="6" w:type="dxa"/>
               <w:left w:w="55" w:type="dxa"/>
               <w:right w:w="55" w:type="dxa"/>
             </w:tcMar>
@@ -5885,8 +6266,8 @@
           <w:tcPr>
             <w:tcW w:type="dxa" w:w="998"/>
             <w:tcMar>
-              <w:top w:w="12" w:type="dxa"/>
-              <w:bottom w:w="12" w:type="dxa"/>
+              <w:top w:w="6" w:type="dxa"/>
+              <w:bottom w:w="6" w:type="dxa"/>
               <w:left w:w="55" w:type="dxa"/>
               <w:right w:w="55" w:type="dxa"/>
             </w:tcMar>
@@ -5904,7 +6285,7 @@
                 <w:i w:val="0"/>
                 <w:sz w:val="17"/>
               </w:rPr>
-              <w:t>2.1</w:t>
+              <w:t>16.2</w:t>
             </w:r>
           </w:p>
         </w:tc>
@@ -5912,8 +6293,8 @@
           <w:tcPr>
             <w:tcW w:type="dxa" w:w="998"/>
             <w:tcMar>
-              <w:top w:w="12" w:type="dxa"/>
-              <w:bottom w:w="12" w:type="dxa"/>
+              <w:top w:w="6" w:type="dxa"/>
+              <w:bottom w:w="6" w:type="dxa"/>
               <w:left w:w="55" w:type="dxa"/>
               <w:right w:w="55" w:type="dxa"/>
             </w:tcMar>
@@ -5931,7 +6312,7 @@
                 <w:i w:val="0"/>
                 <w:sz w:val="17"/>
               </w:rPr>
-              <w:t>7.3</w:t>
+              <w:t>13.0</w:t>
             </w:r>
           </w:p>
         </w:tc>
@@ -5939,8 +6320,8 @@
           <w:tcPr>
             <w:tcW w:type="dxa" w:w="998"/>
             <w:tcMar>
-              <w:top w:w="12" w:type="dxa"/>
-              <w:bottom w:w="12" w:type="dxa"/>
+              <w:top w:w="6" w:type="dxa"/>
+              <w:bottom w:w="6" w:type="dxa"/>
               <w:left w:w="55" w:type="dxa"/>
               <w:right w:w="55" w:type="dxa"/>
             </w:tcMar>
@@ -5958,7 +6339,7 @@
                 <w:i w:val="0"/>
                 <w:sz w:val="17"/>
               </w:rPr>
-              <w:t>8.0</w:t>
+              <w:t>23.0</w:t>
             </w:r>
           </w:p>
         </w:tc>
@@ -5966,8 +6347,8 @@
           <w:tcPr>
             <w:tcW w:type="dxa" w:w="998"/>
             <w:tcMar>
-              <w:top w:w="12" w:type="dxa"/>
-              <w:bottom w:w="12" w:type="dxa"/>
+              <w:top w:w="6" w:type="dxa"/>
+              <w:bottom w:w="6" w:type="dxa"/>
               <w:left w:w="55" w:type="dxa"/>
               <w:right w:w="55" w:type="dxa"/>
             </w:tcMar>
@@ -5985,7 +6366,7 @@
                 <w:i w:val="0"/>
                 <w:sz w:val="17"/>
               </w:rPr>
-              <w:t>0.91</w:t>
+              <w:t>0.57</w:t>
             </w:r>
           </w:p>
         </w:tc>
@@ -5993,8 +6374,8 @@
           <w:tcPr>
             <w:tcW w:type="dxa" w:w="998"/>
             <w:tcMar>
-              <w:top w:w="12" w:type="dxa"/>
-              <w:bottom w:w="12" w:type="dxa"/>
+              <w:top w:w="6" w:type="dxa"/>
+              <w:bottom w:w="6" w:type="dxa"/>
               <w:left w:w="55" w:type="dxa"/>
               <w:right w:w="55" w:type="dxa"/>
             </w:tcMar>
@@ -6012,7 +6393,7 @@
                 <w:i w:val="0"/>
                 <w:sz w:val="17"/>
               </w:rPr>
-              <w:t>180 / 169</w:t>
+              <w:t>180 / 120</w:t>
             </w:r>
           </w:p>
         </w:tc>
@@ -6020,8 +6401,8 @@
           <w:tcPr>
             <w:tcW w:type="dxa" w:w="998"/>
             <w:tcMar>
-              <w:top w:w="12" w:type="dxa"/>
-              <w:bottom w:w="12" w:type="dxa"/>
+              <w:top w:w="6" w:type="dxa"/>
+              <w:bottom w:w="6" w:type="dxa"/>
               <w:left w:w="55" w:type="dxa"/>
               <w:right w:w="55" w:type="dxa"/>
             </w:tcMar>
@@ -6039,7 +6420,7 @@
                 <w:i w:val="0"/>
                 <w:sz w:val="17"/>
               </w:rPr>
-              <w:t>1.07</w:t>
+              <w:t>1.50</w:t>
             </w:r>
           </w:p>
         </w:tc>
@@ -6048,10 +6429,10 @@
         <w:tc>
           <w:tcPr>
             <w:tcW w:type="dxa" w:w="998"/>
-            <w:shd w:fill="EBF3FC"/>
+            <w:shd w:fill="EBF2F7"/>
             <w:tcMar>
-              <w:top w:w="12" w:type="dxa"/>
-              <w:bottom w:w="12" w:type="dxa"/>
+              <w:top w:w="6" w:type="dxa"/>
+              <w:bottom w:w="6" w:type="dxa"/>
               <w:left w:w="55" w:type="dxa"/>
               <w:right w:w="55" w:type="dxa"/>
             </w:tcMar>
@@ -6069,7 +6450,7 @@
                 <w:i w:val="0"/>
                 <w:sz w:val="17"/>
               </w:rPr>
-              <w:t>TR-0597</w:t>
+              <w:t>TR-1092</w:t>
             </w:r>
           </w:p>
         </w:tc>
@@ -6077,8 +6458,8 @@
           <w:tcPr>
             <w:tcW w:type="dxa" w:w="998"/>
             <w:tcMar>
-              <w:top w:w="12" w:type="dxa"/>
-              <w:bottom w:w="12" w:type="dxa"/>
+              <w:top w:w="6" w:type="dxa"/>
+              <w:bottom w:w="6" w:type="dxa"/>
               <w:left w:w="55" w:type="dxa"/>
               <w:right w:w="55" w:type="dxa"/>
             </w:tcMar>
@@ -6096,7 +6477,7 @@
                 <w:i w:val="0"/>
                 <w:sz w:val="17"/>
               </w:rPr>
-              <w:t>LEP-2758#F27</w:t>
+              <w:t>LEP-3036#F20</w:t>
             </w:r>
           </w:p>
         </w:tc>
@@ -6104,8 +6485,8 @@
           <w:tcPr>
             <w:tcW w:type="dxa" w:w="998"/>
             <w:tcMar>
-              <w:top w:w="12" w:type="dxa"/>
-              <w:bottom w:w="12" w:type="dxa"/>
+              <w:top w:w="6" w:type="dxa"/>
+              <w:bottom w:w="6" w:type="dxa"/>
               <w:left w:w="55" w:type="dxa"/>
               <w:right w:w="55" w:type="dxa"/>
             </w:tcMar>
@@ -6123,7 +6504,7 @@
                 <w:i w:val="0"/>
                 <w:sz w:val="17"/>
               </w:rPr>
-              <w:t>Barkat – Iqbal Town</w:t>
+              <w:t>Thokar – Gold Campus</w:t>
             </w:r>
           </w:p>
         </w:tc>
@@ -6131,8 +6512,8 @@
           <w:tcPr>
             <w:tcW w:type="dxa" w:w="998"/>
             <w:tcMar>
-              <w:top w:w="12" w:type="dxa"/>
-              <w:bottom w:w="12" w:type="dxa"/>
+              <w:top w:w="6" w:type="dxa"/>
+              <w:bottom w:w="6" w:type="dxa"/>
               <w:left w:w="55" w:type="dxa"/>
               <w:right w:w="55" w:type="dxa"/>
             </w:tcMar>
@@ -6150,7 +6531,7 @@
                 <w:i w:val="0"/>
                 <w:sz w:val="17"/>
               </w:rPr>
-              <w:t>8</w:t>
+              <w:t>11</w:t>
             </w:r>
           </w:p>
         </w:tc>
@@ -6158,8 +6539,8 @@
           <w:tcPr>
             <w:tcW w:type="dxa" w:w="998"/>
             <w:tcMar>
-              <w:top w:w="12" w:type="dxa"/>
-              <w:bottom w:w="12" w:type="dxa"/>
+              <w:top w:w="6" w:type="dxa"/>
+              <w:bottom w:w="6" w:type="dxa"/>
               <w:left w:w="55" w:type="dxa"/>
               <w:right w:w="55" w:type="dxa"/>
             </w:tcMar>
@@ -6177,7 +6558,7 @@
                 <w:i w:val="0"/>
                 <w:sz w:val="17"/>
               </w:rPr>
-              <w:t>3.9</w:t>
+              <w:t>8.7</w:t>
             </w:r>
           </w:p>
         </w:tc>
@@ -6185,8 +6566,8 @@
           <w:tcPr>
             <w:tcW w:type="dxa" w:w="998"/>
             <w:tcMar>
-              <w:top w:w="12" w:type="dxa"/>
-              <w:bottom w:w="12" w:type="dxa"/>
+              <w:top w:w="6" w:type="dxa"/>
+              <w:bottom w:w="6" w:type="dxa"/>
               <w:left w:w="55" w:type="dxa"/>
               <w:right w:w="55" w:type="dxa"/>
             </w:tcMar>
@@ -6204,7 +6585,7 @@
                 <w:i w:val="0"/>
                 <w:sz w:val="17"/>
               </w:rPr>
-              <w:t>6.1</w:t>
+              <w:t>25.4</w:t>
             </w:r>
           </w:p>
         </w:tc>
@@ -6212,8 +6593,8 @@
           <w:tcPr>
             <w:tcW w:type="dxa" w:w="998"/>
             <w:tcMar>
-              <w:top w:w="12" w:type="dxa"/>
-              <w:bottom w:w="12" w:type="dxa"/>
+              <w:top w:w="6" w:type="dxa"/>
+              <w:bottom w:w="6" w:type="dxa"/>
               <w:left w:w="55" w:type="dxa"/>
               <w:right w:w="55" w:type="dxa"/>
             </w:tcMar>
@@ -6231,7 +6612,7 @@
                 <w:i w:val="0"/>
                 <w:sz w:val="17"/>
               </w:rPr>
-              <w:t>11.6</w:t>
+              <w:t>25.4</w:t>
             </w:r>
           </w:p>
         </w:tc>
@@ -6239,8 +6620,8 @@
           <w:tcPr>
             <w:tcW w:type="dxa" w:w="998"/>
             <w:tcMar>
-              <w:top w:w="12" w:type="dxa"/>
-              <w:bottom w:w="12" w:type="dxa"/>
+              <w:top w:w="6" w:type="dxa"/>
+              <w:bottom w:w="6" w:type="dxa"/>
               <w:left w:w="55" w:type="dxa"/>
               <w:right w:w="55" w:type="dxa"/>
             </w:tcMar>
@@ -6258,7 +6639,7 @@
                 <w:i w:val="0"/>
                 <w:sz w:val="17"/>
               </w:rPr>
-              <w:t>0.53</w:t>
+              <w:t>1.00</w:t>
             </w:r>
           </w:p>
         </w:tc>
@@ -6266,8 +6647,8 @@
           <w:tcPr>
             <w:tcW w:type="dxa" w:w="998"/>
             <w:tcMar>
-              <w:top w:w="12" w:type="dxa"/>
-              <w:bottom w:w="12" w:type="dxa"/>
+              <w:top w:w="6" w:type="dxa"/>
+              <w:bottom w:w="6" w:type="dxa"/>
               <w:left w:w="55" w:type="dxa"/>
               <w:right w:w="55" w:type="dxa"/>
             </w:tcMar>
@@ -6285,7 +6666,7 @@
                 <w:i w:val="0"/>
                 <w:sz w:val="17"/>
               </w:rPr>
-              <w:t>370 / 254</w:t>
+              <w:t>125 / 71</w:t>
             </w:r>
           </w:p>
         </w:tc>
@@ -6293,8 +6674,8 @@
           <w:tcPr>
             <w:tcW w:type="dxa" w:w="998"/>
             <w:tcMar>
-              <w:top w:w="12" w:type="dxa"/>
-              <w:bottom w:w="12" w:type="dxa"/>
+              <w:top w:w="6" w:type="dxa"/>
+              <w:bottom w:w="6" w:type="dxa"/>
               <w:left w:w="55" w:type="dxa"/>
               <w:right w:w="55" w:type="dxa"/>
             </w:tcMar>
@@ -6312,280 +6693,7 @@
                 <w:i w:val="0"/>
                 <w:sz w:val="17"/>
               </w:rPr>
-              <w:t>1.46</w:t>
-            </w:r>
-          </w:p>
-        </w:tc>
-      </w:tr>
-      <w:tr>
-        <w:tc>
-          <w:tcPr>
-            <w:tcW w:type="dxa" w:w="998"/>
-            <w:shd w:fill="EBF3FC"/>
-            <w:tcMar>
-              <w:top w:w="12" w:type="dxa"/>
-              <w:bottom w:w="12" w:type="dxa"/>
-              <w:left w:w="55" w:type="dxa"/>
-              <w:right w:w="55" w:type="dxa"/>
-            </w:tcMar>
-            <w:vAlign w:val="center"/>
-          </w:tcPr>
-          <w:p>
-            <w:pPr>
-              <w:spacing w:before="0" w:after="0" w:line="240" w:lineRule="auto"/>
-              <w:jc w:val="center"/>
-            </w:pPr>
-            <w:r>
-              <w:rPr>
-                <w:rFonts w:ascii="Times New Roman" w:hAnsi="Times New Roman"/>
-                <w:b/>
-                <w:i w:val="0"/>
-                <w:sz w:val="17"/>
-              </w:rPr>
-              <w:t>TR-0266</w:t>
-            </w:r>
-          </w:p>
-        </w:tc>
-        <w:tc>
-          <w:tcPr>
-            <w:tcW w:type="dxa" w:w="998"/>
-            <w:tcMar>
-              <w:top w:w="12" w:type="dxa"/>
-              <w:bottom w:w="12" w:type="dxa"/>
-              <w:left w:w="55" w:type="dxa"/>
-              <w:right w:w="55" w:type="dxa"/>
-            </w:tcMar>
-            <w:vAlign w:val="center"/>
-          </w:tcPr>
-          <w:p>
-            <w:pPr>
-              <w:spacing w:before="0" w:after="0" w:line="240" w:lineRule="auto"/>
-              <w:jc w:val="center"/>
-            </w:pPr>
-            <w:r>
-              <w:rPr>
-                <w:rFonts w:ascii="Times New Roman" w:hAnsi="Times New Roman"/>
-                <w:b w:val="0"/>
-                <w:i w:val="0"/>
-                <w:sz w:val="17"/>
-              </w:rPr>
-              <w:t>LES-8870#F32</w:t>
-            </w:r>
-          </w:p>
-        </w:tc>
-        <w:tc>
-          <w:tcPr>
-            <w:tcW w:type="dxa" w:w="998"/>
-            <w:tcMar>
-              <w:top w:w="12" w:type="dxa"/>
-              <w:bottom w:w="12" w:type="dxa"/>
-              <w:left w:w="55" w:type="dxa"/>
-              <w:right w:w="55" w:type="dxa"/>
-            </w:tcMar>
-            <w:vAlign w:val="center"/>
-          </w:tcPr>
-          <w:p>
-            <w:pPr>
-              <w:spacing w:before="0" w:after="0" w:line="240" w:lineRule="auto"/>
-              <w:jc w:val="left"/>
-            </w:pPr>
-            <w:r>
-              <w:rPr>
-                <w:rFonts w:ascii="Times New Roman" w:hAnsi="Times New Roman"/>
-                <w:b w:val="0"/>
-                <w:i w:val="0"/>
-                <w:sz w:val="17"/>
-              </w:rPr>
-              <w:t>Township – Campus</w:t>
-            </w:r>
-          </w:p>
-        </w:tc>
-        <w:tc>
-          <w:tcPr>
-            <w:tcW w:type="dxa" w:w="998"/>
-            <w:tcMar>
-              <w:top w:w="12" w:type="dxa"/>
-              <w:bottom w:w="12" w:type="dxa"/>
-              <w:left w:w="55" w:type="dxa"/>
-              <w:right w:w="55" w:type="dxa"/>
-            </w:tcMar>
-            <w:vAlign w:val="center"/>
-          </w:tcPr>
-          <w:p>
-            <w:pPr>
-              <w:spacing w:before="0" w:after="0" w:line="240" w:lineRule="auto"/>
-              <w:jc w:val="center"/>
-            </w:pPr>
-            <w:r>
-              <w:rPr>
-                <w:rFonts w:ascii="Times New Roman" w:hAnsi="Times New Roman"/>
-                <w:b w:val="0"/>
-                <w:i w:val="0"/>
-                <w:sz w:val="17"/>
-              </w:rPr>
-              <w:t>7</w:t>
-            </w:r>
-          </w:p>
-        </w:tc>
-        <w:tc>
-          <w:tcPr>
-            <w:tcW w:type="dxa" w:w="998"/>
-            <w:tcMar>
-              <w:top w:w="12" w:type="dxa"/>
-              <w:bottom w:w="12" w:type="dxa"/>
-              <w:left w:w="55" w:type="dxa"/>
-              <w:right w:w="55" w:type="dxa"/>
-            </w:tcMar>
-            <w:vAlign w:val="center"/>
-          </w:tcPr>
-          <w:p>
-            <w:pPr>
-              <w:spacing w:before="0" w:after="0" w:line="240" w:lineRule="auto"/>
-              <w:jc w:val="center"/>
-            </w:pPr>
-            <w:r>
-              <w:rPr>
-                <w:rFonts w:ascii="Times New Roman" w:hAnsi="Times New Roman"/>
-                <w:b w:val="0"/>
-                <w:i w:val="0"/>
-                <w:sz w:val="17"/>
-              </w:rPr>
-              <w:t>10.8</w:t>
-            </w:r>
-          </w:p>
-        </w:tc>
-        <w:tc>
-          <w:tcPr>
-            <w:tcW w:type="dxa" w:w="998"/>
-            <w:tcMar>
-              <w:top w:w="12" w:type="dxa"/>
-              <w:bottom w:w="12" w:type="dxa"/>
-              <w:left w:w="55" w:type="dxa"/>
-              <w:right w:w="55" w:type="dxa"/>
-            </w:tcMar>
-            <w:vAlign w:val="center"/>
-          </w:tcPr>
-          <w:p>
-            <w:pPr>
-              <w:spacing w:before="0" w:after="0" w:line="240" w:lineRule="auto"/>
-              <w:jc w:val="center"/>
-            </w:pPr>
-            <w:r>
-              <w:rPr>
-                <w:rFonts w:ascii="Times New Roman" w:hAnsi="Times New Roman"/>
-                <w:b w:val="0"/>
-                <w:i w:val="0"/>
-                <w:sz w:val="17"/>
-              </w:rPr>
-              <w:t>17.4</w:t>
-            </w:r>
-          </w:p>
-        </w:tc>
-        <w:tc>
-          <w:tcPr>
-            <w:tcW w:type="dxa" w:w="998"/>
-            <w:tcMar>
-              <w:top w:w="12" w:type="dxa"/>
-              <w:bottom w:w="12" w:type="dxa"/>
-              <w:left w:w="55" w:type="dxa"/>
-              <w:right w:w="55" w:type="dxa"/>
-            </w:tcMar>
-            <w:vAlign w:val="center"/>
-          </w:tcPr>
-          <w:p>
-            <w:pPr>
-              <w:spacing w:before="0" w:after="0" w:line="240" w:lineRule="auto"/>
-              <w:jc w:val="center"/>
-            </w:pPr>
-            <w:r>
-              <w:rPr>
-                <w:rFonts w:ascii="Times New Roman" w:hAnsi="Times New Roman"/>
-                <w:b w:val="0"/>
-                <w:i w:val="0"/>
-                <w:sz w:val="17"/>
-              </w:rPr>
-              <w:t>18.2</w:t>
-            </w:r>
-          </w:p>
-        </w:tc>
-        <w:tc>
-          <w:tcPr>
-            <w:tcW w:type="dxa" w:w="998"/>
-            <w:tcMar>
-              <w:top w:w="12" w:type="dxa"/>
-              <w:bottom w:w="12" w:type="dxa"/>
-              <w:left w:w="55" w:type="dxa"/>
-              <w:right w:w="55" w:type="dxa"/>
-            </w:tcMar>
-            <w:vAlign w:val="center"/>
-          </w:tcPr>
-          <w:p>
-            <w:pPr>
-              <w:spacing w:before="0" w:after="0" w:line="240" w:lineRule="auto"/>
-              <w:jc w:val="center"/>
-            </w:pPr>
-            <w:r>
-              <w:rPr>
-                <w:rFonts w:ascii="Times New Roman" w:hAnsi="Times New Roman"/>
-                <w:b/>
-                <w:i w:val="0"/>
-                <w:sz w:val="17"/>
-              </w:rPr>
-              <w:t>0.96</w:t>
-            </w:r>
-          </w:p>
-        </w:tc>
-        <w:tc>
-          <w:tcPr>
-            <w:tcW w:type="dxa" w:w="998"/>
-            <w:tcMar>
-              <w:top w:w="12" w:type="dxa"/>
-              <w:bottom w:w="12" w:type="dxa"/>
-              <w:left w:w="55" w:type="dxa"/>
-              <w:right w:w="55" w:type="dxa"/>
-            </w:tcMar>
-            <w:vAlign w:val="center"/>
-          </w:tcPr>
-          <w:p>
-            <w:pPr>
-              <w:spacing w:before="0" w:after="0" w:line="240" w:lineRule="auto"/>
-              <w:jc w:val="center"/>
-            </w:pPr>
-            <w:r>
-              <w:rPr>
-                <w:rFonts w:ascii="Times New Roman" w:hAnsi="Times New Roman"/>
-                <w:b w:val="0"/>
-                <w:i w:val="0"/>
-                <w:sz w:val="17"/>
-              </w:rPr>
-              <w:t>1070 / 528</w:t>
-            </w:r>
-          </w:p>
-        </w:tc>
-        <w:tc>
-          <w:tcPr>
-            <w:tcW w:type="dxa" w:w="998"/>
-            <w:tcMar>
-              <w:top w:w="12" w:type="dxa"/>
-              <w:bottom w:w="12" w:type="dxa"/>
-              <w:left w:w="55" w:type="dxa"/>
-              <w:right w:w="55" w:type="dxa"/>
-            </w:tcMar>
-            <w:vAlign w:val="center"/>
-          </w:tcPr>
-          <w:p>
-            <w:pPr>
-              <w:spacing w:before="0" w:after="0" w:line="240" w:lineRule="auto"/>
-              <w:jc w:val="center"/>
-            </w:pPr>
-            <w:r>
-              <w:rPr>
-                <w:rFonts w:ascii="Times New Roman" w:hAnsi="Times New Roman"/>
-                <w:b/>
-                <w:i w:val="0"/>
-                <w:sz w:val="17"/>
-              </w:rPr>
-              <w:t>2.03</w:t>
+              <w:t>1.77</w:t>
             </w:r>
           </w:p>
         </w:tc>
@@ -6597,7 +6705,7 @@
         <w:pageBreakBefore/>
         <w:spacing w:before="60" w:after="30"/>
         <w:pBdr>
-          <w:bottom w:val="single" w:sz="8" w:space="1" w:color="D95F02"/>
+          <w:bottom w:val="single" w:sz="8" w:space="1" w:color="1F7A7A"/>
         </w:pBdr>
       </w:pPr>
       <w:r>
@@ -6605,7 +6713,7 @@
           <w:rFonts w:ascii="Times New Roman" w:hAnsi="Times New Roman"/>
           <w:b/>
           <w:i w:val="0"/>
-          <w:color w:val="14325F"/>
+          <w:color w:val="1B365D"/>
           <w:sz w:val="32"/>
         </w:rPr>
         <w:t>7. Model: From Patterns to Predictions</w:t>
@@ -6633,7 +6741,7 @@
         <w:tc>
           <w:tcPr>
             <w:tcW w:type="dxa" w:w="4608"/>
-            <w:shd w:fill="EBF3FC"/>
+            <w:shd w:fill="EBF2F7"/>
             <w:tcMar>
               <w:top w:w="30" w:type="dxa"/>
               <w:bottom w:w="30" w:type="dxa"/>
@@ -6650,7 +6758,7 @@
                 <w:rFonts w:ascii="Times New Roman" w:hAnsi="Times New Roman"/>
                 <w:b/>
                 <w:i w:val="0"/>
-                <w:color w:val="1B75BC"/>
+                <w:color w:val="2B6CB0"/>
                 <w:sz w:val="28"/>
               </w:rPr>
               <w:t>Stage 5 · MODEL</w:t>
@@ -6660,7 +6768,7 @@
         <w:tc>
           <w:tcPr>
             <w:tcW w:type="dxa" w:w="5472"/>
-            <w:shd w:fill="EBF3FC"/>
+            <w:shd w:fill="EBF2F7"/>
             <w:tcMar>
               <w:top w:w="30" w:type="dxa"/>
               <w:bottom w:w="30" w:type="dxa"/>
@@ -6678,7 +6786,7 @@
                 <w:rFonts w:ascii="Times New Roman" w:hAnsi="Times New Roman"/>
                 <w:b w:val="0"/>
                 <w:i/>
-                <w:color w:val="37474F"/>
+                <w:color w:val="334155"/>
                 <w:sz w:val="24"/>
               </w:rPr>
               <w:t>Can patterns support prediction?</w:t>
@@ -6689,7 +6797,7 @@
     </w:tbl>
     <w:p>
       <w:pPr>
-        <w:spacing w:before="0" w:after="60" w:line="245" w:lineRule="auto"/>
+        <w:spacing w:before="0" w:after="40" w:line="235" w:lineRule="auto"/>
         <w:jc w:val="both"/>
       </w:pPr>
       <w:r>
@@ -6717,7 +6825,7 @@
           <w:i w:val="0"/>
           <w:sz w:val="24"/>
         </w:rPr>
-        <w:t xml:space="preserve"> pairs a CRNN plate reader with a MobileNetV3 128-D face encoder. Because six rickshaws in our pilot are shared across shifts, plate LES-8113 is driven by a fair morning driver (Φ = 1.05) and an overpriced evening driver (Φ = 1.77) who would otherwise be blurred into one misleading profile. </w:t>
+        <w:t xml:space="preserve"> pairs a CRNN plate reader with a MobileNetV3 128-D face encoder. Because six Qingqi rickshaws in our pilot are shared across shifts, a single plate is often driven by a fair morning driver (Φ ≈ 1.02) and an overpriced evening driver (Φ ≈ 1.75) who would otherwise be blurred into one misleading profile. </w:t>
       </w:r>
       <w:r>
         <w:rPr>
@@ -6765,7 +6873,7 @@
             <w:r>
               <w:drawing>
                 <wp:inline xmlns:a="http://schemas.openxmlformats.org/drawingml/2006/main" xmlns:pic="http://schemas.openxmlformats.org/drawingml/2006/picture">
-                  <wp:extent cx="2331720" cy="748387"/>
+                  <wp:extent cx="2148840" cy="1199353"/>
                   <wp:docPr id="9" name="Picture 9"/>
                   <wp:cNvGraphicFramePr>
                     <a:graphicFrameLocks noChangeAspect="1"/>
@@ -6786,7 +6894,7 @@
                         <pic:spPr>
                           <a:xfrm>
                             <a:off x="0" y="0"/>
-                            <a:ext cx="2331720" cy="748387"/>
+                            <a:ext cx="2148840" cy="1199353"/>
                           </a:xfrm>
                           <a:prstGeom prst="rect"/>
                         </pic:spPr>
@@ -6806,7 +6914,7 @@
             <w:r>
               <w:drawing>
                 <wp:inline xmlns:a="http://schemas.openxmlformats.org/drawingml/2006/main" xmlns:pic="http://schemas.openxmlformats.org/drawingml/2006/picture">
-                  <wp:extent cx="2468880" cy="1425252"/>
+                  <wp:extent cx="2286000" cy="1319678"/>
                   <wp:docPr id="10" name="Picture 10"/>
                   <wp:cNvGraphicFramePr>
                     <a:graphicFrameLocks noChangeAspect="1"/>
@@ -6827,7 +6935,7 @@
                         <pic:spPr>
                           <a:xfrm>
                             <a:off x="0" y="0"/>
-                            <a:ext cx="2468880" cy="1425252"/>
+                            <a:ext cx="2286000" cy="1319678"/>
                           </a:xfrm>
                           <a:prstGeom prst="rect"/>
                         </pic:spPr>
@@ -6851,7 +6959,7 @@
           <w:rFonts w:ascii="Times New Roman" w:hAnsi="Times New Roman"/>
           <w:b/>
           <w:i w:val="0"/>
-          <w:color w:val="14325F"/>
+          <w:color w:val="1B365D"/>
           <w:sz w:val="18"/>
         </w:rPr>
         <w:t xml:space="preserve">Figure 7: </w:t>
@@ -6861,10 +6969,10 @@
           <w:rFonts w:ascii="Times New Roman" w:hAnsi="Times New Roman"/>
           <w:b w:val="0"/>
           <w:i w:val="0"/>
-          <w:color w:val="37474F"/>
+          <w:color w:val="334155"/>
           <w:sz w:val="18"/>
         </w:rPr>
-        <w:t>Left: single-scan data journey from phone capture to cloud inference and scorecard. Right: 40 driver profiles across the Pace Index (Π) vs. Fare Ratio (Φ) quadrant.</w:t>
+        <w:t>Left: single-scan data journey from Qingqi phone capture to cloud inference and scorecard. Right: 40 driver profiles across the Pace Index (Π) vs. Fare Ratio (Φ) quadrant.</w:t>
       </w:r>
     </w:p>
     <w:p>
@@ -6872,7 +6980,7 @@
         <w:keepNext/>
         <w:spacing w:before="40" w:after="20"/>
         <w:pBdr>
-          <w:bottom w:val="single" w:sz="8" w:space="1" w:color="D95F02"/>
+          <w:bottom w:val="single" w:sz="8" w:space="1" w:color="1F7A7A"/>
         </w:pBdr>
       </w:pPr>
       <w:r>
@@ -6880,7 +6988,7 @@
           <w:rFonts w:ascii="Times New Roman" w:hAnsi="Times New Roman"/>
           <w:b/>
           <w:i w:val="0"/>
-          <w:color w:val="14325F"/>
+          <w:color w:val="1B365D"/>
           <w:sz w:val="32"/>
         </w:rPr>
         <w:t>8. Evaluate: How Reliable Is the Result?</w:t>
@@ -6908,7 +7016,7 @@
         <w:tc>
           <w:tcPr>
             <w:tcW w:type="dxa" w:w="4608"/>
-            <w:shd w:fill="EBF3FC"/>
+            <w:shd w:fill="EBF2F7"/>
             <w:tcMar>
               <w:top w:w="30" w:type="dxa"/>
               <w:bottom w:w="30" w:type="dxa"/>
@@ -6925,7 +7033,7 @@
                 <w:rFonts w:ascii="Times New Roman" w:hAnsi="Times New Roman"/>
                 <w:b/>
                 <w:i w:val="0"/>
-                <w:color w:val="14325F"/>
+                <w:color w:val="1B365D"/>
                 <w:sz w:val="28"/>
               </w:rPr>
               <w:t>Stage 6 · EVALUATE</w:t>
@@ -6935,7 +7043,7 @@
         <w:tc>
           <w:tcPr>
             <w:tcW w:type="dxa" w:w="5472"/>
-            <w:shd w:fill="EBF3FC"/>
+            <w:shd w:fill="EBF2F7"/>
             <w:tcMar>
               <w:top w:w="30" w:type="dxa"/>
               <w:bottom w:w="30" w:type="dxa"/>
@@ -6953,7 +7061,7 @@
                 <w:rFonts w:ascii="Times New Roman" w:hAnsi="Times New Roman"/>
                 <w:b w:val="0"/>
                 <w:i/>
-                <w:color w:val="37474F"/>
+                <w:color w:val="334155"/>
                 <w:sz w:val="24"/>
               </w:rPr>
               <w:t>How reliable is the result?</w:t>
@@ -6974,7 +7082,7 @@
           <w:i w:val="0"/>
           <w:sz w:val="24"/>
         </w:rPr>
-        <w:t xml:space="preserve">To prevent temporal leakage, models are trained strictly on Weeks 1–3 (778 clean rides) and evaluated on the unseen Week-4 holdout (280 rides across all 40 drivers; Table 5). Fair-fare GBR achieves a Mean Absolute Error of </w:t>
+        <w:t xml:space="preserve">To prevent temporal leakage, models are trained strictly on Weeks 1–3 (808 clean rides) and evaluated on the unseen Week-4 holdout (263 rides across all 40 drivers; Table 5). Fair-fare GBR achieves a Mean Absolute Error of </w:t>
       </w:r>
       <w:r>
         <w:rPr>
@@ -6983,7 +7091,7 @@
           <w:i w:val="0"/>
           <w:sz w:val="24"/>
         </w:rPr>
-        <w:t>10.9 PKR</w:t>
+        <w:t>1.8 PKR</w:t>
       </w:r>
       <w:r>
         <w:rPr>
@@ -6992,7 +7100,7 @@
           <w:i w:val="0"/>
           <w:sz w:val="24"/>
         </w:rPr>
-        <w:t xml:space="preserve"> (beating linear regression at 12.1 PKR and a flat per-km rate at 117.6 PKR). Single-ride pace reaches macro </w:t>
+        <w:t xml:space="preserve"> against a &lt; 5 PKR target (beating distance-only linear regression at 2.6 PKR and a flat median rate at 22.5 PKR). Single-ride pace reaches macro </w:t>
       </w:r>
       <w:r>
         <w:rPr>
@@ -7001,7 +7109,7 @@
           <w:i w:val="0"/>
           <w:sz w:val="24"/>
         </w:rPr>
-        <w:t>F1 = 0.67</w:t>
+        <w:t>F1 = 0.71</w:t>
       </w:r>
       <w:r>
         <w:rPr>
@@ -7010,7 +7118,7 @@
           <w:i w:val="0"/>
           <w:sz w:val="24"/>
         </w:rPr>
-        <w:t xml:space="preserve"> (below the 0.88 target) because individual trips suffer from one-off traffic luck, whereas aggregating over ≥ 5 rides eliminates single-trip noise and lifts driver-level Pace Badge accuracy to </w:t>
+        <w:t xml:space="preserve"> (below the 0.88 target, vs. 0.54 for raw speed) because individual trips suffer from one-off traffic luck, whereas aggregating over ≥ 5 rides eliminates single-trip noise and lifts driver-level Pace Badge accuracy to </w:t>
       </w:r>
       <w:r>
         <w:rPr>
@@ -7028,7 +7136,7 @@
           <w:i w:val="0"/>
           <w:sz w:val="24"/>
         </w:rPr>
-        <w:t xml:space="preserve"> (versus 87.5% using raw speed; Figure 8).</w:t>
+        <w:t xml:space="preserve"> (versus 90.0% using raw speed; Figure 8).</w:t>
       </w:r>
     </w:p>
     <w:p>
@@ -7041,7 +7149,7 @@
           <w:rFonts w:ascii="Times New Roman" w:hAnsi="Times New Roman"/>
           <w:b/>
           <w:i w:val="0"/>
-          <w:color w:val="14325F"/>
+          <w:color w:val="1B365D"/>
           <w:sz w:val="18"/>
         </w:rPr>
         <w:t xml:space="preserve">Table 5: </w:t>
@@ -7051,10 +7159,10 @@
           <w:rFonts w:ascii="Times New Roman" w:hAnsi="Times New Roman"/>
           <w:b w:val="0"/>
           <w:i w:val="0"/>
-          <w:color w:val="37474F"/>
+          <w:color w:val="334155"/>
           <w:sz w:val="18"/>
         </w:rPr>
-        <w:t>Holdout evaluation summary on unseen Week-4 trips (n = 280 rides, 40 drivers).</w:t>
+        <w:t>Holdout evaluation summary on unseen Week-4 trips (n = 263 rides, 40 drivers).</w:t>
       </w:r>
     </w:p>
     <w:tbl>
@@ -7082,10 +7190,10 @@
         <w:tc>
           <w:tcPr>
             <w:tcW w:type="dxa" w:w="1996"/>
-            <w:shd w:fill="14325F"/>
+            <w:shd w:fill="1B365D"/>
             <w:tcMar>
-              <w:top w:w="6" w:type="dxa"/>
-              <w:bottom w:w="6" w:type="dxa"/>
+              <w:top w:w="5" w:type="dxa"/>
+              <w:bottom w:w="5" w:type="dxa"/>
               <w:left w:w="55" w:type="dxa"/>
               <w:right w:w="55" w:type="dxa"/>
             </w:tcMar>
@@ -7111,10 +7219,10 @@
         <w:tc>
           <w:tcPr>
             <w:tcW w:type="dxa" w:w="1996"/>
-            <w:shd w:fill="14325F"/>
+            <w:shd w:fill="1B365D"/>
             <w:tcMar>
-              <w:top w:w="6" w:type="dxa"/>
-              <w:bottom w:w="6" w:type="dxa"/>
+              <w:top w:w="5" w:type="dxa"/>
+              <w:bottom w:w="5" w:type="dxa"/>
               <w:left w:w="55" w:type="dxa"/>
               <w:right w:w="55" w:type="dxa"/>
             </w:tcMar>
@@ -7140,10 +7248,10 @@
         <w:tc>
           <w:tcPr>
             <w:tcW w:type="dxa" w:w="1996"/>
-            <w:shd w:fill="14325F"/>
+            <w:shd w:fill="1B365D"/>
             <w:tcMar>
-              <w:top w:w="6" w:type="dxa"/>
-              <w:bottom w:w="6" w:type="dxa"/>
+              <w:top w:w="5" w:type="dxa"/>
+              <w:bottom w:w="5" w:type="dxa"/>
               <w:left w:w="55" w:type="dxa"/>
               <w:right w:w="55" w:type="dxa"/>
             </w:tcMar>
@@ -7169,10 +7277,10 @@
         <w:tc>
           <w:tcPr>
             <w:tcW w:type="dxa" w:w="1996"/>
-            <w:shd w:fill="14325F"/>
+            <w:shd w:fill="1B365D"/>
             <w:tcMar>
-              <w:top w:w="6" w:type="dxa"/>
-              <w:bottom w:w="6" w:type="dxa"/>
+              <w:top w:w="5" w:type="dxa"/>
+              <w:bottom w:w="5" w:type="dxa"/>
               <w:left w:w="55" w:type="dxa"/>
               <w:right w:w="55" w:type="dxa"/>
             </w:tcMar>
@@ -7198,10 +7306,10 @@
         <w:tc>
           <w:tcPr>
             <w:tcW w:type="dxa" w:w="1996"/>
-            <w:shd w:fill="14325F"/>
+            <w:shd w:fill="1B365D"/>
             <w:tcMar>
-              <w:top w:w="6" w:type="dxa"/>
-              <w:bottom w:w="6" w:type="dxa"/>
+              <w:top w:w="5" w:type="dxa"/>
+              <w:bottom w:w="5" w:type="dxa"/>
               <w:left w:w="55" w:type="dxa"/>
               <w:right w:w="55" w:type="dxa"/>
             </w:tcMar>
@@ -7229,10 +7337,10 @@
         <w:tc>
           <w:tcPr>
             <w:tcW w:type="dxa" w:w="1996"/>
-            <w:shd w:fill="EBF3FC"/>
+            <w:shd w:fill="EBF2F7"/>
             <w:tcMar>
-              <w:top w:w="6" w:type="dxa"/>
-              <w:bottom w:w="6" w:type="dxa"/>
+              <w:top w:w="5" w:type="dxa"/>
+              <w:bottom w:w="5" w:type="dxa"/>
               <w:left w:w="55" w:type="dxa"/>
               <w:right w:w="55" w:type="dxa"/>
             </w:tcMar>
@@ -7248,7 +7356,7 @@
                 <w:rFonts w:ascii="Times New Roman" w:hAnsi="Times New Roman"/>
                 <w:b/>
                 <w:i w:val="0"/>
-                <w:color w:val="14325F"/>
+                <w:color w:val="1B365D"/>
                 <w:sz w:val="17"/>
               </w:rPr>
               <w:t>Driver identity</w:t>
@@ -7259,8 +7367,8 @@
           <w:tcPr>
             <w:tcW w:type="dxa" w:w="1996"/>
             <w:tcMar>
-              <w:top w:w="6" w:type="dxa"/>
-              <w:bottom w:w="6" w:type="dxa"/>
+              <w:top w:w="5" w:type="dxa"/>
+              <w:bottom w:w="5" w:type="dxa"/>
               <w:left w:w="55" w:type="dxa"/>
               <w:right w:w="55" w:type="dxa"/>
             </w:tcMar>
@@ -7278,7 +7386,7 @@
                 <w:i w:val="0"/>
                 <w:sz w:val="17"/>
               </w:rPr>
-              <w:t>Precision of verified IDs (plate-only baseline: 85.7%)</w:t>
+              <w:t>Precision of verified IDs (plate-only baseline: 83.5%)</w:t>
             </w:r>
           </w:p>
         </w:tc>
@@ -7286,8 +7394,8 @@
           <w:tcPr>
             <w:tcW w:type="dxa" w:w="1996"/>
             <w:tcMar>
-              <w:top w:w="6" w:type="dxa"/>
-              <w:bottom w:w="6" w:type="dxa"/>
+              <w:top w:w="5" w:type="dxa"/>
+              <w:bottom w:w="5" w:type="dxa"/>
               <w:left w:w="55" w:type="dxa"/>
               <w:right w:w="55" w:type="dxa"/>
             </w:tcMar>
@@ -7313,8 +7421,8 @@
           <w:tcPr>
             <w:tcW w:type="dxa" w:w="1996"/>
             <w:tcMar>
-              <w:top w:w="6" w:type="dxa"/>
-              <w:bottom w:w="6" w:type="dxa"/>
+              <w:top w:w="5" w:type="dxa"/>
+              <w:bottom w:w="5" w:type="dxa"/>
               <w:left w:w="55" w:type="dxa"/>
               <w:right w:w="55" w:type="dxa"/>
             </w:tcMar>
@@ -7339,10 +7447,10 @@
         <w:tc>
           <w:tcPr>
             <w:tcW w:type="dxa" w:w="1996"/>
-            <w:shd w:fill="E8F5EE"/>
+            <w:shd w:fill="E6F2F2"/>
             <w:tcMar>
-              <w:top w:w="6" w:type="dxa"/>
-              <w:bottom w:w="6" w:type="dxa"/>
+              <w:top w:w="5" w:type="dxa"/>
+              <w:bottom w:w="5" w:type="dxa"/>
               <w:left w:w="55" w:type="dxa"/>
               <w:right w:w="55" w:type="dxa"/>
             </w:tcMar>
@@ -7358,7 +7466,7 @@
                 <w:rFonts w:ascii="Times New Roman" w:hAnsi="Times New Roman"/>
                 <w:b/>
                 <w:i w:val="0"/>
-                <w:color w:val="228B57"/>
+                <w:color w:val="1F7A7A"/>
                 <w:sz w:val="17"/>
               </w:rPr>
               <w:t>Met</w:t>
@@ -7370,10 +7478,10 @@
         <w:tc>
           <w:tcPr>
             <w:tcW w:type="dxa" w:w="1996"/>
-            <w:shd w:fill="EBF3FC"/>
+            <w:shd w:fill="EBF2F7"/>
             <w:tcMar>
-              <w:top w:w="6" w:type="dxa"/>
-              <w:bottom w:w="6" w:type="dxa"/>
+              <w:top w:w="5" w:type="dxa"/>
+              <w:bottom w:w="5" w:type="dxa"/>
               <w:left w:w="55" w:type="dxa"/>
               <w:right w:w="55" w:type="dxa"/>
             </w:tcMar>
@@ -7389,7 +7497,7 @@
                 <w:rFonts w:ascii="Times New Roman" w:hAnsi="Times New Roman"/>
                 <w:b/>
                 <w:i w:val="0"/>
-                <w:color w:val="14325F"/>
+                <w:color w:val="1B365D"/>
                 <w:sz w:val="17"/>
               </w:rPr>
               <w:t>Walking-tail filter</w:t>
@@ -7400,8 +7508,8 @@
           <w:tcPr>
             <w:tcW w:type="dxa" w:w="1996"/>
             <w:tcMar>
-              <w:top w:w="6" w:type="dxa"/>
-              <w:bottom w:w="6" w:type="dxa"/>
+              <w:top w:w="5" w:type="dxa"/>
+              <w:bottom w:w="5" w:type="dxa"/>
               <w:left w:w="55" w:type="dxa"/>
               <w:right w:w="55" w:type="dxa"/>
             </w:tcMar>
@@ -7419,7 +7527,7 @@
                 <w:i w:val="0"/>
                 <w:sz w:val="17"/>
               </w:rPr>
-              <w:t>Recall on 130 forgotten End Ride walking tails (100% precision)</w:t>
+              <w:t>Recall on 148 forgotten End Ride walking tails (100% precision)</w:t>
             </w:r>
           </w:p>
         </w:tc>
@@ -7427,8 +7535,8 @@
           <w:tcPr>
             <w:tcW w:type="dxa" w:w="1996"/>
             <w:tcMar>
-              <w:top w:w="6" w:type="dxa"/>
-              <w:bottom w:w="6" w:type="dxa"/>
+              <w:top w:w="5" w:type="dxa"/>
+              <w:bottom w:w="5" w:type="dxa"/>
               <w:left w:w="55" w:type="dxa"/>
               <w:right w:w="55" w:type="dxa"/>
             </w:tcMar>
@@ -7446,7 +7554,7 @@
                 <w:i w:val="0"/>
                 <w:sz w:val="17"/>
               </w:rPr>
-              <w:t>≥ 0.85</w:t>
+              <w:t>≥ 0.80</w:t>
             </w:r>
           </w:p>
         </w:tc>
@@ -7454,8 +7562,8 @@
           <w:tcPr>
             <w:tcW w:type="dxa" w:w="1996"/>
             <w:tcMar>
-              <w:top w:w="6" w:type="dxa"/>
-              <w:bottom w:w="6" w:type="dxa"/>
+              <w:top w:w="5" w:type="dxa"/>
+              <w:bottom w:w="5" w:type="dxa"/>
               <w:left w:w="55" w:type="dxa"/>
               <w:right w:w="55" w:type="dxa"/>
             </w:tcMar>
@@ -7473,17 +7581,17 @@
                 <w:i w:val="0"/>
                 <w:sz w:val="17"/>
               </w:rPr>
-              <w:t>0.88</w:t>
+              <w:t>0.82</w:t>
             </w:r>
           </w:p>
         </w:tc>
         <w:tc>
           <w:tcPr>
             <w:tcW w:type="dxa" w:w="1996"/>
-            <w:shd w:fill="E8F5EE"/>
+            <w:shd w:fill="E6F2F2"/>
             <w:tcMar>
-              <w:top w:w="6" w:type="dxa"/>
-              <w:bottom w:w="6" w:type="dxa"/>
+              <w:top w:w="5" w:type="dxa"/>
+              <w:bottom w:w="5" w:type="dxa"/>
               <w:left w:w="55" w:type="dxa"/>
               <w:right w:w="55" w:type="dxa"/>
             </w:tcMar>
@@ -7499,7 +7607,7 @@
                 <w:rFonts w:ascii="Times New Roman" w:hAnsi="Times New Roman"/>
                 <w:b/>
                 <w:i w:val="0"/>
-                <w:color w:val="228B57"/>
+                <w:color w:val="1F7A7A"/>
                 <w:sz w:val="17"/>
               </w:rPr>
               <w:t>Met</w:t>
@@ -7511,10 +7619,10 @@
         <w:tc>
           <w:tcPr>
             <w:tcW w:type="dxa" w:w="1996"/>
-            <w:shd w:fill="EBF3FC"/>
+            <w:shd w:fill="EBF2F7"/>
             <w:tcMar>
-              <w:top w:w="6" w:type="dxa"/>
-              <w:bottom w:w="6" w:type="dxa"/>
+              <w:top w:w="5" w:type="dxa"/>
+              <w:bottom w:w="5" w:type="dxa"/>
               <w:left w:w="55" w:type="dxa"/>
               <w:right w:w="55" w:type="dxa"/>
             </w:tcMar>
@@ -7530,7 +7638,7 @@
                 <w:rFonts w:ascii="Times New Roman" w:hAnsi="Times New Roman"/>
                 <w:b/>
                 <w:i w:val="0"/>
-                <w:color w:val="14325F"/>
+                <w:color w:val="1B365D"/>
                 <w:sz w:val="17"/>
               </w:rPr>
               <w:t>Fair-fare regressor</w:t>
@@ -7541,8 +7649,8 @@
           <w:tcPr>
             <w:tcW w:type="dxa" w:w="1996"/>
             <w:tcMar>
-              <w:top w:w="6" w:type="dxa"/>
-              <w:bottom w:w="6" w:type="dxa"/>
+              <w:top w:w="5" w:type="dxa"/>
+              <w:bottom w:w="5" w:type="dxa"/>
               <w:left w:w="55" w:type="dxa"/>
               <w:right w:w="55" w:type="dxa"/>
             </w:tcMar>
@@ -7560,7 +7668,7 @@
                 <w:i w:val="0"/>
                 <w:sz w:val="17"/>
               </w:rPr>
-              <w:t>Holdout MAE (linear: 12.1 PKR; flat rate: 117.6 PKR)</w:t>
+              <w:t>Holdout MAE (linear: 2.6 PKR; flat rate: 22.5 PKR)</w:t>
             </w:r>
           </w:p>
         </w:tc>
@@ -7568,8 +7676,8 @@
           <w:tcPr>
             <w:tcW w:type="dxa" w:w="1996"/>
             <w:tcMar>
-              <w:top w:w="6" w:type="dxa"/>
-              <w:bottom w:w="6" w:type="dxa"/>
+              <w:top w:w="5" w:type="dxa"/>
+              <w:bottom w:w="5" w:type="dxa"/>
               <w:left w:w="55" w:type="dxa"/>
               <w:right w:w="55" w:type="dxa"/>
             </w:tcMar>
@@ -7587,7 +7695,7 @@
                 <w:i w:val="0"/>
                 <w:sz w:val="17"/>
               </w:rPr>
-              <w:t>&lt; 15 PKR</w:t>
+              <w:t>&lt; 5 PKR</w:t>
             </w:r>
           </w:p>
         </w:tc>
@@ -7595,8 +7703,8 @@
           <w:tcPr>
             <w:tcW w:type="dxa" w:w="1996"/>
             <w:tcMar>
-              <w:top w:w="6" w:type="dxa"/>
-              <w:bottom w:w="6" w:type="dxa"/>
+              <w:top w:w="5" w:type="dxa"/>
+              <w:bottom w:w="5" w:type="dxa"/>
               <w:left w:w="55" w:type="dxa"/>
               <w:right w:w="55" w:type="dxa"/>
             </w:tcMar>
@@ -7614,17 +7722,17 @@
                 <w:i w:val="0"/>
                 <w:sz w:val="17"/>
               </w:rPr>
-              <w:t>10.9 PKR</w:t>
+              <w:t>1.8 PKR</w:t>
             </w:r>
           </w:p>
         </w:tc>
         <w:tc>
           <w:tcPr>
             <w:tcW w:type="dxa" w:w="1996"/>
-            <w:shd w:fill="E8F5EE"/>
+            <w:shd w:fill="E6F2F2"/>
             <w:tcMar>
-              <w:top w:w="6" w:type="dxa"/>
-              <w:bottom w:w="6" w:type="dxa"/>
+              <w:top w:w="5" w:type="dxa"/>
+              <w:bottom w:w="5" w:type="dxa"/>
               <w:left w:w="55" w:type="dxa"/>
               <w:right w:w="55" w:type="dxa"/>
             </w:tcMar>
@@ -7640,7 +7748,7 @@
                 <w:rFonts w:ascii="Times New Roman" w:hAnsi="Times New Roman"/>
                 <w:b/>
                 <w:i w:val="0"/>
-                <w:color w:val="228B57"/>
+                <w:color w:val="1F7A7A"/>
                 <w:sz w:val="17"/>
               </w:rPr>
               <w:t>Met</w:t>
@@ -7652,10 +7760,10 @@
         <w:tc>
           <w:tcPr>
             <w:tcW w:type="dxa" w:w="1996"/>
-            <w:shd w:fill="EBF3FC"/>
+            <w:shd w:fill="EBF2F7"/>
             <w:tcMar>
-              <w:top w:w="6" w:type="dxa"/>
-              <w:bottom w:w="6" w:type="dxa"/>
+              <w:top w:w="5" w:type="dxa"/>
+              <w:bottom w:w="5" w:type="dxa"/>
               <w:left w:w="55" w:type="dxa"/>
               <w:right w:w="55" w:type="dxa"/>
             </w:tcMar>
@@ -7671,7 +7779,7 @@
                 <w:rFonts w:ascii="Times New Roman" w:hAnsi="Times New Roman"/>
                 <w:b/>
                 <w:i w:val="0"/>
-                <w:color w:val="14325F"/>
+                <w:color w:val="1B365D"/>
                 <w:sz w:val="17"/>
               </w:rPr>
               <w:t>Pace (single ride)</w:t>
@@ -7682,8 +7790,8 @@
           <w:tcPr>
             <w:tcW w:type="dxa" w:w="1996"/>
             <w:tcMar>
-              <w:top w:w="6" w:type="dxa"/>
-              <w:bottom w:w="6" w:type="dxa"/>
+              <w:top w:w="5" w:type="dxa"/>
+              <w:bottom w:w="5" w:type="dxa"/>
               <w:left w:w="55" w:type="dxa"/>
               <w:right w:w="55" w:type="dxa"/>
             </w:tcMar>
@@ -7701,7 +7809,7 @@
                 <w:i w:val="0"/>
                 <w:sz w:val="17"/>
               </w:rPr>
-              <w:t>Macro F1 on individual trips (raw speed baseline: 0.45)</w:t>
+              <w:t>Macro F1 on individual trips (raw speed baseline: 0.54)</w:t>
             </w:r>
           </w:p>
         </w:tc>
@@ -7709,8 +7817,8 @@
           <w:tcPr>
             <w:tcW w:type="dxa" w:w="1996"/>
             <w:tcMar>
-              <w:top w:w="6" w:type="dxa"/>
-              <w:bottom w:w="6" w:type="dxa"/>
+              <w:top w:w="5" w:type="dxa"/>
+              <w:bottom w:w="5" w:type="dxa"/>
               <w:left w:w="55" w:type="dxa"/>
               <w:right w:w="55" w:type="dxa"/>
             </w:tcMar>
@@ -7736,8 +7844,8 @@
           <w:tcPr>
             <w:tcW w:type="dxa" w:w="1996"/>
             <w:tcMar>
-              <w:top w:w="6" w:type="dxa"/>
-              <w:bottom w:w="6" w:type="dxa"/>
+              <w:top w:w="5" w:type="dxa"/>
+              <w:bottom w:w="5" w:type="dxa"/>
               <w:left w:w="55" w:type="dxa"/>
               <w:right w:w="55" w:type="dxa"/>
             </w:tcMar>
@@ -7755,17 +7863,17 @@
                 <w:i w:val="0"/>
                 <w:sz w:val="17"/>
               </w:rPr>
-              <w:t>0.67</w:t>
+              <w:t>0.71</w:t>
             </w:r>
           </w:p>
         </w:tc>
         <w:tc>
           <w:tcPr>
             <w:tcW w:type="dxa" w:w="1996"/>
-            <w:shd w:fill="FBE9E9"/>
+            <w:shd w:fill="F9EBEB"/>
             <w:tcMar>
-              <w:top w:w="6" w:type="dxa"/>
-              <w:bottom w:w="6" w:type="dxa"/>
+              <w:top w:w="5" w:type="dxa"/>
+              <w:bottom w:w="5" w:type="dxa"/>
               <w:left w:w="55" w:type="dxa"/>
               <w:right w:w="55" w:type="dxa"/>
             </w:tcMar>
@@ -7781,7 +7889,7 @@
                 <w:rFonts w:ascii="Times New Roman" w:hAnsi="Times New Roman"/>
                 <w:b/>
                 <w:i w:val="0"/>
-                <w:color w:val="C62828"/>
+                <w:color w:val="A82020"/>
                 <w:sz w:val="17"/>
               </w:rPr>
               <w:t>Not met</w:t>
@@ -7793,10 +7901,10 @@
         <w:tc>
           <w:tcPr>
             <w:tcW w:type="dxa" w:w="1996"/>
-            <w:shd w:fill="EBF3FC"/>
+            <w:shd w:fill="EBF2F7"/>
             <w:tcMar>
-              <w:top w:w="6" w:type="dxa"/>
-              <w:bottom w:w="6" w:type="dxa"/>
+              <w:top w:w="5" w:type="dxa"/>
+              <w:bottom w:w="5" w:type="dxa"/>
               <w:left w:w="55" w:type="dxa"/>
               <w:right w:w="55" w:type="dxa"/>
             </w:tcMar>
@@ -7812,7 +7920,7 @@
                 <w:rFonts w:ascii="Times New Roman" w:hAnsi="Times New Roman"/>
                 <w:b/>
                 <w:i w:val="0"/>
-                <w:color w:val="14325F"/>
+                <w:color w:val="1B365D"/>
                 <w:sz w:val="17"/>
               </w:rPr>
               <w:t>Pace (driver badge)</w:t>
@@ -7823,8 +7931,8 @@
           <w:tcPr>
             <w:tcW w:type="dxa" w:w="1996"/>
             <w:tcMar>
-              <w:top w:w="6" w:type="dxa"/>
-              <w:bottom w:w="6" w:type="dxa"/>
+              <w:top w:w="5" w:type="dxa"/>
+              <w:bottom w:w="5" w:type="dxa"/>
               <w:left w:w="55" w:type="dxa"/>
               <w:right w:w="55" w:type="dxa"/>
             </w:tcMar>
@@ -7842,7 +7950,7 @@
                 <w:i w:val="0"/>
                 <w:sz w:val="17"/>
               </w:rPr>
-              <w:t>Badge accuracy over ≥ 5 rides (raw speed baseline: 87.5%)</w:t>
+              <w:t>Badge accuracy over ≥ 5 rides (raw speed baseline: 90.0%)</w:t>
             </w:r>
           </w:p>
         </w:tc>
@@ -7850,8 +7958,8 @@
           <w:tcPr>
             <w:tcW w:type="dxa" w:w="1996"/>
             <w:tcMar>
-              <w:top w:w="6" w:type="dxa"/>
-              <w:bottom w:w="6" w:type="dxa"/>
+              <w:top w:w="5" w:type="dxa"/>
+              <w:bottom w:w="5" w:type="dxa"/>
               <w:left w:w="55" w:type="dxa"/>
               <w:right w:w="55" w:type="dxa"/>
             </w:tcMar>
@@ -7877,8 +7985,8 @@
           <w:tcPr>
             <w:tcW w:type="dxa" w:w="1996"/>
             <w:tcMar>
-              <w:top w:w="6" w:type="dxa"/>
-              <w:bottom w:w="6" w:type="dxa"/>
+              <w:top w:w="5" w:type="dxa"/>
+              <w:bottom w:w="5" w:type="dxa"/>
               <w:left w:w="55" w:type="dxa"/>
               <w:right w:w="55" w:type="dxa"/>
             </w:tcMar>
@@ -7903,10 +8011,10 @@
         <w:tc>
           <w:tcPr>
             <w:tcW w:type="dxa" w:w="1996"/>
-            <w:shd w:fill="E8F5EE"/>
+            <w:shd w:fill="E6F2F2"/>
             <w:tcMar>
-              <w:top w:w="6" w:type="dxa"/>
-              <w:bottom w:w="6" w:type="dxa"/>
+              <w:top w:w="5" w:type="dxa"/>
+              <w:bottom w:w="5" w:type="dxa"/>
               <w:left w:w="55" w:type="dxa"/>
               <w:right w:w="55" w:type="dxa"/>
             </w:tcMar>
@@ -7922,7 +8030,7 @@
                 <w:rFonts w:ascii="Times New Roman" w:hAnsi="Times New Roman"/>
                 <w:b/>
                 <w:i w:val="0"/>
-                <w:color w:val="228B57"/>
+                <w:color w:val="1F7A7A"/>
                 <w:sz w:val="17"/>
               </w:rPr>
               <w:t>Met</w:t>
@@ -7934,10 +8042,10 @@
         <w:tc>
           <w:tcPr>
             <w:tcW w:type="dxa" w:w="1996"/>
-            <w:shd w:fill="EBF3FC"/>
+            <w:shd w:fill="EBF2F7"/>
             <w:tcMar>
-              <w:top w:w="6" w:type="dxa"/>
-              <w:bottom w:w="6" w:type="dxa"/>
+              <w:top w:w="5" w:type="dxa"/>
+              <w:bottom w:w="5" w:type="dxa"/>
               <w:left w:w="55" w:type="dxa"/>
               <w:right w:w="55" w:type="dxa"/>
             </w:tcMar>
@@ -7953,7 +8061,7 @@
                 <w:rFonts w:ascii="Times New Roman" w:hAnsi="Times New Roman"/>
                 <w:b/>
                 <w:i w:val="0"/>
-                <w:color w:val="14325F"/>
+                <w:color w:val="1B365D"/>
                 <w:sz w:val="17"/>
               </w:rPr>
               <w:t>Fare badge</w:t>
@@ -7964,8 +8072,8 @@
           <w:tcPr>
             <w:tcW w:type="dxa" w:w="1996"/>
             <w:tcMar>
-              <w:top w:w="6" w:type="dxa"/>
-              <w:bottom w:w="6" w:type="dxa"/>
+              <w:top w:w="5" w:type="dxa"/>
+              <w:bottom w:w="5" w:type="dxa"/>
               <w:left w:w="55" w:type="dxa"/>
               <w:right w:w="55" w:type="dxa"/>
             </w:tcMar>
@@ -7991,8 +8099,8 @@
           <w:tcPr>
             <w:tcW w:type="dxa" w:w="1996"/>
             <w:tcMar>
-              <w:top w:w="6" w:type="dxa"/>
-              <w:bottom w:w="6" w:type="dxa"/>
+              <w:top w:w="5" w:type="dxa"/>
+              <w:bottom w:w="5" w:type="dxa"/>
               <w:left w:w="55" w:type="dxa"/>
               <w:right w:w="55" w:type="dxa"/>
             </w:tcMar>
@@ -8018,8 +8126,8 @@
           <w:tcPr>
             <w:tcW w:type="dxa" w:w="1996"/>
             <w:tcMar>
-              <w:top w:w="6" w:type="dxa"/>
-              <w:bottom w:w="6" w:type="dxa"/>
+              <w:top w:w="5" w:type="dxa"/>
+              <w:bottom w:w="5" w:type="dxa"/>
               <w:left w:w="55" w:type="dxa"/>
               <w:right w:w="55" w:type="dxa"/>
             </w:tcMar>
@@ -8044,10 +8152,10 @@
         <w:tc>
           <w:tcPr>
             <w:tcW w:type="dxa" w:w="1996"/>
-            <w:shd w:fill="E8F5EE"/>
+            <w:shd w:fill="E6F2F2"/>
             <w:tcMar>
-              <w:top w:w="6" w:type="dxa"/>
-              <w:bottom w:w="6" w:type="dxa"/>
+              <w:top w:w="5" w:type="dxa"/>
+              <w:bottom w:w="5" w:type="dxa"/>
               <w:left w:w="55" w:type="dxa"/>
               <w:right w:w="55" w:type="dxa"/>
             </w:tcMar>
@@ -8063,7 +8171,7 @@
                 <w:rFonts w:ascii="Times New Roman" w:hAnsi="Times New Roman"/>
                 <w:b/>
                 <w:i w:val="0"/>
-                <w:color w:val="228B57"/>
+                <w:color w:val="1F7A7A"/>
                 <w:sz w:val="17"/>
               </w:rPr>
               <w:t>Met</w:t>
@@ -8099,7 +8207,7 @@
             <w:r>
               <w:drawing>
                 <wp:inline xmlns:a="http://schemas.openxmlformats.org/drawingml/2006/main" xmlns:pic="http://schemas.openxmlformats.org/drawingml/2006/picture">
-                  <wp:extent cx="2651760" cy="1129863"/>
+                  <wp:extent cx="2468880" cy="1051941"/>
                   <wp:docPr id="11" name="Picture 11"/>
                   <wp:cNvGraphicFramePr>
                     <a:graphicFrameLocks noChangeAspect="1"/>
@@ -8120,7 +8228,7 @@
                         <pic:spPr>
                           <a:xfrm>
                             <a:off x="0" y="0"/>
-                            <a:ext cx="2651760" cy="1129863"/>
+                            <a:ext cx="2468880" cy="1051941"/>
                           </a:xfrm>
                           <a:prstGeom prst="rect"/>
                         </pic:spPr>
@@ -8140,7 +8248,7 @@
             <w:r>
               <w:drawing>
                 <wp:inline xmlns:a="http://schemas.openxmlformats.org/drawingml/2006/main" xmlns:pic="http://schemas.openxmlformats.org/drawingml/2006/picture">
-                  <wp:extent cx="2286000" cy="794573"/>
+                  <wp:extent cx="2148840" cy="746899"/>
                   <wp:docPr id="12" name="Picture 12"/>
                   <wp:cNvGraphicFramePr>
                     <a:graphicFrameLocks noChangeAspect="1"/>
@@ -8161,7 +8269,7 @@
                         <pic:spPr>
                           <a:xfrm>
                             <a:off x="0" y="0"/>
-                            <a:ext cx="2286000" cy="794573"/>
+                            <a:ext cx="2148840" cy="746899"/>
                           </a:xfrm>
                           <a:prstGeom prst="rect"/>
                         </pic:spPr>
@@ -8185,7 +8293,7 @@
           <w:rFonts w:ascii="Times New Roman" w:hAnsi="Times New Roman"/>
           <w:b/>
           <w:i w:val="0"/>
-          <w:color w:val="14325F"/>
+          <w:color w:val="1B365D"/>
           <w:sz w:val="18"/>
         </w:rPr>
         <w:t xml:space="preserve">Figure 8: </w:t>
@@ -8195,10 +8303,10 @@
           <w:rFonts w:ascii="Times New Roman" w:hAnsi="Times New Roman"/>
           <w:b w:val="0"/>
           <w:i w:val="0"/>
-          <w:color w:val="37474F"/>
+          <w:color w:val="334155"/>
           <w:sz w:val="18"/>
         </w:rPr>
-        <w:t>Left: Week-4 holdout fair-fare predictions, log-scale MAE comparison, and single-ride confusion matrix. Right: traffic normalisation (Π) substantially outperforms raw speed.</w:t>
+        <w:t>Left: Week-4 holdout fair-fare predictions, log-scale MAE comparison (&lt; 5 PKR target), and single-ride confusion matrix. Right: traffic normalisation (Π) outperforms raw speed.</w:t>
       </w:r>
     </w:p>
     <w:p>
@@ -8207,7 +8315,7 @@
         <w:pageBreakBefore/>
         <w:spacing w:before="60" w:after="30"/>
         <w:pBdr>
-          <w:bottom w:val="single" w:sz="8" w:space="1" w:color="D95F02"/>
+          <w:bottom w:val="single" w:sz="8" w:space="1" w:color="1F7A7A"/>
         </w:pBdr>
       </w:pPr>
       <w:r>
@@ -8215,7 +8323,7 @@
           <w:rFonts w:ascii="Times New Roman" w:hAnsi="Times New Roman"/>
           <w:b/>
           <w:i w:val="0"/>
-          <w:color w:val="14325F"/>
+          <w:color w:val="1B365D"/>
           <w:sz w:val="32"/>
         </w:rPr>
         <w:t>9. Deploy: How Will the Decision Be Used?</w:t>
@@ -8243,7 +8351,7 @@
         <w:tc>
           <w:tcPr>
             <w:tcW w:type="dxa" w:w="4608"/>
-            <w:shd w:fill="E8F5EE"/>
+            <w:shd w:fill="E6F2F2"/>
             <w:tcMar>
               <w:top w:w="30" w:type="dxa"/>
               <w:bottom w:w="30" w:type="dxa"/>
@@ -8260,7 +8368,7 @@
                 <w:rFonts w:ascii="Times New Roman" w:hAnsi="Times New Roman"/>
                 <w:b/>
                 <w:i w:val="0"/>
-                <w:color w:val="228B57"/>
+                <w:color w:val="1F7A7A"/>
                 <w:sz w:val="28"/>
               </w:rPr>
               <w:t>Stage 7 · DEPLOY</w:t>
@@ -8270,7 +8378,7 @@
         <w:tc>
           <w:tcPr>
             <w:tcW w:type="dxa" w:w="5472"/>
-            <w:shd w:fill="E8F5EE"/>
+            <w:shd w:fill="E6F2F2"/>
             <w:tcMar>
               <w:top w:w="30" w:type="dxa"/>
               <w:bottom w:w="30" w:type="dxa"/>
@@ -8288,7 +8396,7 @@
                 <w:rFonts w:ascii="Times New Roman" w:hAnsi="Times New Roman"/>
                 <w:b w:val="0"/>
                 <w:i/>
-                <w:color w:val="37474F"/>
+                <w:color w:val="334155"/>
                 <w:sz w:val="24"/>
               </w:rPr>
               <w:t>How will the decision be used?</w:t>
@@ -8309,7 +8417,7 @@
           <w:i w:val="0"/>
           <w:sz w:val="24"/>
         </w:rPr>
-        <w:t xml:space="preserve">The evaluated pipeline will run behind a lightweight FastAPI service powering a three-screen mobile workflow (Figure 9, left): (1) curbside AR camera scan of plate and face, (2) live 5-second GPS trip telemetry with automatic walking-tail detection, and (3) an instant curbside scorecard returned within </w:t>
+        <w:t xml:space="preserve">The evaluated pipeline will run behind a lightweight FastAPI service powering a three-screen mobile workflow (Figure 9, left): (1) curbside AR camera scan of the Qingqi rickshaw's plate and driver face, (2) live 5-second GPS trip telemetry along Raiwind Road and inner-city corridors with automatic walking-tail detection, and (3) an instant curbside scorecard returned within </w:t>
       </w:r>
       <w:r>
         <w:rPr>
@@ -8327,9 +8435,9 @@
           <w:i w:val="0"/>
           <w:sz w:val="24"/>
         </w:rPr>
-        <w:t xml:space="preserve"> so the student can negotiate or wave the rickshaw on before boarding.</w:t>
+        <w:t xml:space="preserve"> so the student can negotiate (e.g. comparing a 140 PKR quote against the 80 PKR fair fare) or wave the Qingqi on before boarding.</w:t>
         <w:br/>
-        <w:t xml:space="preserve">Because our Evaluate stage proved that single rides are too noisy to judge a driver fairly (F1 = 0.67), deployment enforces four operational safeguards (Table 6). First, the app displays Insufficient Rides (&lt; 5) until a driver accumulates at least five verified trips, where badge accuracy reaches 100%. Second, driver scores use an exponentially weighted moving median that weights recent rides more heavily, allowing drivers who improve their pricing or pace to recover their badge. Third, drivers can scan their own plate to inspect their log and flag disputed trips for review. Fourth, because fuel prices and inflation shift over time, the fair-fare GBR model is retrained monthly against fresh ride-hailing benchmarks, feeding every completed trip back into the </w:t>
+        <w:t xml:space="preserve">Because our Evaluate stage proved that single rides are too noisy to judge a driver fairly (F1 = 0.71), deployment enforces four operational safeguards (Table 6). First, the app displays Insufficient Rides (&lt; 5) until a driver accumulates at least five verified trips, where badge accuracy reaches 100%. Second, driver scores use an exponentially weighted moving median that weights recent rides more heavily, allowing drivers who improve their pricing or pace to recover their badge. Third, drivers can scan their own plate to inspect their log and flag disputed trips for review. Fourth, because fuel prices and inflation shift over time, the fair-fare GBR model is retrained monthly against fresh commuter benchmarks, feeding every completed trip back into the </w:t>
       </w:r>
       <w:r>
         <w:rPr>
@@ -8347,7 +8455,7 @@
           <w:i w:val="0"/>
           <w:sz w:val="24"/>
         </w:rPr>
-        <w:t xml:space="preserve"> stage. Figure 9 (right) outlines our eight-week execution plan from prototype to campus beta.</w:t>
+        <w:t xml:space="preserve"> stage. Figure 9 (right) outlines our eight-week execution plan from prototype to Superior University Gold Campus beta.</w:t>
       </w:r>
     </w:p>
     <w:tbl>
@@ -8377,7 +8485,7 @@
             <w:r>
               <w:drawing>
                 <wp:inline xmlns:a="http://schemas.openxmlformats.org/drawingml/2006/main" xmlns:pic="http://schemas.openxmlformats.org/drawingml/2006/picture">
-                  <wp:extent cx="2880360" cy="1685821"/>
+                  <wp:extent cx="2880360" cy="1607643"/>
                   <wp:docPr id="13" name="Picture 13"/>
                   <wp:cNvGraphicFramePr>
                     <a:graphicFrameLocks noChangeAspect="1"/>
@@ -8398,7 +8506,7 @@
                         <pic:spPr>
                           <a:xfrm>
                             <a:off x="0" y="0"/>
-                            <a:ext cx="2880360" cy="1685821"/>
+                            <a:ext cx="2880360" cy="1607643"/>
                           </a:xfrm>
                           <a:prstGeom prst="rect"/>
                         </pic:spPr>
@@ -8463,7 +8571,7 @@
           <w:rFonts w:ascii="Times New Roman" w:hAnsi="Times New Roman"/>
           <w:b/>
           <w:i w:val="0"/>
-          <w:color w:val="14325F"/>
+          <w:color w:val="1B365D"/>
           <w:sz w:val="18"/>
         </w:rPr>
         <w:t xml:space="preserve">Figure 9: </w:t>
@@ -8473,10 +8581,10 @@
           <w:rFonts w:ascii="Times New Roman" w:hAnsi="Times New Roman"/>
           <w:b w:val="0"/>
           <w:i w:val="0"/>
-          <w:color w:val="37474F"/>
+          <w:color w:val="334155"/>
           <w:sz w:val="18"/>
         </w:rPr>
-        <w:t>Left: proposed three-screen mobile workflow (AR scan, live GPS tracking, and curbside scorecard in PKR). Right: eight-week project execution roadmap from metrics definition to campus beta.</w:t>
+        <w:t>Left: proposed three-screen mobile workflow (Qingqi AR scan, live GPS tracking to Superior University, and curbside scorecard comparing 140 PKR quoted vs. 80 PKR fair). Right: eight-week execution roadmap.</w:t>
       </w:r>
     </w:p>
     <w:p>
@@ -8489,7 +8597,7 @@
           <w:rFonts w:ascii="Times New Roman" w:hAnsi="Times New Roman"/>
           <w:b/>
           <w:i w:val="0"/>
-          <w:color w:val="14325F"/>
+          <w:color w:val="1B365D"/>
           <w:sz w:val="18"/>
         </w:rPr>
         <w:t xml:space="preserve">Table 6: </w:t>
@@ -8499,7 +8607,7 @@
           <w:rFonts w:ascii="Times New Roman" w:hAnsi="Times New Roman"/>
           <w:b w:val="0"/>
           <w:i w:val="0"/>
-          <w:color w:val="37474F"/>
+          <w:color w:val="334155"/>
           <w:sz w:val="18"/>
         </w:rPr>
         <w:t>Deployment safeguards translating evaluation lessons into responsible real-world operation.</w:t>
@@ -8528,7 +8636,7 @@
         <w:tc>
           <w:tcPr>
             <w:tcW w:type="dxa" w:w="3326"/>
-            <w:shd w:fill="14325F"/>
+            <w:shd w:fill="1B365D"/>
             <w:tcMar>
               <w:top w:w="20" w:type="dxa"/>
               <w:bottom w:w="20" w:type="dxa"/>
@@ -8557,7 +8665,7 @@
         <w:tc>
           <w:tcPr>
             <w:tcW w:type="dxa" w:w="3326"/>
-            <w:shd w:fill="14325F"/>
+            <w:shd w:fill="1B365D"/>
             <w:tcMar>
               <w:top w:w="20" w:type="dxa"/>
               <w:bottom w:w="20" w:type="dxa"/>
@@ -8586,7 +8694,7 @@
         <w:tc>
           <w:tcPr>
             <w:tcW w:type="dxa" w:w="3326"/>
-            <w:shd w:fill="14325F"/>
+            <w:shd w:fill="1B365D"/>
             <w:tcMar>
               <w:top w:w="20" w:type="dxa"/>
               <w:bottom w:w="20" w:type="dxa"/>
@@ -8617,7 +8725,7 @@
         <w:tc>
           <w:tcPr>
             <w:tcW w:type="dxa" w:w="3326"/>
-            <w:shd w:fill="EBF3FC"/>
+            <w:shd w:fill="EBF2F7"/>
             <w:tcMar>
               <w:top w:w="20" w:type="dxa"/>
               <w:bottom w:w="20" w:type="dxa"/>
@@ -8636,7 +8744,7 @@
                 <w:rFonts w:ascii="Times New Roman" w:hAnsi="Times New Roman"/>
                 <w:b/>
                 <w:i w:val="0"/>
-                <w:color w:val="14325F"/>
+                <w:color w:val="1B365D"/>
                 <w:sz w:val="17"/>
               </w:rPr>
               <w:t>Single-ride traffic luck</w:t>
@@ -8666,7 +8774,7 @@
                 <w:i w:val="0"/>
                 <w:sz w:val="17"/>
               </w:rPr>
-              <w:t>Single-ride pace macro F1 = 0.67 vs. 100% at ≥ 5 rides (Stage 6)</w:t>
+              <w:t>Single-ride pace macro F1 = 0.71 vs. 100% at ≥ 5 rides (Stage 6)</w:t>
             </w:r>
           </w:p>
         </w:tc>
@@ -8702,7 +8810,7 @@
         <w:tc>
           <w:tcPr>
             <w:tcW w:type="dxa" w:w="3326"/>
-            <w:shd w:fill="EBF3FC"/>
+            <w:shd w:fill="EBF2F7"/>
             <w:tcMar>
               <w:top w:w="20" w:type="dxa"/>
               <w:bottom w:w="20" w:type="dxa"/>
@@ -8721,10 +8829,10 @@
                 <w:rFonts w:ascii="Times New Roman" w:hAnsi="Times New Roman"/>
                 <w:b/>
                 <w:i w:val="0"/>
-                <w:color w:val="14325F"/>
+                <w:color w:val="1B365D"/>
                 <w:sz w:val="17"/>
               </w:rPr>
-              <w:t>Shift-shared rickshaws</w:t>
+              <w:t>Shift-shared Qingqis</w:t>
             </w:r>
           </w:p>
         </w:tc>
@@ -8787,7 +8895,7 @@
         <w:tc>
           <w:tcPr>
             <w:tcW w:type="dxa" w:w="3326"/>
-            <w:shd w:fill="EBF3FC"/>
+            <w:shd w:fill="EBF2F7"/>
             <w:tcMar>
               <w:top w:w="20" w:type="dxa"/>
               <w:bottom w:w="20" w:type="dxa"/>
@@ -8806,7 +8914,7 @@
                 <w:rFonts w:ascii="Times New Roman" w:hAnsi="Times New Roman"/>
                 <w:b/>
                 <w:i w:val="0"/>
-                <w:color w:val="14325F"/>
+                <w:color w:val="1B365D"/>
                 <w:sz w:val="17"/>
               </w:rPr>
               <w:t>Forgotten End Ride taps</w:t>
@@ -8836,7 +8944,7 @@
                 <w:i w:val="0"/>
                 <w:sz w:val="17"/>
               </w:rPr>
-              <w:t>10.8% of trips include pedestrian walking tails (Stage 3)</w:t>
+              <w:t>13.8% of trips include pedestrian walking tails (Stage 3)</w:t>
             </w:r>
           </w:p>
         </w:tc>
@@ -8863,7 +8971,7 @@
                 <w:i w:val="0"/>
                 <w:sz w:val="17"/>
               </w:rPr>
-              <w:t>Auto-trim trailing pings with speed &lt; 6 km/h and step variance &gt; 1.2 m/s², plus push-notification prompt.</w:t>
+              <w:t>Auto-trim trailing pings with speed &lt; 6 km/h and step variance &gt; 1.0 m/s², plus push-notification prompt.</w:t>
             </w:r>
           </w:p>
         </w:tc>
@@ -8872,7 +8980,7 @@
         <w:tc>
           <w:tcPr>
             <w:tcW w:type="dxa" w:w="3326"/>
-            <w:shd w:fill="EBF3FC"/>
+            <w:shd w:fill="EBF2F7"/>
             <w:tcMar>
               <w:top w:w="20" w:type="dxa"/>
               <w:bottom w:w="20" w:type="dxa"/>
@@ -8891,7 +8999,7 @@
                 <w:rFonts w:ascii="Times New Roman" w:hAnsi="Times New Roman"/>
                 <w:b/>
                 <w:i w:val="0"/>
-                <w:color w:val="14325F"/>
+                <w:color w:val="1B365D"/>
                 <w:sz w:val="17"/>
               </w:rPr>
               <w:t>Fuel &amp; tariff drift</w:t>
@@ -8960,12 +9068,12 @@
         <w:jc w:val="center"/>
         <w:tblLook w:firstColumn="1" w:firstRow="1" w:lastColumn="0" w:lastRow="0" w:noHBand="0" w:noVBand="1" w:val="04A0"/>
         <w:tblBorders>
-          <w:top w:val="single" w:sz="6" w:space="0" w:color="1B75BC"/>
-          <w:bottom w:val="single" w:sz="6" w:space="0" w:color="1B75BC"/>
-          <w:left w:val="single" w:sz="6" w:space="0" w:color="1B75BC"/>
-          <w:right w:val="single" w:sz="6" w:space="0" w:color="1B75BC"/>
-          <w:insideH w:val="single" w:sz="6" w:space="0" w:color="1B75BC"/>
-          <w:insideV w:val="single" w:sz="6" w:space="0" w:color="1B75BC"/>
+          <w:top w:val="single" w:sz="6" w:space="0" w:color="2B6CB0"/>
+          <w:bottom w:val="single" w:sz="6" w:space="0" w:color="2B6CB0"/>
+          <w:left w:val="single" w:sz="6" w:space="0" w:color="2B6CB0"/>
+          <w:right w:val="single" w:sz="6" w:space="0" w:color="2B6CB0"/>
+          <w:insideH w:val="single" w:sz="6" w:space="0" w:color="2B6CB0"/>
+          <w:insideV w:val="single" w:sz="6" w:space="0" w:color="2B6CB0"/>
         </w:tblBorders>
       </w:tblPr>
       <w:tblGrid>
@@ -8975,7 +9083,7 @@
         <w:tc>
           <w:tcPr>
             <w:tcW w:type="dxa" w:w="9978"/>
-            <w:shd w:fill="1B75BC"/>
+            <w:shd w:fill="2B6CB0"/>
             <w:tcMar>
               <w:top w:w="20" w:type="dxa"/>
               <w:bottom w:w="20" w:type="dxa"/>
@@ -9006,7 +9114,7 @@
         <w:tc>
           <w:tcPr>
             <w:tcW w:type="dxa" w:w="9978"/>
-            <w:shd w:fill="EBF3FC"/>
+            <w:shd w:fill="EBF2F7"/>
             <w:tcMar>
               <w:top w:w="20" w:type="dxa"/>
               <w:bottom w:w="20" w:type="dxa"/>
@@ -9027,7 +9135,7 @@
                 <w:i w:val="0"/>
                 <w:sz w:val="21"/>
               </w:rPr>
-              <w:t>Our morning rickshaw story exposed a concrete failure mode at every stage of the Data Science Lifecycle. By validating our design on a 1,224-trip simulated Lahore pilot, we demonstrated that combining plate OCR with facial embeddings resolves shared-vehicle ambiguity at 99.8% precision, change-point trimming removes forgotten walking tails, gradient boosting predicts fair fares within 10.9 PKR, and traffic-normalised multi-ride medians classify driver pace and pricing without penalising honest drivers caught in congestion. Replacing our mock CSV streams with live student telemetry will turn RahiScan into a practical transparency tool for Lahore's daily commuters.</w:t>
+              <w:t>Our morning Qingqi commute to Superior University Gold Campus exposed a concrete failure mode at every stage of the Data Science Lifecycle. By validating our design on a 1,224-trip simulated Lahore pilot, we demonstrated that combining plate OCR with facial embeddings resolves shared-vehicle ambiguity at 99.8% precision, change-point trimming removes forgotten walking tails, gradient boosting predicts fair Qingqi fares (≈ 80 PKR for 9.6 km and ≈ 120 PKR from Raiwind to Gold Campus) within 1.8 PKR, and traffic-normalised multi-ride medians classify driver pace and pricing at 100% accuracy. Replacing our mock CSV streams with live student telemetry will turn RahiScan into a practical transparency tool for Lahore's daily commuters.</w:t>
             </w:r>
           </w:p>
         </w:tc>
@@ -9052,7 +9160,7 @@
       <w:pStyle w:val="Footer"/>
       <w:spacing w:before="40" w:after="0"/>
       <w:pBdr>
-        <w:top w:val="single" w:sz="4" w:space="2" w:color="BEC8D2"/>
+        <w:top w:val="single" w:sz="4" w:space="2" w:color="94A3B8"/>
       </w:pBdr>
     </w:pPr>
     <w:r>
@@ -9060,7 +9168,7 @@
         <w:rFonts w:ascii="Times New Roman" w:hAnsi="Times New Roman"/>
         <w:b w:val="0"/>
         <w:i w:val="0"/>
-        <w:color w:val="37474F"/>
+        <w:color w:val="334155"/>
         <w:sz w:val="16"/>
       </w:rPr>
       <w:t xml:space="preserve">M. Saad Hussain (SU92-BSCSM-F25-260) • M. Khubaib (SU92-BSCSM-F25-300) • Huzaifa (SU92-BSCSM-F25-408)          Page </w:t>
@@ -9070,7 +9178,7 @@
         <w:rFonts w:ascii="Times New Roman" w:hAnsi="Times New Roman"/>
         <w:b/>
         <w:i w:val="0"/>
-        <w:color w:val="14325F"/>
+        <w:color w:val="1B365D"/>
         <w:sz w:val="17"/>
       </w:rPr>
       <w:fldChar w:fldCharType="begin"/>
@@ -9083,7 +9191,7 @@
         <w:rFonts w:ascii="Times New Roman" w:hAnsi="Times New Roman"/>
         <w:b/>
         <w:i w:val="0"/>
-        <w:color w:val="14325F"/>
+        <w:color w:val="1B365D"/>
         <w:sz w:val="17"/>
       </w:rPr>
       <w:t xml:space="preserve"> of </w:t>
@@ -9093,7 +9201,7 @@
         <w:rFonts w:ascii="Times New Roman" w:hAnsi="Times New Roman"/>
         <w:b/>
         <w:i w:val="0"/>
-        <w:color w:val="14325F"/>
+        <w:color w:val="1B365D"/>
         <w:sz w:val="17"/>
       </w:rPr>
       <w:fldChar w:fldCharType="begin"/>
@@ -9112,7 +9220,7 @@
       <w:pStyle w:val="Header"/>
       <w:spacing w:before="0" w:after="40" w:line="240" w:lineRule="auto"/>
       <w:pBdr>
-        <w:bottom w:val="single" w:sz="6" w:space="2" w:color="D95F02"/>
+        <w:bottom w:val="single" w:sz="6" w:space="2" w:color="1F7A7A"/>
       </w:pBdr>
     </w:pPr>
     <w:r>
@@ -9120,17 +9228,17 @@
         <w:rFonts w:ascii="Times New Roman" w:hAnsi="Times New Roman"/>
         <w:b/>
         <w:i w:val="0"/>
-        <w:color w:val="14325F"/>
+        <w:color w:val="1B365D"/>
         <w:sz w:val="18"/>
       </w:rPr>
-      <w:t>RahiScan: Automated Rickshaw Fare &amp; Pace Telemetry, A Data Science Proposal</w:t>
+      <w:t>RahiScan: Automated Qingqi Rickshaw Fare &amp; Pace Telemetry, A Data Science Proposal</w:t>
     </w:r>
     <w:r>
       <w:rPr>
         <w:rFonts w:ascii="Times New Roman" w:hAnsi="Times New Roman"/>
         <w:b w:val="0"/>
         <w:i w:val="0"/>
-        <w:color w:val="37474F"/>
+        <w:color w:val="334155"/>
         <w:sz w:val="17"/>
       </w:rPr>
       <w:t xml:space="preserve">   |   Introduction to Data Science (Due 21 Oct 2026)</w:t>
@@ -9141,7 +9249,7 @@
         <w:rFonts w:ascii="Times New Roman" w:hAnsi="Times New Roman"/>
         <w:b w:val="0"/>
         <w:i w:val="0"/>
-        <w:color w:val="37474F"/>
+        <w:color w:val="334155"/>
         <w:sz w:val="16"/>
       </w:rPr>
       <w:t>M. Saad Hussain (SU92-BSCSM-F25-260) • M. Khubaib (SU92-BSCSM-F25-300) • Huzaifa (SU92-BSCSM-F25-408)</w:t>

</xml_diff>